<commit_message>
Added more to write up
</commit_message>
<xml_diff>
--- a/Writeup/OFFICIAL_NEA_WRITEUP.docx
+++ b/Writeup/OFFICIAL_NEA_WRITEUP.docx
@@ -569,12 +569,23 @@
         <w:pStyle w:val="Heading1"/>
       </w:pPr>
       <w:bookmarkStart w:id="0" w:name="_Toc209800698"/>
+      <w:commentRangeStart w:id="1"/>
       <w:r>
         <w:t>Introduction</w:t>
       </w:r>
       <w:bookmarkEnd w:id="0"/>
-    </w:p>
-    <w:p>
+      <w:commentRangeEnd w:id="1"/>
+      <w:r>
+        <w:rPr>
+          <w:rStyle w:val="CommentReference"/>
+          <w:rFonts w:asciiTheme="minorHAnsi" w:eastAsiaTheme="minorHAnsi" w:hAnsiTheme="minorHAnsi" w:cstheme="minorBidi"/>
+          <w:color w:val="auto"/>
+        </w:rPr>
+        <w:commentReference w:id="1"/>
+      </w:r>
+    </w:p>
+    <w:p>
+      <w:proofErr w:type="spellStart"/>
       <w:r>
         <w:rPr>
           <w:i/>
@@ -582,11 +593,20 @@
         </w:rPr>
         <w:t>InsertNameHere</w:t>
       </w:r>
+      <w:proofErr w:type="spellEnd"/>
       <w:r>
         <w:t xml:space="preserve">: </w:t>
       </w:r>
       <w:r>
-        <w:t xml:space="preserve">A block based </w:t>
+        <w:t xml:space="preserve">A </w:t>
+      </w:r>
+      <w:proofErr w:type="gramStart"/>
+      <w:r>
+        <w:t>block based</w:t>
+      </w:r>
+      <w:proofErr w:type="gramEnd"/>
+      <w:r>
+        <w:t xml:space="preserve"> </w:t>
       </w:r>
       <w:r>
         <w:t xml:space="preserve">coding editor to allow </w:t>
@@ -598,7 +618,258 @@
         <w:t xml:space="preserve">, by giving them a familiar interface </w:t>
       </w:r>
       <w:r>
-        <w:t xml:space="preserve">of block based coding, to allow them to learn how to code microcontrollers and have a basic understanding of electronics. </w:t>
+        <w:t xml:space="preserve">of </w:t>
+      </w:r>
+      <w:proofErr w:type="gramStart"/>
+      <w:r>
+        <w:t>block based</w:t>
+      </w:r>
+      <w:proofErr w:type="gramEnd"/>
+      <w:r>
+        <w:t xml:space="preserve"> coding, to allow them to learn how to code microcontrollers and have a basic understanding of electronics. </w:t>
+      </w:r>
+      <w:r>
+        <w:t xml:space="preserve">My main goal with this project is to be able to help other </w:t>
+      </w:r>
+      <w:r>
+        <w:t xml:space="preserve">to understand where I get my passion for </w:t>
+      </w:r>
+      <w:r>
+        <w:t>microcontrollers</w:t>
+      </w:r>
+      <w:r>
+        <w:t xml:space="preserve">. </w:t>
+      </w:r>
+      <w:r>
+        <w:t xml:space="preserve">This passion of mine started </w:t>
+      </w:r>
+      <w:r>
+        <w:t>off</w:t>
+      </w:r>
+      <w:r>
+        <w:t xml:space="preserve"> when I was </w:t>
+      </w:r>
+      <w:r>
+        <w:t xml:space="preserve">young when my dad bought me my first raspberry pi microcomputer. </w:t>
+      </w:r>
+      <w:r>
+        <w:t xml:space="preserve">This then got me hooked on working on these sorts of devices, as I found them challenging and </w:t>
+      </w:r>
+      <w:r>
+        <w:t>this love for them set me up for later in my school journey</w:t>
+      </w:r>
+      <w:r>
+        <w:t xml:space="preserve">. </w:t>
+      </w:r>
+      <w:r>
+        <w:t xml:space="preserve">In lower school I was </w:t>
+      </w:r>
+      <w:r>
+        <w:t>doing electronics for my GCSE</w:t>
+      </w:r>
+      <w:r>
+        <w:t>s</w:t>
+      </w:r>
+      <w:r>
+        <w:t xml:space="preserve">, </w:t>
+      </w:r>
+      <w:r>
+        <w:t>part of it was working with microcontrollers as a piece of coursework</w:t>
+      </w:r>
+      <w:r>
+        <w:t xml:space="preserve">, and from there I went home and </w:t>
+      </w:r>
+      <w:r>
+        <w:t xml:space="preserve">continued </w:t>
+      </w:r>
+      <w:r>
+        <w:t>working with them to a point where I was gaining knowledge that I have used countless time throughout the following years on multiple different occasions</w:t>
+      </w:r>
+      <w:r>
+        <w:t xml:space="preserve">. These skills I feel are </w:t>
+      </w:r>
+      <w:r>
+        <w:t xml:space="preserve">core to this project as I feel that microcontrollers </w:t>
+      </w:r>
+      <w:r>
+        <w:t xml:space="preserve">are key to any person who wants to go into any electronics or </w:t>
+      </w:r>
+      <w:r>
+        <w:t xml:space="preserve">computer </w:t>
+      </w:r>
+      <w:proofErr w:type="gramStart"/>
+      <w:r>
+        <w:t>science based</w:t>
+      </w:r>
+      <w:proofErr w:type="gramEnd"/>
+      <w:r>
+        <w:t xml:space="preserve"> </w:t>
+      </w:r>
+      <w:r>
+        <w:t xml:space="preserve">courses later in life. </w:t>
+      </w:r>
+      <w:r>
+        <w:t>Within the project microcontrollers will have a small part as the project</w:t>
+      </w:r>
+      <w:r>
+        <w:t xml:space="preserve">, they will have the ability to have code transferred to them as the block will be able to </w:t>
+      </w:r>
+      <w:proofErr w:type="gramStart"/>
+      <w:r>
+        <w:t>compiled</w:t>
+      </w:r>
+      <w:proofErr w:type="gramEnd"/>
+      <w:r>
+        <w:t xml:space="preserve"> into code that </w:t>
+      </w:r>
+      <w:r>
+        <w:t>then will be able to run on the said microcontroller</w:t>
+      </w:r>
+      <w:r>
+        <w:t xml:space="preserve"> when compiled. </w:t>
+      </w:r>
+      <w:r>
+        <w:t xml:space="preserve">The stakeholder for my project </w:t>
+      </w:r>
+      <w:r>
+        <w:t>is Mr Turner</w:t>
+      </w:r>
+      <w:r>
+        <w:t>, who is Head of Computing/Electronics/DT/Food</w:t>
+      </w:r>
+      <w:r>
+        <w:t xml:space="preserve">, so he has the </w:t>
+      </w:r>
+      <w:r>
+        <w:t>skills required to allow me to develop this project further</w:t>
+      </w:r>
+      <w:r>
+        <w:t xml:space="preserve"> </w:t>
+      </w:r>
+      <w:r>
+        <w:t xml:space="preserve">through his expertise in this area. His skillset is </w:t>
+      </w:r>
+      <w:proofErr w:type="gramStart"/>
+      <w:r>
+        <w:t>similar to</w:t>
+      </w:r>
+      <w:proofErr w:type="gramEnd"/>
+      <w:r>
+        <w:t xml:space="preserve"> </w:t>
+      </w:r>
+      <w:proofErr w:type="gramStart"/>
+      <w:r>
+        <w:t>mine</w:t>
+      </w:r>
+      <w:proofErr w:type="gramEnd"/>
+      <w:r>
+        <w:t xml:space="preserve"> but he has more understanding on what students would want for coding with microcontrollers</w:t>
+      </w:r>
+      <w:r>
+        <w:t>.</w:t>
+      </w:r>
+      <w:r>
+        <w:t xml:space="preserve"> This will </w:t>
+      </w:r>
+      <w:r>
+        <w:t xml:space="preserve">allow me to </w:t>
+      </w:r>
+      <w:r>
+        <w:t xml:space="preserve">tailor the way the editor works to how </w:t>
+      </w:r>
+      <w:r>
+        <w:t xml:space="preserve">he/the students would want it to be. </w:t>
+      </w:r>
+      <w:r>
+        <w:t xml:space="preserve">I have had previous experiences </w:t>
+      </w:r>
+      <w:r>
+        <w:t xml:space="preserve">working with students </w:t>
+      </w:r>
+      <w:r>
+        <w:lastRenderedPageBreak/>
+        <w:t xml:space="preserve">and a </w:t>
+      </w:r>
+      <w:proofErr w:type="gramStart"/>
+      <w:r>
+        <w:t>block based</w:t>
+      </w:r>
+      <w:proofErr w:type="gramEnd"/>
+      <w:r>
+        <w:t xml:space="preserve"> coding editor, in the past I have used </w:t>
+      </w:r>
+      <w:proofErr w:type="spellStart"/>
+      <w:r>
+        <w:t>microbits</w:t>
+      </w:r>
+      <w:proofErr w:type="spellEnd"/>
+      <w:r>
+        <w:t xml:space="preserve"> </w:t>
+      </w:r>
+      <w:proofErr w:type="spellStart"/>
+      <w:r>
+        <w:t>makecode</w:t>
+      </w:r>
+      <w:proofErr w:type="spellEnd"/>
+      <w:r>
+        <w:t xml:space="preserve"> editor (</w:t>
+      </w:r>
+      <w:r>
+        <w:t xml:space="preserve">Microsoft </w:t>
+      </w:r>
+      <w:proofErr w:type="spellStart"/>
+      <w:r>
+        <w:t>Microbit</w:t>
+      </w:r>
+      <w:proofErr w:type="spellEnd"/>
+      <w:r>
+        <w:t>. (2022). </w:t>
+      </w:r>
+      <w:proofErr w:type="spellStart"/>
+      <w:r>
+        <w:rPr>
+          <w:i/>
+          <w:iCs/>
+        </w:rPr>
+        <w:t>Makecode</w:t>
+      </w:r>
+      <w:proofErr w:type="spellEnd"/>
+      <w:r>
+        <w:rPr>
+          <w:i/>
+          <w:iCs/>
+        </w:rPr>
+        <w:t xml:space="preserve"> Editor</w:t>
+      </w:r>
+      <w:r>
+        <w:t>. [Online]. makecode.microbit.org. Last Updated: 4 Sep 2024. Available at: https://makecode.microbit.org [Accessed 8 October 2025].</w:t>
+      </w:r>
+      <w:r>
+        <w:t xml:space="preserve">) </w:t>
+      </w:r>
+      <w:r>
+        <w:t xml:space="preserve">for a tech club I ran with some fellow students to </w:t>
+      </w:r>
+      <w:r>
+        <w:t xml:space="preserve">hopefully gain interest in this area for younger students. </w:t>
+      </w:r>
+      <w:r>
+        <w:t xml:space="preserve">This club allowed me to </w:t>
+      </w:r>
+      <w:r>
+        <w:t>gain knowledge into how the students use the editor and what features they found useful and what was least used, from this I can then</w:t>
+      </w:r>
+      <w:r>
+        <w:t xml:space="preserve"> pull this information </w:t>
+      </w:r>
+      <w:r>
+        <w:t xml:space="preserve">and use It as a basis for </w:t>
+      </w:r>
+      <w:r>
+        <w:t xml:space="preserve">the </w:t>
+      </w:r>
+      <w:r>
+        <w:t xml:space="preserve">project. </w:t>
       </w:r>
     </w:p>
     <w:p/>
@@ -606,21 +877,21 @@
       <w:pPr>
         <w:pStyle w:val="Heading1"/>
       </w:pPr>
-      <w:bookmarkStart w:id="1" w:name="_Toc209800699"/>
+      <w:bookmarkStart w:id="2" w:name="_Toc209800699"/>
       <w:r>
         <w:t>Research</w:t>
       </w:r>
-      <w:bookmarkEnd w:id="1"/>
+      <w:bookmarkEnd w:id="2"/>
     </w:p>
     <w:p>
       <w:pPr>
         <w:pStyle w:val="Heading2"/>
       </w:pPr>
-      <w:bookmarkStart w:id="2" w:name="_Toc209800700"/>
+      <w:bookmarkStart w:id="3" w:name="_Toc209800700"/>
       <w:r>
         <w:t>Pre-requisites</w:t>
       </w:r>
-      <w:bookmarkEnd w:id="2"/>
+      <w:bookmarkEnd w:id="3"/>
     </w:p>
     <w:p>
       <w:r>
@@ -641,6 +912,7 @@
           <w:numId w:val="1"/>
         </w:numPr>
       </w:pPr>
+      <w:commentRangeStart w:id="4"/>
       <w:r>
         <w:t xml:space="preserve">A window library to create a </w:t>
       </w:r>
@@ -674,46 +946,12 @@
       <w:r>
         <w:t>A way to compile the blocks into code that can then be used on the microcontroller</w:t>
       </w:r>
-    </w:p>
-    <w:p/>
-    <w:p>
-      <w:r>
-        <w:t>For this project I was originally going to use Golang as it is a modern compiled language that I had seen used for other complex projects</w:t>
-      </w:r>
-      <w:r>
-        <w:t xml:space="preserve">, but when doing some simple testing with the window framework I was going to use I found that it would either take </w:t>
-      </w:r>
-      <w:r>
-        <w:t xml:space="preserve">an unusually long time to compile or not compile at all. So I have made the decision to </w:t>
-      </w:r>
-      <w:r>
-        <w:lastRenderedPageBreak/>
-        <w:t xml:space="preserve">change </w:t>
-      </w:r>
-      <w:r>
-        <w:t xml:space="preserve">my coding language to using rust, this is because I am more familiar with the language and have used it in the past for similar GUI based projects and I know that it will </w:t>
-      </w:r>
-      <w:r>
-        <w:t>compile,</w:t>
-      </w:r>
-      <w:r>
-        <w:t xml:space="preserve"> and the window library will work. </w:t>
-      </w:r>
-    </w:p>
-    <w:p/>
-    <w:p>
-      <w:pPr>
-        <w:pStyle w:val="Heading2"/>
-      </w:pPr>
-      <w:bookmarkStart w:id="3" w:name="_Toc209800701"/>
-      <w:r>
-        <w:t>Partial solutions</w:t>
-      </w:r>
-      <w:bookmarkEnd w:id="3"/>
-    </w:p>
-    <w:p>
-      <w:r>
-        <w:t>There are a few solutions similar to what I am wanting to do:</w:t>
+      <w:commentRangeEnd w:id="4"/>
+      <w:r>
+        <w:rPr>
+          <w:rStyle w:val="CommentReference"/>
+        </w:rPr>
+        <w:commentReference w:id="4"/>
       </w:r>
     </w:p>
     <w:p>
@@ -725,25 +963,175 @@
         </w:numPr>
       </w:pPr>
       <w:r>
-        <w:t>Blockly,</w:t>
-      </w:r>
-      <w:r>
-        <w:t xml:space="preserve"> A block based coding editor that is the basis for multiple well know solutions e.g. </w:t>
+        <w:t xml:space="preserve">I am going to use </w:t>
+      </w:r>
+      <w:r>
+        <w:t xml:space="preserve">Visual studio code to develop this project </w:t>
+      </w:r>
+    </w:p>
+    <w:p>
+      <w:pPr>
+        <w:pStyle w:val="ListParagraph"/>
+        <w:numPr>
+          <w:ilvl w:val="0"/>
+          <w:numId w:val="1"/>
+        </w:numPr>
+      </w:pPr>
+      <w:r>
+        <w:t>This project will be compatible with Arduinos</w:t>
+      </w:r>
+    </w:p>
+    <w:p>
+      <w:pPr>
+        <w:pStyle w:val="ListParagraph"/>
+        <w:numPr>
+          <w:ilvl w:val="0"/>
+          <w:numId w:val="1"/>
+        </w:numPr>
+      </w:pPr>
+    </w:p>
+    <w:p/>
+    <w:p>
+      <w:r>
+        <w:t>For this project I was originally going to use Golang as it is a modern compiled language that I had seen used for other complex projects</w:t>
+      </w:r>
+      <w:r>
+        <w:t xml:space="preserve">, but when doing some simple testing with </w:t>
+      </w:r>
+      <w:commentRangeStart w:id="5"/>
+      <w:r>
+        <w:t xml:space="preserve">the window framework </w:t>
+      </w:r>
+      <w:commentRangeEnd w:id="5"/>
+      <w:r>
+        <w:rPr>
+          <w:rStyle w:val="CommentReference"/>
+        </w:rPr>
+        <w:commentReference w:id="5"/>
+      </w:r>
+      <w:r>
+        <w:t xml:space="preserve">I was going to use I found that it would either take </w:t>
+      </w:r>
+      <w:r>
+        <w:t xml:space="preserve">an unusually long time to compile or not compile at all. </w:t>
+      </w:r>
+      <w:proofErr w:type="gramStart"/>
+      <w:r>
+        <w:t>So</w:t>
+      </w:r>
+      <w:proofErr w:type="gramEnd"/>
+      <w:r>
+        <w:t xml:space="preserve"> I have made the decision to change </w:t>
+      </w:r>
+      <w:r>
+        <w:t xml:space="preserve">my coding language to using </w:t>
+      </w:r>
+      <w:r>
+        <w:t>R</w:t>
+      </w:r>
+      <w:commentRangeStart w:id="6"/>
+      <w:r>
+        <w:t>ust</w:t>
+      </w:r>
+      <w:commentRangeEnd w:id="6"/>
+      <w:r>
+        <w:rPr>
+          <w:rStyle w:val="CommentReference"/>
+        </w:rPr>
+        <w:commentReference w:id="6"/>
+      </w:r>
+      <w:r>
+        <w:t xml:space="preserve">, this is because I am more familiar with the language and have used it in the past for similar GUI based projects and I know that it will </w:t>
+      </w:r>
+      <w:r>
+        <w:t>compile,</w:t>
+      </w:r>
+      <w:r>
+        <w:t xml:space="preserve"> and the window library will work. </w:t>
+      </w:r>
+    </w:p>
+    <w:p/>
+    <w:p>
+      <w:pPr>
+        <w:pStyle w:val="Heading2"/>
+      </w:pPr>
+      <w:bookmarkStart w:id="7" w:name="_Toc209800701"/>
+      <w:commentRangeStart w:id="8"/>
+      <w:r>
+        <w:t>Partial solutions</w:t>
+      </w:r>
+      <w:bookmarkEnd w:id="7"/>
+      <w:commentRangeEnd w:id="8"/>
+      <w:r>
+        <w:rPr>
+          <w:rStyle w:val="CommentReference"/>
+          <w:rFonts w:asciiTheme="minorHAnsi" w:eastAsiaTheme="minorHAnsi" w:hAnsiTheme="minorHAnsi" w:cstheme="minorBidi"/>
+          <w:color w:val="auto"/>
+        </w:rPr>
+        <w:commentReference w:id="8"/>
+      </w:r>
+    </w:p>
+    <w:p>
+      <w:r>
+        <w:t xml:space="preserve">There are a few solutions </w:t>
+      </w:r>
+      <w:proofErr w:type="gramStart"/>
+      <w:r>
+        <w:t>similar to</w:t>
+      </w:r>
+      <w:proofErr w:type="gramEnd"/>
+      <w:r>
+        <w:t xml:space="preserve"> what I am wanting to do:</w:t>
+      </w:r>
+    </w:p>
+    <w:p>
+      <w:pPr>
+        <w:pStyle w:val="ListParagraph"/>
+        <w:numPr>
+          <w:ilvl w:val="0"/>
+          <w:numId w:val="1"/>
+        </w:numPr>
+      </w:pPr>
+      <w:proofErr w:type="spellStart"/>
+      <w:r>
+        <w:t>Blockly</w:t>
+      </w:r>
+      <w:proofErr w:type="spellEnd"/>
+      <w:r>
+        <w:t>,</w:t>
+      </w:r>
+      <w:r>
+        <w:t xml:space="preserve"> A </w:t>
+      </w:r>
+      <w:proofErr w:type="gramStart"/>
+      <w:r>
+        <w:t>block based</w:t>
+      </w:r>
+      <w:proofErr w:type="gramEnd"/>
+      <w:r>
+        <w:t xml:space="preserve"> coding editor that is the basis for multiple well know solutions e.g. </w:t>
       </w:r>
       <w:r>
         <w:t xml:space="preserve">scratch </w:t>
       </w:r>
       <w:r>
-        <w:t>and hour of code both use blockly</w:t>
-      </w:r>
+        <w:t xml:space="preserve">and hour of code both use </w:t>
+      </w:r>
+      <w:proofErr w:type="spellStart"/>
+      <w:r>
+        <w:t>blockly</w:t>
+      </w:r>
+      <w:proofErr w:type="spellEnd"/>
     </w:p>
     <w:p>
       <w:pPr>
         <w:pStyle w:val="ListParagraph"/>
       </w:pPr>
       <w:r>
+        <w:lastRenderedPageBreak/>
         <w:t>Google. (13 May 2012). </w:t>
       </w:r>
+      <w:proofErr w:type="spellStart"/>
       <w:r>
         <w:rPr>
           <w:i/>
@@ -751,8 +1139,17 @@
         </w:rPr>
         <w:t>Blockly</w:t>
       </w:r>
-      <w:r>
-        <w:t>. [Online]. google.github.io/blockly. Last Updated: 28 August 2025. Available at: https://google.github.io/blockly/ [Accessed 21 September 2025].</w:t>
+      <w:proofErr w:type="spellEnd"/>
+      <w:r>
+        <w:t>. [Online]. google.github.io/</w:t>
+      </w:r>
+      <w:proofErr w:type="spellStart"/>
+      <w:r>
+        <w:t>blockly</w:t>
+      </w:r>
+      <w:proofErr w:type="spellEnd"/>
+      <w:r>
+        <w:t>. Last Updated: 28 August 2025. Available at: https://google.github.io/blockly/ [Accessed 21 September 2025].</w:t>
       </w:r>
       <w:r>
         <w:t xml:space="preserve"> </w:t>
@@ -782,7 +1179,7 @@
                     <pic:cNvPicPr/>
                   </pic:nvPicPr>
                   <pic:blipFill>
-                    <a:blip r:embed="rId6"/>
+                    <a:blip r:embed="rId10"/>
                     <a:stretch>
                       <a:fillRect/>
                     </a:stretch>
@@ -811,11 +1208,32 @@
           <w:numId w:val="1"/>
         </w:numPr>
       </w:pPr>
-      <w:r>
-        <w:t xml:space="preserve">BlocklyDuino, </w:t>
-      </w:r>
-      <w:r>
-        <w:t xml:space="preserve">A block based coding editor that has used the blockly </w:t>
+      <w:proofErr w:type="spellStart"/>
+      <w:r>
+        <w:t>BlocklyDuino</w:t>
+      </w:r>
+      <w:proofErr w:type="spellEnd"/>
+      <w:r>
+        <w:t xml:space="preserve">, </w:t>
+      </w:r>
+      <w:r>
+        <w:t xml:space="preserve">A </w:t>
+      </w:r>
+      <w:proofErr w:type="gramStart"/>
+      <w:r>
+        <w:t>block based</w:t>
+      </w:r>
+      <w:proofErr w:type="gramEnd"/>
+      <w:r>
+        <w:t xml:space="preserve"> coding editor that has used the </w:t>
+      </w:r>
+      <w:proofErr w:type="spellStart"/>
+      <w:r>
+        <w:t>blockly</w:t>
+      </w:r>
+      <w:proofErr w:type="spellEnd"/>
+      <w:r>
+        <w:t xml:space="preserve"> </w:t>
       </w:r>
       <w:r>
         <w:t>as its basis, but has adapted it to work for Arduinos</w:t>
@@ -828,6 +1246,7 @@
       <w:r>
         <w:t>Fred Lin. (12 November 2012). </w:t>
       </w:r>
+      <w:proofErr w:type="spellStart"/>
       <w:r>
         <w:rPr>
           <w:i/>
@@ -835,6 +1254,7 @@
         </w:rPr>
         <w:t>Blocklyduino</w:t>
       </w:r>
+      <w:proofErr w:type="spellEnd"/>
       <w:r>
         <w:t>. [Online]. Blocklyduino.github.io. Last Updated: 4 July 2023. Available at: http://blocklyduino.github.io [Accessed 24 September 2025].</w:t>
       </w:r>
@@ -863,7 +1283,7 @@
                     <pic:cNvPicPr/>
                   </pic:nvPicPr>
                   <pic:blipFill>
-                    <a:blip r:embed="rId7"/>
+                    <a:blip r:embed="rId11"/>
                     <a:stretch>
                       <a:fillRect/>
                     </a:stretch>
@@ -892,9 +1312,13 @@
           <w:numId w:val="1"/>
         </w:numPr>
       </w:pPr>
-      <w:r>
-        <w:lastRenderedPageBreak/>
-        <w:t xml:space="preserve">mBlock, </w:t>
+      <w:proofErr w:type="spellStart"/>
+      <w:r>
+        <w:t>mBlock</w:t>
+      </w:r>
+      <w:proofErr w:type="spellEnd"/>
+      <w:r>
+        <w:t xml:space="preserve">, </w:t>
       </w:r>
       <w:r>
         <w:t xml:space="preserve">A code editor that uses blocks to </w:t>
@@ -907,9 +1331,15 @@
       <w:pPr>
         <w:pStyle w:val="ListParagraph"/>
       </w:pPr>
-      <w:r>
-        <w:t>Makeblock Co., Ltd. (19 February 2017). </w:t>
-      </w:r>
+      <w:proofErr w:type="spellStart"/>
+      <w:r>
+        <w:t>Makeblock</w:t>
+      </w:r>
+      <w:proofErr w:type="spellEnd"/>
+      <w:r>
+        <w:t xml:space="preserve"> Co., Ltd. (19 February 2017). </w:t>
+      </w:r>
+      <w:proofErr w:type="spellStart"/>
       <w:r>
         <w:rPr>
           <w:i/>
@@ -917,6 +1347,7 @@
         </w:rPr>
         <w:t>mBlock</w:t>
       </w:r>
+      <w:proofErr w:type="spellEnd"/>
       <w:r>
         <w:t>. [Online]. mblock.cc. Last Updated: 8 April 2025. Available at: https://mblock.cc/ [Accessed 24 September 2025].</w:t>
       </w:r>
@@ -934,6 +1365,7 @@
         <w:rPr>
           <w:noProof/>
         </w:rPr>
+        <w:lastRenderedPageBreak/>
         <w:drawing>
           <wp:inline distT="0" distB="0" distL="0" distR="0" wp14:anchorId="096DF2F6" wp14:editId="14708199">
             <wp:extent cx="4629150" cy="1853506"/>
@@ -950,7 +1382,7 @@
                     <pic:cNvPicPr/>
                   </pic:nvPicPr>
                   <pic:blipFill>
-                    <a:blip r:embed="rId8"/>
+                    <a:blip r:embed="rId12"/>
                     <a:stretch>
                       <a:fillRect/>
                     </a:stretch>
@@ -976,11 +1408,11 @@
       <w:pPr>
         <w:pStyle w:val="Heading2"/>
       </w:pPr>
-      <w:bookmarkStart w:id="4" w:name="_Toc209800702"/>
+      <w:bookmarkStart w:id="9" w:name="_Toc209800702"/>
       <w:r>
         <w:t>Key features</w:t>
       </w:r>
-      <w:bookmarkEnd w:id="4"/>
+      <w:bookmarkEnd w:id="9"/>
       <w:r>
         <w:t xml:space="preserve"> </w:t>
       </w:r>
@@ -1210,7 +1642,15 @@
               <w:cnfStyle w:val="000000100000" w:firstRow="0" w:lastRow="0" w:firstColumn="0" w:lastColumn="0" w:oddVBand="0" w:evenVBand="0" w:oddHBand="1" w:evenHBand="0" w:firstRowFirstColumn="0" w:firstRowLastColumn="0" w:lastRowFirstColumn="0" w:lastRowLastColumn="0"/>
             </w:pPr>
             <w:r>
-              <w:t>To allow more experienced user to go more in depth into there code and fix any errors</w:t>
+              <w:t xml:space="preserve">To allow more experienced user to go more in depth into </w:t>
+            </w:r>
+            <w:proofErr w:type="spellStart"/>
+            <w:r>
+              <w:t>there</w:t>
+            </w:r>
+            <w:proofErr w:type="spellEnd"/>
+            <w:r>
+              <w:t xml:space="preserve"> code and fix any errors</w:t>
             </w:r>
           </w:p>
         </w:tc>
@@ -1223,7 +1663,15 @@
           </w:tcPr>
           <w:p>
             <w:r>
-              <w:t>Access to usb ports</w:t>
+              <w:t xml:space="preserve">Access to </w:t>
+            </w:r>
+            <w:proofErr w:type="spellStart"/>
+            <w:r>
+              <w:t>usb</w:t>
+            </w:r>
+            <w:proofErr w:type="spellEnd"/>
+            <w:r>
+              <w:t xml:space="preserve"> ports</w:t>
             </w:r>
           </w:p>
         </w:tc>
@@ -1255,10 +1703,25 @@
         <w:t xml:space="preserve">application have a usable GUI. </w:t>
       </w:r>
       <w:r>
-        <w:t xml:space="preserve">There are multiple different options to create windows within rust, each has a different use case. </w:t>
-      </w:r>
-      <w:r>
-        <w:t>By searching for Rust Gui libraries, I have narrowed it down to:</w:t>
+        <w:t xml:space="preserve">There are multiple different options to create windows within rust, </w:t>
+      </w:r>
+      <w:r>
+        <w:lastRenderedPageBreak/>
+        <w:t xml:space="preserve">each has a different use case. </w:t>
+      </w:r>
+      <w:r>
+        <w:t xml:space="preserve">By searching for Rust Gui libraries, </w:t>
+      </w:r>
+      <w:commentRangeStart w:id="10"/>
+      <w:r>
+        <w:t>I have narrowed it down to:</w:t>
+      </w:r>
+      <w:commentRangeEnd w:id="10"/>
+      <w:r>
+        <w:rPr>
+          <w:rStyle w:val="CommentReference"/>
+        </w:rPr>
+        <w:commentReference w:id="10"/>
       </w:r>
     </w:p>
     <w:p>
@@ -1269,21 +1732,26 @@
           <w:numId w:val="2"/>
         </w:numPr>
       </w:pPr>
-      <w:bookmarkStart w:id="5" w:name="_Toc209173205"/>
+      <w:bookmarkStart w:id="11" w:name="_Toc209173205"/>
       <w:r>
         <w:t>Egui</w:t>
       </w:r>
       <w:r>
         <w:t>, a window framework centred around simplicity and portability</w:t>
       </w:r>
-      <w:bookmarkEnd w:id="5"/>
+      <w:bookmarkEnd w:id="11"/>
     </w:p>
     <w:p>
       <w:pPr>
         <w:pStyle w:val="ListParagraph"/>
       </w:pPr>
-      <w:r>
-        <w:t>emilk. (30 May 2020). </w:t>
+      <w:proofErr w:type="spellStart"/>
+      <w:r>
+        <w:t>emilk</w:t>
+      </w:r>
+      <w:proofErr w:type="spellEnd"/>
+      <w:r>
+        <w:t>. (30 May 2020). </w:t>
       </w:r>
       <w:r>
         <w:rPr>
@@ -1344,24 +1812,59 @@
           <w:numId w:val="2"/>
         </w:numPr>
       </w:pPr>
-      <w:r>
-        <w:t>Gtk-rs, a rust port of the well know gtk framework, this allows for the power of the gtk framework to be used by rust</w:t>
+      <w:proofErr w:type="spellStart"/>
+      <w:r>
+        <w:t>Gtk-rs</w:t>
+      </w:r>
+      <w:proofErr w:type="spellEnd"/>
+      <w:r>
+        <w:t xml:space="preserve">, a rust port of the well know </w:t>
+      </w:r>
+      <w:proofErr w:type="spellStart"/>
+      <w:r>
+        <w:t>gtk</w:t>
+      </w:r>
+      <w:proofErr w:type="spellEnd"/>
+      <w:r>
+        <w:t xml:space="preserve"> framework, this allows for the power of the </w:t>
+      </w:r>
+      <w:proofErr w:type="spellStart"/>
+      <w:r>
+        <w:t>gtk</w:t>
+      </w:r>
+      <w:proofErr w:type="spellEnd"/>
+      <w:r>
+        <w:t xml:space="preserve"> framework to be used by rust</w:t>
       </w:r>
     </w:p>
     <w:p>
       <w:pPr>
         <w:pStyle w:val="ListParagraph"/>
       </w:pPr>
-      <w:r>
-        <w:t>gtk-rs. (12 July 2021). </w:t>
+      <w:proofErr w:type="spellStart"/>
+      <w:r>
+        <w:t>gtk-rs</w:t>
+      </w:r>
+      <w:proofErr w:type="spellEnd"/>
+      <w:r>
+        <w:t>. (12 July 2021). </w:t>
       </w:r>
       <w:r>
         <w:rPr>
           <w:i/>
           <w:iCs/>
         </w:rPr>
-        <w:t>GTK-rs</w:t>
-      </w:r>
+        <w:t>GTK-</w:t>
+      </w:r>
+      <w:proofErr w:type="spellStart"/>
+      <w:r>
+        <w:rPr>
+          <w:i/>
+          <w:iCs/>
+        </w:rPr>
+        <w:t>rs</w:t>
+      </w:r>
+      <w:proofErr w:type="spellEnd"/>
       <w:r>
         <w:t>. [Online]. gtk4-rs. Last Updated: 17 September 2025. Available at: https://github.com/gtk-rs/gtk4-rs [Accessed 24 September 2025].</w:t>
       </w:r>
@@ -1401,8 +1904,13 @@
       <w:r>
         <w:t xml:space="preserve">to use the inbuilt </w:t>
       </w:r>
-      <w:r>
-        <w:t xml:space="preserve">std::io </w:t>
+      <w:proofErr w:type="gramStart"/>
+      <w:r>
+        <w:t>std::</w:t>
+      </w:r>
+      <w:proofErr w:type="gramEnd"/>
+      <w:r>
+        <w:t xml:space="preserve">io </w:t>
       </w:r>
       <w:r>
         <w:t xml:space="preserve">library that is inbuilt into </w:t>
@@ -1450,23 +1958,35 @@
         <w:t>code will be able to compiled and sent to the Arduino.</w:t>
       </w:r>
       <w:r>
-        <w:t xml:space="preserve"> </w:t>
-      </w:r>
-      <w:r>
-        <w:t xml:space="preserve">This library will allow me to read each block from the Json file and allow me to have the show attributes. </w:t>
-      </w:r>
-      <w:r>
-        <w:t>T</w:t>
-      </w:r>
-      <w:r>
-        <w:t xml:space="preserve">o use Json files I am going to </w:t>
+        <w:t xml:space="preserve"> This library will allow me to read each block from the Json file and allow me to have the show attributes. T</w:t>
+      </w:r>
+      <w:r>
+        <w:t xml:space="preserve">o use Json </w:t>
+      </w:r>
+      <w:proofErr w:type="gramStart"/>
+      <w:r>
+        <w:t>files</w:t>
+      </w:r>
+      <w:proofErr w:type="gramEnd"/>
+      <w:r>
+        <w:t xml:space="preserve"> I am going to </w:t>
       </w:r>
       <w:r>
         <w:t xml:space="preserve">use </w:t>
       </w:r>
-      <w:r>
-        <w:t>serde/serde_json</w:t>
-      </w:r>
+      <w:proofErr w:type="spellStart"/>
+      <w:r>
+        <w:t>serde</w:t>
+      </w:r>
+      <w:proofErr w:type="spellEnd"/>
+      <w:r>
+        <w:t>/</w:t>
+      </w:r>
+      <w:proofErr w:type="spellStart"/>
+      <w:r>
+        <w:t>serde_json</w:t>
+      </w:r>
+      <w:proofErr w:type="spellEnd"/>
       <w:r>
         <w:t xml:space="preserve">: </w:t>
       </w:r>
@@ -1475,8 +1995,13 @@
       <w:pPr>
         <w:pStyle w:val="ListParagraph"/>
       </w:pPr>
-      <w:r>
-        <w:t>serde-rs. (14 May 2016). </w:t>
+      <w:proofErr w:type="spellStart"/>
+      <w:r>
+        <w:t>serde-rs</w:t>
+      </w:r>
+      <w:proofErr w:type="spellEnd"/>
+      <w:r>
+        <w:t>. (14 May 2016). </w:t>
       </w:r>
       <w:r>
         <w:rPr>
@@ -1486,7 +2011,15 @@
         <w:t>Serde</w:t>
       </w:r>
       <w:r>
-        <w:t>. [Online]. Serde github. Last Updated: 20 September 2025. Available at: https://github.com/serde-rs/serde [Accessed 24 September 2025].</w:t>
+        <w:t xml:space="preserve">. [Online]. Serde </w:t>
+      </w:r>
+      <w:proofErr w:type="spellStart"/>
+      <w:r>
+        <w:t>github</w:t>
+      </w:r>
+      <w:proofErr w:type="spellEnd"/>
+      <w:r>
+        <w:t>. Last Updated: 20 September 2025. Available at: https://github.com/serde-rs/serde [Accessed 24 September 2025].</w:t>
       </w:r>
     </w:p>
     <w:p>
@@ -1519,7 +2052,7 @@
                     <pic:cNvPicPr/>
                   </pic:nvPicPr>
                   <pic:blipFill rotWithShape="1">
-                    <a:blip r:embed="rId9" cstate="print">
+                    <a:blip r:embed="rId13" cstate="print">
                       <a:extLst>
                         <a:ext uri="{28A0092B-C50C-407E-A947-70E740481C1C}">
                           <a14:useLocalDpi xmlns:a14="http://schemas.microsoft.com/office/drawing/2010/main" val="0"/>
@@ -1565,14 +2098,24 @@
       <w:pPr>
         <w:pStyle w:val="Heading2"/>
       </w:pPr>
-      <w:bookmarkStart w:id="6" w:name="_Toc209800703"/>
+      <w:bookmarkStart w:id="12" w:name="_Toc209800703"/>
+      <w:commentRangeStart w:id="13"/>
       <w:r>
         <w:t>Stake</w:t>
       </w:r>
       <w:r>
         <w:t>holder</w:t>
       </w:r>
-      <w:bookmarkEnd w:id="6"/>
+      <w:bookmarkEnd w:id="12"/>
+      <w:commentRangeEnd w:id="13"/>
+      <w:r>
+        <w:rPr>
+          <w:rStyle w:val="CommentReference"/>
+          <w:rFonts w:asciiTheme="minorHAnsi" w:eastAsiaTheme="minorHAnsi" w:hAnsiTheme="minorHAnsi" w:cstheme="minorBidi"/>
+          <w:color w:val="auto"/>
+        </w:rPr>
+        <w:commentReference w:id="13"/>
+      </w:r>
     </w:p>
     <w:p>
       <w:r>
@@ -1614,11 +2157,11 @@
       <w:pPr>
         <w:pStyle w:val="Heading1"/>
       </w:pPr>
-      <w:bookmarkStart w:id="7" w:name="_Toc209800704"/>
+      <w:bookmarkStart w:id="14" w:name="_Toc209800704"/>
       <w:r>
         <w:t>To Do:</w:t>
       </w:r>
-      <w:bookmarkEnd w:id="7"/>
+      <w:bookmarkEnd w:id="14"/>
     </w:p>
     <w:p>
       <w:pPr>
@@ -1643,6 +2186,171 @@
     </w:sectPr>
   </w:body>
 </w:document>
+</file>
+
+<file path=word/comments.xml><?xml version="1.0" encoding="utf-8"?>
+<w:comments xmlns:wpc="http://schemas.microsoft.com/office/word/2010/wordprocessingCanvas" xmlns:cx="http://schemas.microsoft.com/office/drawing/2014/chartex" xmlns:cx1="http://schemas.microsoft.com/office/drawing/2015/9/8/chartex" xmlns:cx2="http://schemas.microsoft.com/office/drawing/2015/10/21/chartex" xmlns:cx3="http://schemas.microsoft.com/office/drawing/2016/5/9/chartex" xmlns:cx4="http://schemas.microsoft.com/office/drawing/2016/5/10/chartex" xmlns:cx5="http://schemas.microsoft.com/office/drawing/2016/5/11/chartex" xmlns:cx6="http://schemas.microsoft.com/office/drawing/2016/5/12/chartex" xmlns:cx7="http://schemas.microsoft.com/office/drawing/2016/5/13/chartex" xmlns:cx8="http://schemas.microsoft.com/office/drawing/2016/5/14/chartex" xmlns:mc="http://schemas.openxmlformats.org/markup-compatibility/2006" xmlns:aink="http://schemas.microsoft.com/office/drawing/2016/ink" xmlns:am3d="http://schemas.microsoft.com/office/drawing/2017/model3d" xmlns:o="urn:schemas-microsoft-com:office:office" xmlns:oel="http://schemas.microsoft.com/office/2019/extlst" xmlns:r="http://schemas.openxmlformats.org/officeDocument/2006/relationships" xmlns:m="http://schemas.openxmlformats.org/officeDocument/2006/math" xmlns:v="urn:schemas-microsoft-com:vml" xmlns:wp14="http://schemas.microsoft.com/office/word/2010/wordprocessingDrawing" xmlns:wp="http://schemas.openxmlformats.org/drawingml/2006/wordprocessingDrawing" xmlns:w10="urn:schemas-microsoft-com:office:word" xmlns:w="http://schemas.openxmlformats.org/wordprocessingml/2006/main" xmlns:w14="http://schemas.microsoft.com/office/word/2010/wordml" xmlns:w15="http://schemas.microsoft.com/office/word/2012/wordml" xmlns:w16cex="http://schemas.microsoft.com/office/word/2018/wordml/cex" xmlns:w16cid="http://schemas.microsoft.com/office/word/2016/wordml/cid" xmlns:w16="http://schemas.microsoft.com/office/word/2018/wordml" xmlns:w16du="http://schemas.microsoft.com/office/word/2023/wordml/word16du" xmlns:w16sdtdh="http://schemas.microsoft.com/office/word/2020/wordml/sdtdatahash" xmlns:w16sdtfl="http://schemas.microsoft.com/office/word/2024/wordml/sdtformatlock" xmlns:w16se="http://schemas.microsoft.com/office/word/2015/wordml/symex" xmlns:wpg="http://schemas.microsoft.com/office/word/2010/wordprocessingGroup" xmlns:wpi="http://schemas.microsoft.com/office/word/2010/wordprocessingInk" xmlns:wne="http://schemas.microsoft.com/office/word/2006/wordml" xmlns:wps="http://schemas.microsoft.com/office/word/2010/wordprocessingShape" mc:Ignorable="w14 w15 w16se w16cid w16 w16cex w16sdtdh w16sdtfl w16du wp14">
+  <w:comment w:id="1" w:author="Mr I MAJOR" w:date="2025-10-08T08:28:00Z" w:initials="IM">
+    <w:p>
+      <w:pPr>
+        <w:pStyle w:val="CommentText"/>
+      </w:pPr>
+      <w:r>
+        <w:rPr>
+          <w:rStyle w:val="CommentReference"/>
+        </w:rPr>
+        <w:annotationRef/>
+      </w:r>
+      <w:r>
+        <w:t xml:space="preserve">Hi Dexter, don’t worry about naming the project (assuming that is what the InsertNameHere is for, that can come much later. For now I’d like to see a lot of lovely rich detail here about why you are doing this project, who it is aimed at, what it aims to achieve. For example: Talk about your passion for microcontrollers if they are going to be a focus. Talk about your stakeholder and his need for a block-based coding language to easily allow students to code microcontrollers without getting hung up on syntax. Talk about which ages this is designed to be used by, what experience you had personally at that age, what experience you have had of working with students of that age to help them grasp microcontrollers (Tuesday Tech Club), etc. etc. </w:t>
+      </w:r>
+      <w:r>
+        <w:br/>
+        <w:t xml:space="preserve">This is hopefully going to be 1-2 pages of introduction where you could also start to mention what block based coding looks like, examples of block based languages and generally make it a much more detailed introduction to set the scene. </w:t>
+      </w:r>
+    </w:p>
+  </w:comment>
+  <w:comment w:id="4" w:author="Mr I MAJOR" w:date="2025-10-08T08:29:00Z" w:initials="IM">
+    <w:p>
+      <w:pPr>
+        <w:pStyle w:val="CommentText"/>
+      </w:pPr>
+      <w:r>
+        <w:rPr>
+          <w:rStyle w:val="CommentReference"/>
+        </w:rPr>
+        <w:annotationRef/>
+      </w:r>
+      <w:r>
+        <w:t>How about which microcontrollers you will be working with, what IDE you are planning to use to develop, are you doing automated testing...</w:t>
+      </w:r>
+    </w:p>
+  </w:comment>
+  <w:comment w:id="5" w:author="Mr I MAJOR" w:date="2025-10-08T08:33:00Z" w:initials="IM">
+    <w:p>
+      <w:pPr>
+        <w:pStyle w:val="CommentText"/>
+      </w:pPr>
+      <w:r>
+        <w:rPr>
+          <w:rStyle w:val="CommentReference"/>
+        </w:rPr>
+        <w:annotationRef/>
+      </w:r>
+      <w:r>
+        <w:t>Can you elaborate?</w:t>
+      </w:r>
+    </w:p>
+  </w:comment>
+  <w:comment w:id="6" w:author="Mr I MAJOR" w:date="2025-10-08T08:34:00Z" w:initials="IM">
+    <w:p>
+      <w:pPr>
+        <w:pStyle w:val="CommentText"/>
+      </w:pPr>
+      <w:r>
+        <w:rPr>
+          <w:rStyle w:val="CommentReference"/>
+        </w:rPr>
+        <w:annotationRef/>
+      </w:r>
+      <w:r>
+        <w:t>Dumb question but isn’t it capitalised?</w:t>
+      </w:r>
+    </w:p>
+  </w:comment>
+  <w:comment w:id="8" w:author="Mr I MAJOR" w:date="2025-10-08T08:35:00Z" w:initials="IM">
+    <w:p>
+      <w:pPr>
+        <w:pStyle w:val="CommentText"/>
+      </w:pPr>
+      <w:r>
+        <w:rPr>
+          <w:rStyle w:val="CommentReference"/>
+        </w:rPr>
+        <w:annotationRef/>
+      </w:r>
+      <w:r>
+        <w:t>It is a great idea to look for partial solutions, not necessarily full solutions. For each one you list try to pull out the key features and be critical, which work well, which don’t. From this develop the list of features you are going to implement in your own solution.</w:t>
+      </w:r>
+    </w:p>
+  </w:comment>
+  <w:comment w:id="10" w:author="Mr I MAJOR" w:date="2025-10-08T08:37:00Z" w:initials="IM">
+    <w:p>
+      <w:pPr>
+        <w:pStyle w:val="CommentText"/>
+      </w:pPr>
+      <w:r>
+        <w:rPr>
+          <w:rStyle w:val="CommentReference"/>
+        </w:rPr>
+        <w:annotationRef/>
+      </w:r>
+      <w:r>
+        <w:t>Again, try to be more descriptive of the key features of each of these libraries, their advantages and disadvantages etc.</w:t>
+      </w:r>
+    </w:p>
+  </w:comment>
+  <w:comment w:id="13" w:author="Mr I MAJOR" w:date="2025-10-08T08:41:00Z" w:initials="IM">
+    <w:p>
+      <w:pPr>
+        <w:pStyle w:val="CommentText"/>
+      </w:pPr>
+      <w:r>
+        <w:rPr>
+          <w:rStyle w:val="CommentReference"/>
+        </w:rPr>
+        <w:annotationRef/>
+      </w:r>
+      <w:r>
+        <w:t xml:space="preserve">“Identified suitable stakeholders for the project and described them explaining how they will make use of the proposed solution and why it is appropriate to their needs” </w:t>
+      </w:r>
+      <w:r>
+        <w:br/>
+        <w:t>You have identified them (you could name Mr Turner if you wish), described them and explained (in bare outline) how they will use the solution and why it is appropriate to their needs, but I’d love to see more detail. For example, please think about interviewing him and collecting his thoughts about what he wants the solution to do (key features), these could then be ranked from mission critical to ‘nice if’.</w:t>
+      </w:r>
+      <w:r>
+        <w:br/>
+        <w:t>It might also be worth talking to a lower school student (maybe someone like Riley from the club last year) about how they find block coding and what they would like?? Just a thought.</w:t>
+      </w:r>
+    </w:p>
+  </w:comment>
+</w:comments>
+</file>
+
+<file path=word/commentsExtended.xml><?xml version="1.0" encoding="utf-8"?>
+<w15:commentsEx xmlns:wpc="http://schemas.microsoft.com/office/word/2010/wordprocessingCanvas" xmlns:cx="http://schemas.microsoft.com/office/drawing/2014/chartex" xmlns:cx1="http://schemas.microsoft.com/office/drawing/2015/9/8/chartex" xmlns:cx2="http://schemas.microsoft.com/office/drawing/2015/10/21/chartex" xmlns:cx3="http://schemas.microsoft.com/office/drawing/2016/5/9/chartex" xmlns:cx4="http://schemas.microsoft.com/office/drawing/2016/5/10/chartex" xmlns:cx5="http://schemas.microsoft.com/office/drawing/2016/5/11/chartex" xmlns:cx6="http://schemas.microsoft.com/office/drawing/2016/5/12/chartex" xmlns:cx7="http://schemas.microsoft.com/office/drawing/2016/5/13/chartex" xmlns:cx8="http://schemas.microsoft.com/office/drawing/2016/5/14/chartex" xmlns:mc="http://schemas.openxmlformats.org/markup-compatibility/2006" xmlns:aink="http://schemas.microsoft.com/office/drawing/2016/ink" xmlns:am3d="http://schemas.microsoft.com/office/drawing/2017/model3d" xmlns:o="urn:schemas-microsoft-com:office:office" xmlns:oel="http://schemas.microsoft.com/office/2019/extlst" xmlns:r="http://schemas.openxmlformats.org/officeDocument/2006/relationships" xmlns:m="http://schemas.openxmlformats.org/officeDocument/2006/math" xmlns:v="urn:schemas-microsoft-com:vml" xmlns:wp14="http://schemas.microsoft.com/office/word/2010/wordprocessingDrawing" xmlns:wp="http://schemas.openxmlformats.org/drawingml/2006/wordprocessingDrawing" xmlns:w10="urn:schemas-microsoft-com:office:word" xmlns:w="http://schemas.openxmlformats.org/wordprocessingml/2006/main" xmlns:w14="http://schemas.microsoft.com/office/word/2010/wordml" xmlns:w15="http://schemas.microsoft.com/office/word/2012/wordml" xmlns:w16cex="http://schemas.microsoft.com/office/word/2018/wordml/cex" xmlns:w16cid="http://schemas.microsoft.com/office/word/2016/wordml/cid" xmlns:w16="http://schemas.microsoft.com/office/word/2018/wordml" xmlns:w16du="http://schemas.microsoft.com/office/word/2023/wordml/word16du" xmlns:w16sdtdh="http://schemas.microsoft.com/office/word/2020/wordml/sdtdatahash" xmlns:w16sdtfl="http://schemas.microsoft.com/office/word/2024/wordml/sdtformatlock" xmlns:w16se="http://schemas.microsoft.com/office/word/2015/wordml/symex" xmlns:wpg="http://schemas.microsoft.com/office/word/2010/wordprocessingGroup" xmlns:wpi="http://schemas.microsoft.com/office/word/2010/wordprocessingInk" xmlns:wne="http://schemas.microsoft.com/office/word/2006/wordml" xmlns:wps="http://schemas.microsoft.com/office/word/2010/wordprocessingShape" mc:Ignorable="w14 w15 w16se w16cid w16 w16cex w16sdtdh w16sdtfl w16du wp14">
+  <w15:commentEx w15:paraId="2F2A87BC" w15:done="0"/>
+  <w15:commentEx w15:paraId="20C5020B" w15:done="0"/>
+  <w15:commentEx w15:paraId="1EC789E0" w15:done="0"/>
+  <w15:commentEx w15:paraId="793D9E8A" w15:done="1"/>
+  <w15:commentEx w15:paraId="099D1DA2" w15:done="0"/>
+  <w15:commentEx w15:paraId="68FCDA9D" w15:done="0"/>
+  <w15:commentEx w15:paraId="61855B77" w15:done="0"/>
+</w15:commentsEx>
+</file>
+
+<file path=word/commentsExtensible.xml><?xml version="1.0" encoding="utf-8"?>
+<w16cex:commentsExtensible xmlns:wpc="http://schemas.microsoft.com/office/word/2010/wordprocessingCanvas" xmlns:cx="http://schemas.microsoft.com/office/drawing/2014/chartex" xmlns:cx1="http://schemas.microsoft.com/office/drawing/2015/9/8/chartex" xmlns:cx2="http://schemas.microsoft.com/office/drawing/2015/10/21/chartex" xmlns:cx3="http://schemas.microsoft.com/office/drawing/2016/5/9/chartex" xmlns:cx4="http://schemas.microsoft.com/office/drawing/2016/5/10/chartex" xmlns:cx5="http://schemas.microsoft.com/office/drawing/2016/5/11/chartex" xmlns:cx6="http://schemas.microsoft.com/office/drawing/2016/5/12/chartex" xmlns:cx7="http://schemas.microsoft.com/office/drawing/2016/5/13/chartex" xmlns:cx8="http://schemas.microsoft.com/office/drawing/2016/5/14/chartex" xmlns:cr="http://schemas.microsoft.com/office/comments/2020/reactions" xmlns:mc="http://schemas.openxmlformats.org/markup-compatibility/2006" xmlns:aink="http://schemas.microsoft.com/office/drawing/2016/ink" xmlns:am3d="http://schemas.microsoft.com/office/drawing/2017/model3d" xmlns:o="urn:schemas-microsoft-com:office:office" xmlns:oel="http://schemas.microsoft.com/office/2019/extlst" xmlns:r="http://schemas.openxmlformats.org/officeDocument/2006/relationships" xmlns:m="http://schemas.openxmlformats.org/officeDocument/2006/math" xmlns:v="urn:schemas-microsoft-com:vml" xmlns:wp14="http://schemas.microsoft.com/office/word/2010/wordprocessingDrawing" xmlns:wp="http://schemas.openxmlformats.org/drawingml/2006/wordprocessingDrawing" xmlns:w10="urn:schemas-microsoft-com:office:word" xmlns:w="http://schemas.openxmlformats.org/wordprocessingml/2006/main" xmlns:w14="http://schemas.microsoft.com/office/word/2010/wordml" xmlns:w15="http://schemas.microsoft.com/office/word/2012/wordml" xmlns:w16cex="http://schemas.microsoft.com/office/word/2018/wordml/cex" xmlns:w16cid="http://schemas.microsoft.com/office/word/2016/wordml/cid" xmlns:w16="http://schemas.microsoft.com/office/word/2018/wordml" xmlns:w16du="http://schemas.microsoft.com/office/word/2023/wordml/word16du" xmlns:w16sdtdh="http://schemas.microsoft.com/office/word/2020/wordml/sdtdatahash" xmlns:w16sdtfl="http://schemas.microsoft.com/office/word/2024/wordml/sdtformatlock" xmlns:w16se="http://schemas.microsoft.com/office/word/2015/wordml/symex" xmlns:wpg="http://schemas.microsoft.com/office/word/2010/wordprocessingGroup" xmlns:wpi="http://schemas.microsoft.com/office/word/2010/wordprocessingInk" xmlns:wne="http://schemas.microsoft.com/office/word/2006/wordml" xmlns:wps="http://schemas.microsoft.com/office/word/2010/wordprocessingShape" mc:Ignorable="w14 w15 w16se w16cid w16 w16cex w16sdtdh w16sdtfl cr w16du wp14">
+  <w16cex:commentExtensible w16cex:durableId="50B2785C" w16cex:dateUtc="2025-10-08T07:28:00Z"/>
+  <w16cex:commentExtensible w16cex:durableId="68100D79" w16cex:dateUtc="2025-10-08T07:29:00Z"/>
+  <w16cex:commentExtensible w16cex:durableId="1E51EA32" w16cex:dateUtc="2025-10-08T07:33:00Z"/>
+  <w16cex:commentExtensible w16cex:durableId="32F8B9C0" w16cex:dateUtc="2025-10-08T07:34:00Z"/>
+  <w16cex:commentExtensible w16cex:durableId="4E0628C8" w16cex:dateUtc="2025-10-08T07:35:00Z"/>
+  <w16cex:commentExtensible w16cex:durableId="1366EED9" w16cex:dateUtc="2025-10-08T07:37:00Z"/>
+  <w16cex:commentExtensible w16cex:durableId="4E9E6FB8" w16cex:dateUtc="2025-10-08T07:41:00Z"/>
+</w16cex:commentsExtensible>
+</file>
+
+<file path=word/commentsIds.xml><?xml version="1.0" encoding="utf-8"?>
+<w16cid:commentsIds xmlns:wpc="http://schemas.microsoft.com/office/word/2010/wordprocessingCanvas" xmlns:cx="http://schemas.microsoft.com/office/drawing/2014/chartex" xmlns:cx1="http://schemas.microsoft.com/office/drawing/2015/9/8/chartex" xmlns:cx2="http://schemas.microsoft.com/office/drawing/2015/10/21/chartex" xmlns:cx3="http://schemas.microsoft.com/office/drawing/2016/5/9/chartex" xmlns:cx4="http://schemas.microsoft.com/office/drawing/2016/5/10/chartex" xmlns:cx5="http://schemas.microsoft.com/office/drawing/2016/5/11/chartex" xmlns:cx6="http://schemas.microsoft.com/office/drawing/2016/5/12/chartex" xmlns:cx7="http://schemas.microsoft.com/office/drawing/2016/5/13/chartex" xmlns:cx8="http://schemas.microsoft.com/office/drawing/2016/5/14/chartex" xmlns:mc="http://schemas.openxmlformats.org/markup-compatibility/2006" xmlns:aink="http://schemas.microsoft.com/office/drawing/2016/ink" xmlns:am3d="http://schemas.microsoft.com/office/drawing/2017/model3d" xmlns:o="urn:schemas-microsoft-com:office:office" xmlns:oel="http://schemas.microsoft.com/office/2019/extlst" xmlns:r="http://schemas.openxmlformats.org/officeDocument/2006/relationships" xmlns:m="http://schemas.openxmlformats.org/officeDocument/2006/math" xmlns:v="urn:schemas-microsoft-com:vml" xmlns:wp14="http://schemas.microsoft.com/office/word/2010/wordprocessingDrawing" xmlns:wp="http://schemas.openxmlformats.org/drawingml/2006/wordprocessingDrawing" xmlns:w10="urn:schemas-microsoft-com:office:word" xmlns:w="http://schemas.openxmlformats.org/wordprocessingml/2006/main" xmlns:w14="http://schemas.microsoft.com/office/word/2010/wordml" xmlns:w15="http://schemas.microsoft.com/office/word/2012/wordml" xmlns:w16cex="http://schemas.microsoft.com/office/word/2018/wordml/cex" xmlns:w16cid="http://schemas.microsoft.com/office/word/2016/wordml/cid" xmlns:w16="http://schemas.microsoft.com/office/word/2018/wordml" xmlns:w16du="http://schemas.microsoft.com/office/word/2023/wordml/word16du" xmlns:w16sdtdh="http://schemas.microsoft.com/office/word/2020/wordml/sdtdatahash" xmlns:w16sdtfl="http://schemas.microsoft.com/office/word/2024/wordml/sdtformatlock" xmlns:w16se="http://schemas.microsoft.com/office/word/2015/wordml/symex" xmlns:wpg="http://schemas.microsoft.com/office/word/2010/wordprocessingGroup" xmlns:wpi="http://schemas.microsoft.com/office/word/2010/wordprocessingInk" xmlns:wne="http://schemas.microsoft.com/office/word/2006/wordml" xmlns:wps="http://schemas.microsoft.com/office/word/2010/wordprocessingShape" mc:Ignorable="w14 w15 w16se w16cid w16 w16cex w16sdtdh w16sdtfl w16du wp14">
+  <w16cid:commentId w16cid:paraId="2F2A87BC" w16cid:durableId="50B2785C"/>
+  <w16cid:commentId w16cid:paraId="20C5020B" w16cid:durableId="68100D79"/>
+  <w16cid:commentId w16cid:paraId="1EC789E0" w16cid:durableId="1E51EA32"/>
+  <w16cid:commentId w16cid:paraId="793D9E8A" w16cid:durableId="32F8B9C0"/>
+  <w16cid:commentId w16cid:paraId="099D1DA2" w16cid:durableId="4E0628C8"/>
+  <w16cid:commentId w16cid:paraId="68FCDA9D" w16cid:durableId="1366EED9"/>
+  <w16cid:commentId w16cid:paraId="61855B77" w16cid:durableId="4E9E6FB8"/>
+</w16cid:commentsIds>
 </file>
 
 <file path=word/numbering.xml><?xml version="1.0" encoding="utf-8"?>
@@ -1878,6 +2586,14 @@
     <w:abstractNumId w:val="1"/>
   </w:num>
 </w:numbering>
+</file>
+
+<file path=word/people.xml><?xml version="1.0" encoding="utf-8"?>
+<w15:people xmlns:wpc="http://schemas.microsoft.com/office/word/2010/wordprocessingCanvas" xmlns:cx="http://schemas.microsoft.com/office/drawing/2014/chartex" xmlns:cx1="http://schemas.microsoft.com/office/drawing/2015/9/8/chartex" xmlns:cx2="http://schemas.microsoft.com/office/drawing/2015/10/21/chartex" xmlns:cx3="http://schemas.microsoft.com/office/drawing/2016/5/9/chartex" xmlns:cx4="http://schemas.microsoft.com/office/drawing/2016/5/10/chartex" xmlns:cx5="http://schemas.microsoft.com/office/drawing/2016/5/11/chartex" xmlns:cx6="http://schemas.microsoft.com/office/drawing/2016/5/12/chartex" xmlns:cx7="http://schemas.microsoft.com/office/drawing/2016/5/13/chartex" xmlns:cx8="http://schemas.microsoft.com/office/drawing/2016/5/14/chartex" xmlns:mc="http://schemas.openxmlformats.org/markup-compatibility/2006" xmlns:aink="http://schemas.microsoft.com/office/drawing/2016/ink" xmlns:am3d="http://schemas.microsoft.com/office/drawing/2017/model3d" xmlns:o="urn:schemas-microsoft-com:office:office" xmlns:oel="http://schemas.microsoft.com/office/2019/extlst" xmlns:r="http://schemas.openxmlformats.org/officeDocument/2006/relationships" xmlns:m="http://schemas.openxmlformats.org/officeDocument/2006/math" xmlns:v="urn:schemas-microsoft-com:vml" xmlns:wp14="http://schemas.microsoft.com/office/word/2010/wordprocessingDrawing" xmlns:wp="http://schemas.openxmlformats.org/drawingml/2006/wordprocessingDrawing" xmlns:w10="urn:schemas-microsoft-com:office:word" xmlns:w="http://schemas.openxmlformats.org/wordprocessingml/2006/main" xmlns:w14="http://schemas.microsoft.com/office/word/2010/wordml" xmlns:w15="http://schemas.microsoft.com/office/word/2012/wordml" xmlns:w16cex="http://schemas.microsoft.com/office/word/2018/wordml/cex" xmlns:w16cid="http://schemas.microsoft.com/office/word/2016/wordml/cid" xmlns:w16="http://schemas.microsoft.com/office/word/2018/wordml" xmlns:w16du="http://schemas.microsoft.com/office/word/2023/wordml/word16du" xmlns:w16sdtdh="http://schemas.microsoft.com/office/word/2020/wordml/sdtdatahash" xmlns:w16sdtfl="http://schemas.microsoft.com/office/word/2024/wordml/sdtformatlock" xmlns:w16se="http://schemas.microsoft.com/office/word/2015/wordml/symex" xmlns:wpg="http://schemas.microsoft.com/office/word/2010/wordprocessingGroup" xmlns:wpi="http://schemas.microsoft.com/office/word/2010/wordprocessingInk" xmlns:wne="http://schemas.microsoft.com/office/word/2006/wordml" xmlns:wps="http://schemas.microsoft.com/office/word/2010/wordprocessingShape" mc:Ignorable="w14 w15 w16se w16cid w16 w16cex w16sdtdh w16sdtfl w16du wp14">
+  <w15:person w15:author="Mr I MAJOR">
+    <w15:presenceInfo w15:providerId="AD" w15:userId="S::imajor@clevedonschool.org.uk::bed1effd-9d0b-4366-83d7-2793b8f67739"/>
+  </w15:person>
+</w15:people>
 </file>
 
 <file path=word/styles.xml><?xml version="1.0" encoding="utf-8"?>
@@ -2946,6 +3662,72 @@
       </w:tcPr>
     </w:tblStylePr>
   </w:style>
+  <w:style w:type="character" w:styleId="CommentReference">
+    <w:name w:val="annotation reference"/>
+    <w:basedOn w:val="DefaultParagraphFont"/>
+    <w:uiPriority w:val="99"/>
+    <w:semiHidden/>
+    <w:unhideWhenUsed/>
+    <w:rsid w:val="00F43A17"/>
+    <w:rPr>
+      <w:sz w:val="16"/>
+      <w:szCs w:val="16"/>
+    </w:rPr>
+  </w:style>
+  <w:style w:type="paragraph" w:styleId="CommentText">
+    <w:name w:val="annotation text"/>
+    <w:basedOn w:val="Normal"/>
+    <w:link w:val="CommentTextChar"/>
+    <w:uiPriority w:val="99"/>
+    <w:unhideWhenUsed/>
+    <w:rsid w:val="00F43A17"/>
+    <w:pPr>
+      <w:spacing w:line="240" w:lineRule="auto"/>
+    </w:pPr>
+    <w:rPr>
+      <w:sz w:val="20"/>
+      <w:szCs w:val="20"/>
+    </w:rPr>
+  </w:style>
+  <w:style w:type="character" w:customStyle="1" w:styleId="CommentTextChar">
+    <w:name w:val="Comment Text Char"/>
+    <w:basedOn w:val="DefaultParagraphFont"/>
+    <w:link w:val="CommentText"/>
+    <w:uiPriority w:val="99"/>
+    <w:rsid w:val="00F43A17"/>
+    <w:rPr>
+      <w:sz w:val="20"/>
+      <w:szCs w:val="20"/>
+    </w:rPr>
+  </w:style>
+  <w:style w:type="paragraph" w:styleId="CommentSubject">
+    <w:name w:val="annotation subject"/>
+    <w:basedOn w:val="CommentText"/>
+    <w:next w:val="CommentText"/>
+    <w:link w:val="CommentSubjectChar"/>
+    <w:uiPriority w:val="99"/>
+    <w:semiHidden/>
+    <w:unhideWhenUsed/>
+    <w:rsid w:val="00F43A17"/>
+    <w:rPr>
+      <w:b/>
+      <w:bCs/>
+    </w:rPr>
+  </w:style>
+  <w:style w:type="character" w:customStyle="1" w:styleId="CommentSubjectChar">
+    <w:name w:val="Comment Subject Char"/>
+    <w:basedOn w:val="CommentTextChar"/>
+    <w:link w:val="CommentSubject"/>
+    <w:uiPriority w:val="99"/>
+    <w:semiHidden/>
+    <w:rsid w:val="00F43A17"/>
+    <w:rPr>
+      <w:b/>
+      <w:bCs/>
+      <w:sz w:val="20"/>
+      <w:szCs w:val="20"/>
+    </w:rPr>
+  </w:style>
 </w:styles>
 </file>
 

</xml_diff>

<commit_message>
Removed old writeup and updated official file
</commit_message>
<xml_diff>
--- a/Writeup/OFFICIAL_NEA_WRITEUP.docx
+++ b/Writeup/OFFICIAL_NEA_WRITEUP.docx
@@ -2,6 +2,226 @@
 <file path=word/document.xml><?xml version="1.0" encoding="utf-8"?>
 <w:document xmlns:wpc="http://schemas.microsoft.com/office/word/2010/wordprocessingCanvas" xmlns:cx="http://schemas.microsoft.com/office/drawing/2014/chartex" xmlns:cx1="http://schemas.microsoft.com/office/drawing/2015/9/8/chartex" xmlns:cx2="http://schemas.microsoft.com/office/drawing/2015/10/21/chartex" xmlns:cx3="http://schemas.microsoft.com/office/drawing/2016/5/9/chartex" xmlns:cx4="http://schemas.microsoft.com/office/drawing/2016/5/10/chartex" xmlns:cx5="http://schemas.microsoft.com/office/drawing/2016/5/11/chartex" xmlns:cx6="http://schemas.microsoft.com/office/drawing/2016/5/12/chartex" xmlns:cx7="http://schemas.microsoft.com/office/drawing/2016/5/13/chartex" xmlns:cx8="http://schemas.microsoft.com/office/drawing/2016/5/14/chartex" xmlns:mc="http://schemas.openxmlformats.org/markup-compatibility/2006" xmlns:aink="http://schemas.microsoft.com/office/drawing/2016/ink" xmlns:am3d="http://schemas.microsoft.com/office/drawing/2017/model3d" xmlns:o="urn:schemas-microsoft-com:office:office" xmlns:oel="http://schemas.microsoft.com/office/2019/extlst" xmlns:r="http://schemas.openxmlformats.org/officeDocument/2006/relationships" xmlns:m="http://schemas.openxmlformats.org/officeDocument/2006/math" xmlns:v="urn:schemas-microsoft-com:vml" xmlns:wp14="http://schemas.microsoft.com/office/word/2010/wordprocessingDrawing" xmlns:wp="http://schemas.openxmlformats.org/drawingml/2006/wordprocessingDrawing" xmlns:w10="urn:schemas-microsoft-com:office:word" xmlns:w="http://schemas.openxmlformats.org/wordprocessingml/2006/main" xmlns:w14="http://schemas.microsoft.com/office/word/2010/wordml" xmlns:w15="http://schemas.microsoft.com/office/word/2012/wordml" xmlns:w16cex="http://schemas.microsoft.com/office/word/2018/wordml/cex" xmlns:w16cid="http://schemas.microsoft.com/office/word/2016/wordml/cid" xmlns:w16="http://schemas.microsoft.com/office/word/2018/wordml" xmlns:w16du="http://schemas.microsoft.com/office/word/2023/wordml/word16du" xmlns:w16sdtdh="http://schemas.microsoft.com/office/word/2020/wordml/sdtdatahash" xmlns:w16sdtfl="http://schemas.microsoft.com/office/word/2024/wordml/sdtformatlock" xmlns:w16se="http://schemas.microsoft.com/office/word/2015/wordml/symex" xmlns:wpg="http://schemas.microsoft.com/office/word/2010/wordprocessingGroup" xmlns:wpi="http://schemas.microsoft.com/office/word/2010/wordprocessingInk" xmlns:wne="http://schemas.microsoft.com/office/word/2006/wordml" xmlns:wps="http://schemas.microsoft.com/office/word/2010/wordprocessingShape" mc:Ignorable="w14 w15 w16se w16cid w16 w16cex w16sdtdh w16sdtfl w16du wp14">
   <w:body>
+    <w:p>
+      <w:pPr>
+        <w:rPr>
+          <w:sz w:val="48"/>
+          <w:szCs w:val="48"/>
+          <w:u w:val="single"/>
+        </w:rPr>
+      </w:pPr>
+    </w:p>
+    <w:p>
+      <w:pPr>
+        <w:rPr>
+          <w:sz w:val="48"/>
+          <w:szCs w:val="48"/>
+          <w:u w:val="single"/>
+        </w:rPr>
+      </w:pPr>
+      <w:r>
+        <w:rPr>
+          <w:sz w:val="48"/>
+          <w:szCs w:val="48"/>
+          <w:u w:val="single"/>
+        </w:rPr>
+        <w:t>Computer Science Project report</w:t>
+      </w:r>
+    </w:p>
+    <w:p>
+      <w:pPr>
+        <w:rPr>
+          <w:sz w:val="48"/>
+          <w:szCs w:val="48"/>
+          <w:u w:val="single"/>
+        </w:rPr>
+      </w:pPr>
+      <w:r>
+        <w:rPr>
+          <w:sz w:val="48"/>
+          <w:szCs w:val="48"/>
+          <w:u w:val="single"/>
+        </w:rPr>
+        <w:t xml:space="preserve">OCR </w:t>
+      </w:r>
+      <w:r>
+        <w:rPr>
+          <w:sz w:val="48"/>
+          <w:szCs w:val="48"/>
+          <w:u w:val="single"/>
+        </w:rPr>
+        <w:t>H446-03</w:t>
+      </w:r>
+    </w:p>
+    <w:p>
+      <w:pPr>
+        <w:rPr>
+          <w:sz w:val="48"/>
+          <w:szCs w:val="48"/>
+          <w:u w:val="single"/>
+        </w:rPr>
+      </w:pPr>
+    </w:p>
+    <w:p>
+      <w:pPr>
+        <w:rPr>
+          <w:sz w:val="48"/>
+          <w:szCs w:val="48"/>
+          <w:u w:val="single"/>
+        </w:rPr>
+      </w:pPr>
+    </w:p>
+    <w:p>
+      <w:pPr>
+        <w:rPr>
+          <w:sz w:val="48"/>
+          <w:szCs w:val="48"/>
+          <w:u w:val="single"/>
+        </w:rPr>
+      </w:pPr>
+    </w:p>
+    <w:p>
+      <w:r>
+        <w:rPr>
+          <w:u w:val="single"/>
+        </w:rPr>
+        <w:t xml:space="preserve">Candidate Name: </w:t>
+      </w:r>
+      <w:r>
+        <w:t>Dexter Jeal</w:t>
+      </w:r>
+    </w:p>
+    <w:p>
+      <w:r>
+        <w:rPr>
+          <w:u w:val="single"/>
+        </w:rPr>
+        <w:t xml:space="preserve">Candidate Number: </w:t>
+      </w:r>
+      <w:r>
+        <w:t>1112</w:t>
+      </w:r>
+    </w:p>
+    <w:p>
+      <w:r>
+        <w:rPr>
+          <w:u w:val="single"/>
+        </w:rPr>
+        <w:t xml:space="preserve">Centre Name: </w:t>
+      </w:r>
+      <w:r>
+        <w:t>Clevedon school</w:t>
+      </w:r>
+    </w:p>
+    <w:p>
+      <w:r>
+        <w:rPr>
+          <w:u w:val="single"/>
+        </w:rPr>
+        <w:t xml:space="preserve">Centre Number: </w:t>
+      </w:r>
+      <w:r>
+        <w:t>50629</w:t>
+      </w:r>
+    </w:p>
+    <w:p>
+      <w:pPr>
+        <w:rPr>
+          <w:i/>
+          <w:iCs/>
+        </w:rPr>
+      </w:pPr>
+      <w:r>
+        <w:rPr>
+          <w:u w:val="single"/>
+        </w:rPr>
+        <w:t>Title of Project:</w:t>
+      </w:r>
+      <w:r>
+        <w:t xml:space="preserve"> </w:t>
+      </w:r>
+      <w:proofErr w:type="spellStart"/>
+      <w:r>
+        <w:rPr>
+          <w:i/>
+          <w:iCs/>
+        </w:rPr>
+        <w:t>InsertNameHere</w:t>
+      </w:r>
+      <w:proofErr w:type="spellEnd"/>
+    </w:p>
+    <w:p>
+      <w:pPr>
+        <w:rPr>
+          <w:sz w:val="48"/>
+          <w:szCs w:val="48"/>
+          <w:u w:val="single"/>
+        </w:rPr>
+      </w:pPr>
+    </w:p>
+    <w:p>
+      <w:pPr>
+        <w:rPr>
+          <w:sz w:val="48"/>
+          <w:szCs w:val="48"/>
+          <w:u w:val="single"/>
+        </w:rPr>
+      </w:pPr>
+    </w:p>
+    <w:p>
+      <w:pPr>
+        <w:rPr>
+          <w:sz w:val="48"/>
+          <w:szCs w:val="48"/>
+          <w:u w:val="single"/>
+        </w:rPr>
+      </w:pPr>
+    </w:p>
+    <w:p>
+      <w:pPr>
+        <w:rPr>
+          <w:sz w:val="48"/>
+          <w:szCs w:val="48"/>
+          <w:u w:val="single"/>
+        </w:rPr>
+      </w:pPr>
+    </w:p>
+    <w:p>
+      <w:pPr>
+        <w:rPr>
+          <w:sz w:val="48"/>
+          <w:szCs w:val="48"/>
+          <w:u w:val="single"/>
+        </w:rPr>
+      </w:pPr>
+    </w:p>
+    <w:p>
+      <w:pPr>
+        <w:rPr>
+          <w:sz w:val="48"/>
+          <w:szCs w:val="48"/>
+          <w:u w:val="single"/>
+        </w:rPr>
+      </w:pPr>
+    </w:p>
+    <w:p>
+      <w:pPr>
+        <w:rPr>
+          <w:sz w:val="48"/>
+          <w:szCs w:val="48"/>
+          <w:u w:val="single"/>
+        </w:rPr>
+      </w:pPr>
+    </w:p>
+    <w:p>
+      <w:pPr>
+        <w:rPr>
+          <w:sz w:val="48"/>
+          <w:szCs w:val="48"/>
+          <w:u w:val="single"/>
+        </w:rPr>
+      </w:pPr>
+    </w:p>
     <w:p>
       <w:pPr>
         <w:rPr>
@@ -73,7 +293,7 @@
           <w:r>
             <w:fldChar w:fldCharType="separate"/>
           </w:r>
-          <w:hyperlink w:anchor="_Toc209800698" w:history="1">
+          <w:hyperlink w:anchor="_Toc213244599" w:history="1">
             <w:r>
               <w:rPr>
                 <w:rStyle w:val="Hyperlink"/>
@@ -100,7 +320,7 @@
                 <w:noProof/>
                 <w:webHidden/>
               </w:rPr>
-              <w:instrText xml:space="preserve"> PAGEREF _Toc209800698 \h </w:instrText>
+              <w:instrText xml:space="preserve"> PAGEREF _Toc213244599 \h </w:instrText>
             </w:r>
             <w:r>
               <w:rPr>
@@ -120,7 +340,7 @@
                 <w:noProof/>
                 <w:webHidden/>
               </w:rPr>
-              <w:t>1</w:t>
+              <w:t>2</w:t>
             </w:r>
             <w:r>
               <w:rPr>
@@ -143,7 +363,7 @@
               <w:lang w:eastAsia="en-GB"/>
             </w:rPr>
           </w:pPr>
-          <w:hyperlink w:anchor="_Toc209800699" w:history="1">
+          <w:hyperlink w:anchor="_Toc213244600" w:history="1">
             <w:r>
               <w:rPr>
                 <w:rStyle w:val="Hyperlink"/>
@@ -170,7 +390,7 @@
                 <w:noProof/>
                 <w:webHidden/>
               </w:rPr>
-              <w:instrText xml:space="preserve"> PAGEREF _Toc209800699 \h </w:instrText>
+              <w:instrText xml:space="preserve"> PAGEREF _Toc213244600 \h </w:instrText>
             </w:r>
             <w:r>
               <w:rPr>
@@ -190,7 +410,7 @@
                 <w:noProof/>
                 <w:webHidden/>
               </w:rPr>
-              <w:t>1</w:t>
+              <w:t>3</w:t>
             </w:r>
             <w:r>
               <w:rPr>
@@ -213,7 +433,7 @@
               <w:lang w:eastAsia="en-GB"/>
             </w:rPr>
           </w:pPr>
-          <w:hyperlink w:anchor="_Toc209800700" w:history="1">
+          <w:hyperlink w:anchor="_Toc213244601" w:history="1">
             <w:r>
               <w:rPr>
                 <w:rStyle w:val="Hyperlink"/>
@@ -240,7 +460,7 @@
                 <w:noProof/>
                 <w:webHidden/>
               </w:rPr>
-              <w:instrText xml:space="preserve"> PAGEREF _Toc209800700 \h </w:instrText>
+              <w:instrText xml:space="preserve"> PAGEREF _Toc213244601 \h </w:instrText>
             </w:r>
             <w:r>
               <w:rPr>
@@ -260,7 +480,7 @@
                 <w:noProof/>
                 <w:webHidden/>
               </w:rPr>
-              <w:t>1</w:t>
+              <w:t>3</w:t>
             </w:r>
             <w:r>
               <w:rPr>
@@ -283,7 +503,7 @@
               <w:lang w:eastAsia="en-GB"/>
             </w:rPr>
           </w:pPr>
-          <w:hyperlink w:anchor="_Toc209800701" w:history="1">
+          <w:hyperlink w:anchor="_Toc213244602" w:history="1">
             <w:r>
               <w:rPr>
                 <w:rStyle w:val="Hyperlink"/>
@@ -310,7 +530,7 @@
                 <w:noProof/>
                 <w:webHidden/>
               </w:rPr>
-              <w:instrText xml:space="preserve"> PAGEREF _Toc209800701 \h </w:instrText>
+              <w:instrText xml:space="preserve"> PAGEREF _Toc213244602 \h </w:instrText>
             </w:r>
             <w:r>
               <w:rPr>
@@ -330,7 +550,7 @@
                 <w:noProof/>
                 <w:webHidden/>
               </w:rPr>
-              <w:t>2</w:t>
+              <w:t>4</w:t>
             </w:r>
             <w:r>
               <w:rPr>
@@ -353,7 +573,7 @@
               <w:lang w:eastAsia="en-GB"/>
             </w:rPr>
           </w:pPr>
-          <w:hyperlink w:anchor="_Toc209800702" w:history="1">
+          <w:hyperlink w:anchor="_Toc213244603" w:history="1">
             <w:r>
               <w:rPr>
                 <w:rStyle w:val="Hyperlink"/>
@@ -380,7 +600,7 @@
                 <w:noProof/>
                 <w:webHidden/>
               </w:rPr>
-              <w:instrText xml:space="preserve"> PAGEREF _Toc209800702 \h </w:instrText>
+              <w:instrText xml:space="preserve"> PAGEREF _Toc213244603 \h </w:instrText>
             </w:r>
             <w:r>
               <w:rPr>
@@ -400,7 +620,7 @@
                 <w:noProof/>
                 <w:webHidden/>
               </w:rPr>
-              <w:t>3</w:t>
+              <w:t>5</w:t>
             </w:r>
             <w:r>
               <w:rPr>
@@ -423,7 +643,7 @@
               <w:lang w:eastAsia="en-GB"/>
             </w:rPr>
           </w:pPr>
-          <w:hyperlink w:anchor="_Toc209800703" w:history="1">
+          <w:hyperlink w:anchor="_Toc213244604" w:history="1">
             <w:r>
               <w:rPr>
                 <w:rStyle w:val="Hyperlink"/>
@@ -450,7 +670,7 @@
                 <w:noProof/>
                 <w:webHidden/>
               </w:rPr>
-              <w:instrText xml:space="preserve"> PAGEREF _Toc209800703 \h </w:instrText>
+              <w:instrText xml:space="preserve"> PAGEREF _Toc213244604 \h </w:instrText>
             </w:r>
             <w:r>
               <w:rPr>
@@ -470,7 +690,7 @@
                 <w:noProof/>
                 <w:webHidden/>
               </w:rPr>
-              <w:t>5</w:t>
+              <w:t>8</w:t>
             </w:r>
             <w:r>
               <w:rPr>
@@ -493,12 +713,236 @@
               <w:lang w:eastAsia="en-GB"/>
             </w:rPr>
           </w:pPr>
-          <w:hyperlink w:anchor="_Toc209800704" w:history="1">
+          <w:hyperlink w:anchor="_Toc213244605" w:history="1">
             <w:r>
               <w:rPr>
                 <w:rStyle w:val="Hyperlink"/>
                 <w:noProof/>
               </w:rPr>
+              <w:t>Des</w:t>
+            </w:r>
+            <w:r>
+              <w:rPr>
+                <w:rStyle w:val="Hyperlink"/>
+                <w:noProof/>
+              </w:rPr>
+              <w:t>i</w:t>
+            </w:r>
+            <w:r>
+              <w:rPr>
+                <w:rStyle w:val="Hyperlink"/>
+                <w:noProof/>
+              </w:rPr>
+              <w:t>gn</w:t>
+            </w:r>
+            <w:r>
+              <w:rPr>
+                <w:noProof/>
+                <w:webHidden/>
+              </w:rPr>
+              <w:tab/>
+            </w:r>
+            <w:r>
+              <w:rPr>
+                <w:noProof/>
+                <w:webHidden/>
+              </w:rPr>
+              <w:fldChar w:fldCharType="begin"/>
+            </w:r>
+            <w:r>
+              <w:rPr>
+                <w:noProof/>
+                <w:webHidden/>
+              </w:rPr>
+              <w:instrText xml:space="preserve"> PAGEREF _Toc213244605 \h </w:instrText>
+            </w:r>
+            <w:r>
+              <w:rPr>
+                <w:noProof/>
+                <w:webHidden/>
+              </w:rPr>
+            </w:r>
+            <w:r>
+              <w:rPr>
+                <w:noProof/>
+                <w:webHidden/>
+              </w:rPr>
+              <w:fldChar w:fldCharType="separate"/>
+            </w:r>
+            <w:r>
+              <w:rPr>
+                <w:noProof/>
+                <w:webHidden/>
+              </w:rPr>
+              <w:t>8</w:t>
+            </w:r>
+            <w:r>
+              <w:rPr>
+                <w:noProof/>
+                <w:webHidden/>
+              </w:rPr>
+              <w:fldChar w:fldCharType="end"/>
+            </w:r>
+          </w:hyperlink>
+        </w:p>
+        <w:p>
+          <w:pPr>
+            <w:pStyle w:val="TOC1"/>
+            <w:tabs>
+              <w:tab w:val="right" w:leader="dot" w:pos="9016"/>
+            </w:tabs>
+            <w:rPr>
+              <w:rFonts w:eastAsiaTheme="minorEastAsia"/>
+              <w:noProof/>
+              <w:lang w:eastAsia="en-GB"/>
+            </w:rPr>
+          </w:pPr>
+          <w:hyperlink w:anchor="_Toc213244606" w:history="1">
+            <w:r>
+              <w:rPr>
+                <w:rStyle w:val="Hyperlink"/>
+                <w:noProof/>
+              </w:rPr>
+              <w:t>Sprints:</w:t>
+            </w:r>
+            <w:r>
+              <w:rPr>
+                <w:noProof/>
+                <w:webHidden/>
+              </w:rPr>
+              <w:tab/>
+            </w:r>
+            <w:r>
+              <w:rPr>
+                <w:noProof/>
+                <w:webHidden/>
+              </w:rPr>
+              <w:fldChar w:fldCharType="begin"/>
+            </w:r>
+            <w:r>
+              <w:rPr>
+                <w:noProof/>
+                <w:webHidden/>
+              </w:rPr>
+              <w:instrText xml:space="preserve"> PAGEREF _Toc213244606 \h </w:instrText>
+            </w:r>
+            <w:r>
+              <w:rPr>
+                <w:noProof/>
+                <w:webHidden/>
+              </w:rPr>
+            </w:r>
+            <w:r>
+              <w:rPr>
+                <w:noProof/>
+                <w:webHidden/>
+              </w:rPr>
+              <w:fldChar w:fldCharType="separate"/>
+            </w:r>
+            <w:r>
+              <w:rPr>
+                <w:noProof/>
+                <w:webHidden/>
+              </w:rPr>
+              <w:t>9</w:t>
+            </w:r>
+            <w:r>
+              <w:rPr>
+                <w:noProof/>
+                <w:webHidden/>
+              </w:rPr>
+              <w:fldChar w:fldCharType="end"/>
+            </w:r>
+          </w:hyperlink>
+        </w:p>
+        <w:p>
+          <w:pPr>
+            <w:pStyle w:val="TOC2"/>
+            <w:tabs>
+              <w:tab w:val="right" w:leader="dot" w:pos="9016"/>
+            </w:tabs>
+            <w:rPr>
+              <w:rFonts w:eastAsiaTheme="minorEastAsia"/>
+              <w:noProof/>
+              <w:lang w:eastAsia="en-GB"/>
+            </w:rPr>
+          </w:pPr>
+          <w:hyperlink w:anchor="_Toc213244607" w:history="1">
+            <w:r>
+              <w:rPr>
+                <w:rStyle w:val="Hyperlink"/>
+                <w:noProof/>
+              </w:rPr>
+              <w:t>Sprint 1</w:t>
+            </w:r>
+            <w:r>
+              <w:rPr>
+                <w:noProof/>
+                <w:webHidden/>
+              </w:rPr>
+              <w:tab/>
+            </w:r>
+            <w:r>
+              <w:rPr>
+                <w:noProof/>
+                <w:webHidden/>
+              </w:rPr>
+              <w:fldChar w:fldCharType="begin"/>
+            </w:r>
+            <w:r>
+              <w:rPr>
+                <w:noProof/>
+                <w:webHidden/>
+              </w:rPr>
+              <w:instrText xml:space="preserve"> PAGEREF _Toc213244607 \h </w:instrText>
+            </w:r>
+            <w:r>
+              <w:rPr>
+                <w:noProof/>
+                <w:webHidden/>
+              </w:rPr>
+            </w:r>
+            <w:r>
+              <w:rPr>
+                <w:noProof/>
+                <w:webHidden/>
+              </w:rPr>
+              <w:fldChar w:fldCharType="separate"/>
+            </w:r>
+            <w:r>
+              <w:rPr>
+                <w:noProof/>
+                <w:webHidden/>
+              </w:rPr>
+              <w:t>9</w:t>
+            </w:r>
+            <w:r>
+              <w:rPr>
+                <w:noProof/>
+                <w:webHidden/>
+              </w:rPr>
+              <w:fldChar w:fldCharType="end"/>
+            </w:r>
+          </w:hyperlink>
+        </w:p>
+        <w:p>
+          <w:pPr>
+            <w:pStyle w:val="TOC1"/>
+            <w:tabs>
+              <w:tab w:val="right" w:leader="dot" w:pos="9016"/>
+            </w:tabs>
+            <w:rPr>
+              <w:rFonts w:eastAsiaTheme="minorEastAsia"/>
+              <w:noProof/>
+              <w:lang w:eastAsia="en-GB"/>
+            </w:rPr>
+          </w:pPr>
+          <w:hyperlink w:anchor="_Toc213244608" w:history="1">
+            <w:r>
+              <w:rPr>
+                <w:rStyle w:val="Hyperlink"/>
+                <w:noProof/>
+              </w:rPr>
               <w:t>To Do:</w:t>
             </w:r>
             <w:r>
@@ -520,7 +964,7 @@
                 <w:noProof/>
                 <w:webHidden/>
               </w:rPr>
-              <w:instrText xml:space="preserve"> PAGEREF _Toc209800704 \h </w:instrText>
+              <w:instrText xml:space="preserve"> PAGEREF _Toc213244608 \h </w:instrText>
             </w:r>
             <w:r>
               <w:rPr>
@@ -540,7 +984,7 @@
                 <w:noProof/>
                 <w:webHidden/>
               </w:rPr>
-              <w:t>5</w:t>
+              <w:t>9</w:t>
             </w:r>
             <w:r>
               <w:rPr>
@@ -568,21 +1012,11 @@
       <w:pPr>
         <w:pStyle w:val="Heading1"/>
       </w:pPr>
-      <w:bookmarkStart w:id="0" w:name="_Toc209800698"/>
-      <w:commentRangeStart w:id="1"/>
+      <w:bookmarkStart w:id="0" w:name="_Toc213244599"/>
       <w:r>
         <w:t>Introduction</w:t>
       </w:r>
       <w:bookmarkEnd w:id="0"/>
-      <w:commentRangeEnd w:id="1"/>
-      <w:r>
-        <w:rPr>
-          <w:rStyle w:val="CommentReference"/>
-          <w:rFonts w:asciiTheme="minorHAnsi" w:eastAsiaTheme="minorHAnsi" w:hAnsiTheme="minorHAnsi" w:cstheme="minorBidi"/>
-          <w:color w:val="auto"/>
-        </w:rPr>
-        <w:commentReference w:id="1"/>
-      </w:r>
     </w:p>
     <w:p>
       <w:proofErr w:type="spellStart"/>
@@ -598,172 +1032,131 @@
         <w:t xml:space="preserve">: </w:t>
       </w:r>
       <w:r>
-        <w:t xml:space="preserve">A </w:t>
-      </w:r>
-      <w:proofErr w:type="gramStart"/>
-      <w:r>
-        <w:t>block based</w:t>
-      </w:r>
-      <w:proofErr w:type="gramEnd"/>
+        <w:t xml:space="preserve">A block based </w:t>
+      </w:r>
+      <w:r>
+        <w:t xml:space="preserve">coding editor to allow </w:t>
+      </w:r>
+      <w:r>
+        <w:t>secondary school students to begin working with microcontrollers</w:t>
+      </w:r>
+      <w:r>
+        <w:t xml:space="preserve">, by giving them a familiar interface </w:t>
+      </w:r>
+      <w:r>
+        <w:t xml:space="preserve">of block based coding, to allow them to learn how to code microcontrollers and have a basic understanding of electronics. </w:t>
+      </w:r>
+      <w:r>
+        <w:t xml:space="preserve">My main goal with this project is to be able to help other </w:t>
+      </w:r>
+      <w:r>
+        <w:t xml:space="preserve">to understand where I get my passion for </w:t>
+      </w:r>
+      <w:r>
+        <w:t>microcontrollers</w:t>
+      </w:r>
+      <w:r>
+        <w:t xml:space="preserve">. </w:t>
+      </w:r>
+      <w:r>
+        <w:t xml:space="preserve">This passion of mine started </w:t>
+      </w:r>
+      <w:r>
+        <w:t>off</w:t>
+      </w:r>
+      <w:r>
+        <w:t xml:space="preserve"> when I was </w:t>
+      </w:r>
+      <w:r>
+        <w:t xml:space="preserve">young when my dad bought me my first raspberry pi microcomputer. </w:t>
+      </w:r>
+      <w:r>
+        <w:t xml:space="preserve">This then got me hooked on working on these sorts of devices, as I found them challenging and </w:t>
+      </w:r>
+      <w:r>
+        <w:t>this love for them set me up for later in my school journey</w:t>
+      </w:r>
+      <w:r>
+        <w:t xml:space="preserve">. </w:t>
+      </w:r>
+      <w:r>
+        <w:t xml:space="preserve">In lower school I was </w:t>
+      </w:r>
+      <w:r>
+        <w:t>doing electronics for my GCSE</w:t>
+      </w:r>
+      <w:r>
+        <w:t>s</w:t>
+      </w:r>
+      <w:r>
+        <w:t xml:space="preserve">, </w:t>
+      </w:r>
+      <w:r>
+        <w:t>part of it was working with microcontrollers as a piece of coursework</w:t>
+      </w:r>
+      <w:r>
+        <w:t xml:space="preserve">, and from there I went home and </w:t>
+      </w:r>
+      <w:r>
+        <w:t xml:space="preserve">continued </w:t>
+      </w:r>
+      <w:r>
+        <w:t>working with them to a point where I was gaining knowledge that I have used countless time throughout the following years on multiple different occasions</w:t>
+      </w:r>
+      <w:r>
+        <w:t xml:space="preserve">. These skills I feel are </w:t>
+      </w:r>
+      <w:r>
+        <w:t xml:space="preserve">core to this project as I feel that microcontrollers </w:t>
+      </w:r>
+      <w:r>
+        <w:t xml:space="preserve">are key to any person who wants to go into any electronics or </w:t>
+      </w:r>
+      <w:r>
+        <w:t xml:space="preserve">computer science based </w:t>
+      </w:r>
+      <w:r>
+        <w:t xml:space="preserve">courses later in life. </w:t>
+      </w:r>
+      <w:r>
+        <w:t>Within the project microcontrollers will have a small part as the project</w:t>
+      </w:r>
+      <w:r>
+        <w:t xml:space="preserve">, they will have the ability to have code transferred to them as the block will be able to </w:t>
+      </w:r>
+      <w:r>
+        <w:t xml:space="preserve">compiled into code that </w:t>
+      </w:r>
+      <w:r>
+        <w:t xml:space="preserve">then will be able to run on the </w:t>
+      </w:r>
+      <w:r>
+        <w:lastRenderedPageBreak/>
+        <w:t>said microcontroller</w:t>
+      </w:r>
+      <w:r>
+        <w:t xml:space="preserve"> when compiled. </w:t>
+      </w:r>
+      <w:r>
+        <w:t xml:space="preserve">The stakeholder for my project </w:t>
+      </w:r>
+      <w:r>
+        <w:t>is Mr Turner</w:t>
+      </w:r>
+      <w:r>
+        <w:t>, who is Head of Computing/Electronics/DT/Food</w:t>
+      </w:r>
+      <w:r>
+        <w:t xml:space="preserve">, so he has the </w:t>
+      </w:r>
+      <w:r>
+        <w:t>skills required to allow me to develop this project further</w:t>
+      </w:r>
       <w:r>
         <w:t xml:space="preserve"> </w:t>
       </w:r>
       <w:r>
-        <w:t xml:space="preserve">coding editor to allow </w:t>
-      </w:r>
-      <w:r>
-        <w:t>secondary school students to begin working with microcontrollers</w:t>
-      </w:r>
-      <w:r>
-        <w:t xml:space="preserve">, by giving them a familiar interface </w:t>
-      </w:r>
-      <w:r>
-        <w:t xml:space="preserve">of </w:t>
-      </w:r>
-      <w:proofErr w:type="gramStart"/>
-      <w:r>
-        <w:t>block based</w:t>
-      </w:r>
-      <w:proofErr w:type="gramEnd"/>
-      <w:r>
-        <w:t xml:space="preserve"> coding, to allow them to learn how to code microcontrollers and have a basic understanding of electronics. </w:t>
-      </w:r>
-      <w:r>
-        <w:t xml:space="preserve">My main goal with this project is to be able to help other </w:t>
-      </w:r>
-      <w:r>
-        <w:t xml:space="preserve">to understand where I get my passion for </w:t>
-      </w:r>
-      <w:r>
-        <w:t>microcontrollers</w:t>
-      </w:r>
-      <w:r>
-        <w:t xml:space="preserve">. </w:t>
-      </w:r>
-      <w:r>
-        <w:t xml:space="preserve">This passion of mine started </w:t>
-      </w:r>
-      <w:r>
-        <w:t>off</w:t>
-      </w:r>
-      <w:r>
-        <w:t xml:space="preserve"> when I was </w:t>
-      </w:r>
-      <w:r>
-        <w:t xml:space="preserve">young when my dad bought me my first raspberry pi microcomputer. </w:t>
-      </w:r>
-      <w:r>
-        <w:t xml:space="preserve">This then got me hooked on working on these sorts of devices, as I found them challenging and </w:t>
-      </w:r>
-      <w:r>
-        <w:t>this love for them set me up for later in my school journey</w:t>
-      </w:r>
-      <w:r>
-        <w:t xml:space="preserve">. </w:t>
-      </w:r>
-      <w:r>
-        <w:t xml:space="preserve">In lower school I was </w:t>
-      </w:r>
-      <w:r>
-        <w:t>doing electronics for my GCSE</w:t>
-      </w:r>
-      <w:r>
-        <w:t>s</w:t>
-      </w:r>
-      <w:r>
-        <w:t xml:space="preserve">, </w:t>
-      </w:r>
-      <w:r>
-        <w:t>part of it was working with microcontrollers as a piece of coursework</w:t>
-      </w:r>
-      <w:r>
-        <w:t xml:space="preserve">, and from there I went home and </w:t>
-      </w:r>
-      <w:r>
-        <w:t xml:space="preserve">continued </w:t>
-      </w:r>
-      <w:r>
-        <w:t>working with them to a point where I was gaining knowledge that I have used countless time throughout the following years on multiple different occasions</w:t>
-      </w:r>
-      <w:r>
-        <w:t xml:space="preserve">. These skills I feel are </w:t>
-      </w:r>
-      <w:r>
-        <w:t xml:space="preserve">core to this project as I feel that microcontrollers </w:t>
-      </w:r>
-      <w:r>
-        <w:t xml:space="preserve">are key to any person who wants to go into any electronics or </w:t>
-      </w:r>
-      <w:r>
-        <w:t xml:space="preserve">computer </w:t>
-      </w:r>
-      <w:proofErr w:type="gramStart"/>
-      <w:r>
-        <w:t>science based</w:t>
-      </w:r>
-      <w:proofErr w:type="gramEnd"/>
-      <w:r>
-        <w:t xml:space="preserve"> </w:t>
-      </w:r>
-      <w:r>
-        <w:t xml:space="preserve">courses later in life. </w:t>
-      </w:r>
-      <w:r>
-        <w:t>Within the project microcontrollers will have a small part as the project</w:t>
-      </w:r>
-      <w:r>
-        <w:t xml:space="preserve">, they will have the ability to have code transferred to them as the block will be able to </w:t>
-      </w:r>
-      <w:proofErr w:type="gramStart"/>
-      <w:r>
-        <w:t>compiled</w:t>
-      </w:r>
-      <w:proofErr w:type="gramEnd"/>
-      <w:r>
-        <w:t xml:space="preserve"> into code that </w:t>
-      </w:r>
-      <w:r>
-        <w:t>then will be able to run on the said microcontroller</w:t>
-      </w:r>
-      <w:r>
-        <w:t xml:space="preserve"> when compiled. </w:t>
-      </w:r>
-      <w:r>
-        <w:t xml:space="preserve">The stakeholder for my project </w:t>
-      </w:r>
-      <w:r>
-        <w:t>is Mr Turner</w:t>
-      </w:r>
-      <w:r>
-        <w:t>, who is Head of Computing/Electronics/DT/Food</w:t>
-      </w:r>
-      <w:r>
-        <w:t xml:space="preserve">, so he has the </w:t>
-      </w:r>
-      <w:r>
-        <w:t>skills required to allow me to develop this project further</w:t>
-      </w:r>
-      <w:r>
-        <w:t xml:space="preserve"> </w:t>
-      </w:r>
-      <w:r>
-        <w:t xml:space="preserve">through his expertise in this area. His skillset is </w:t>
-      </w:r>
-      <w:proofErr w:type="gramStart"/>
-      <w:r>
-        <w:t>similar to</w:t>
-      </w:r>
-      <w:proofErr w:type="gramEnd"/>
-      <w:r>
-        <w:t xml:space="preserve"> </w:t>
-      </w:r>
-      <w:proofErr w:type="gramStart"/>
-      <w:r>
-        <w:t>mine</w:t>
-      </w:r>
-      <w:proofErr w:type="gramEnd"/>
-      <w:r>
-        <w:t xml:space="preserve"> but he has more understanding on what students would want for coding with microcontrollers</w:t>
+        <w:t>through his expertise in this area. His skillset is similar to mine but he has more understanding on what students would want for coding with microcontrollers</w:t>
       </w:r>
       <w:r>
         <w:t>.</w:t>
@@ -784,19 +1177,7 @@
         <w:t xml:space="preserve">I have had previous experiences </w:t>
       </w:r>
       <w:r>
-        <w:t xml:space="preserve">working with students </w:t>
-      </w:r>
-      <w:r>
-        <w:lastRenderedPageBreak/>
-        <w:t xml:space="preserve">and a </w:t>
-      </w:r>
-      <w:proofErr w:type="gramStart"/>
-      <w:r>
-        <w:t>block based</w:t>
-      </w:r>
-      <w:proofErr w:type="gramEnd"/>
-      <w:r>
-        <w:t xml:space="preserve"> coding editor, in the past I have used </w:t>
+        <w:t xml:space="preserve">working with students and a block based coding editor, in the past I have used </w:t>
       </w:r>
       <w:proofErr w:type="spellStart"/>
       <w:r>
@@ -877,21 +1258,21 @@
       <w:pPr>
         <w:pStyle w:val="Heading1"/>
       </w:pPr>
-      <w:bookmarkStart w:id="2" w:name="_Toc209800699"/>
+      <w:bookmarkStart w:id="1" w:name="_Toc213244600"/>
       <w:r>
         <w:t>Research</w:t>
       </w:r>
+      <w:bookmarkEnd w:id="1"/>
+    </w:p>
+    <w:p>
+      <w:pPr>
+        <w:pStyle w:val="Heading2"/>
+      </w:pPr>
+      <w:bookmarkStart w:id="2" w:name="_Toc213244601"/>
+      <w:r>
+        <w:t>Pre-requisites</w:t>
+      </w:r>
       <w:bookmarkEnd w:id="2"/>
-    </w:p>
-    <w:p>
-      <w:pPr>
-        <w:pStyle w:val="Heading2"/>
-      </w:pPr>
-      <w:bookmarkStart w:id="3" w:name="_Toc209800700"/>
-      <w:r>
-        <w:t>Pre-requisites</w:t>
-      </w:r>
-      <w:bookmarkEnd w:id="3"/>
     </w:p>
     <w:p>
       <w:r>
@@ -912,7 +1293,6 @@
           <w:numId w:val="1"/>
         </w:numPr>
       </w:pPr>
-      <w:commentRangeStart w:id="4"/>
       <w:r>
         <w:t xml:space="preserve">A window library to create a </w:t>
       </w:r>
@@ -946,13 +1326,6 @@
       <w:r>
         <w:t>A way to compile the blocks into code that can then be used on the microcontroller</w:t>
       </w:r>
-      <w:commentRangeEnd w:id="4"/>
-      <w:r>
-        <w:rPr>
-          <w:rStyle w:val="CommentReference"/>
-        </w:rPr>
-        <w:commentReference w:id="4"/>
-      </w:r>
     </w:p>
     <w:p>
       <w:pPr>
@@ -996,32 +1369,49 @@
         <w:t>For this project I was originally going to use Golang as it is a modern compiled language that I had seen used for other complex projects</w:t>
       </w:r>
       <w:r>
-        <w:t xml:space="preserve">, but when doing some simple testing with </w:t>
-      </w:r>
-      <w:commentRangeStart w:id="5"/>
-      <w:r>
-        <w:t xml:space="preserve">the window framework </w:t>
-      </w:r>
-      <w:commentRangeEnd w:id="5"/>
-      <w:r>
-        <w:rPr>
-          <w:rStyle w:val="CommentReference"/>
-        </w:rPr>
-        <w:commentReference w:id="5"/>
-      </w:r>
-      <w:r>
-        <w:t xml:space="preserve">I was going to use I found that it would either take </w:t>
-      </w:r>
-      <w:r>
-        <w:t xml:space="preserve">an unusually long time to compile or not compile at all. </w:t>
-      </w:r>
-      <w:proofErr w:type="gramStart"/>
-      <w:r>
-        <w:t>So</w:t>
-      </w:r>
-      <w:proofErr w:type="gramEnd"/>
-      <w:r>
-        <w:t xml:space="preserve"> I have made the decision to change </w:t>
+        <w:t>, but when doing some simple testing with the window framework</w:t>
+      </w:r>
+      <w:r>
+        <w:t xml:space="preserve">. </w:t>
+      </w:r>
+      <w:r>
+        <w:t xml:space="preserve">When trying to compile the </w:t>
+      </w:r>
+      <w:r>
+        <w:t>Golang</w:t>
+      </w:r>
+      <w:r>
+        <w:t xml:space="preserve"> program to check that the framework would work and has the necessary </w:t>
+      </w:r>
+      <w:r>
+        <w:t>components for me to complete my project</w:t>
+      </w:r>
+      <w:r>
+        <w:t xml:space="preserve">. During the testing for the </w:t>
+      </w:r>
+      <w:r>
+        <w:t>framework,</w:t>
+      </w:r>
+      <w:r>
+        <w:t xml:space="preserve"> I found that it would not </w:t>
+      </w:r>
+      <w:r>
+        <w:t>compile,</w:t>
+      </w:r>
+      <w:r>
+        <w:t xml:space="preserve"> and </w:t>
+      </w:r>
+      <w:r>
+        <w:t>it would get stuck compiling, then when I tested it without the framework it would compile with no problems</w:t>
+      </w:r>
+      <w:r>
+        <w:t>.</w:t>
+      </w:r>
+      <w:r>
+        <w:t xml:space="preserve"> </w:t>
+      </w:r>
+      <w:r>
+        <w:t xml:space="preserve">. So I have made the decision to change </w:t>
       </w:r>
       <w:r>
         <w:t xml:space="preserve">my coding language to using </w:t>
@@ -1029,19 +1419,8 @@
       <w:r>
         <w:t>R</w:t>
       </w:r>
-      <w:commentRangeStart w:id="6"/>
-      <w:r>
-        <w:t>ust</w:t>
-      </w:r>
-      <w:commentRangeEnd w:id="6"/>
-      <w:r>
-        <w:rPr>
-          <w:rStyle w:val="CommentReference"/>
-        </w:rPr>
-        <w:commentReference w:id="6"/>
-      </w:r>
-      <w:r>
-        <w:t xml:space="preserve">, this is because I am more familiar with the language and have used it in the past for similar GUI based projects and I know that it will </w:t>
+      <w:r>
+        <w:t xml:space="preserve">ust, this is because I am more familiar with the language and have used it in the past for similar GUI based projects and I know that it will </w:t>
       </w:r>
       <w:r>
         <w:t>compile,</w:t>
@@ -1055,33 +1434,15 @@
       <w:pPr>
         <w:pStyle w:val="Heading2"/>
       </w:pPr>
-      <w:bookmarkStart w:id="7" w:name="_Toc209800701"/>
-      <w:commentRangeStart w:id="8"/>
+      <w:bookmarkStart w:id="3" w:name="_Toc213244602"/>
       <w:r>
         <w:t>Partial solutions</w:t>
       </w:r>
-      <w:bookmarkEnd w:id="7"/>
-      <w:commentRangeEnd w:id="8"/>
-      <w:r>
-        <w:rPr>
-          <w:rStyle w:val="CommentReference"/>
-          <w:rFonts w:asciiTheme="minorHAnsi" w:eastAsiaTheme="minorHAnsi" w:hAnsiTheme="minorHAnsi" w:cstheme="minorBidi"/>
-          <w:color w:val="auto"/>
-        </w:rPr>
-        <w:commentReference w:id="8"/>
-      </w:r>
-    </w:p>
-    <w:p>
-      <w:r>
-        <w:t xml:space="preserve">There are a few solutions </w:t>
-      </w:r>
-      <w:proofErr w:type="gramStart"/>
-      <w:r>
-        <w:t>similar to</w:t>
-      </w:r>
-      <w:proofErr w:type="gramEnd"/>
-      <w:r>
-        <w:t xml:space="preserve"> what I am wanting to do:</w:t>
+      <w:bookmarkEnd w:id="3"/>
+    </w:p>
+    <w:p>
+      <w:r>
+        <w:t>There are a few solutions similar to what I am wanting to do:</w:t>
       </w:r>
     </w:p>
     <w:p>
@@ -1101,15 +1462,7 @@
         <w:t>,</w:t>
       </w:r>
       <w:r>
-        <w:t xml:space="preserve"> A </w:t>
-      </w:r>
-      <w:proofErr w:type="gramStart"/>
-      <w:r>
-        <w:t>block based</w:t>
-      </w:r>
-      <w:proofErr w:type="gramEnd"/>
-      <w:r>
-        <w:t xml:space="preserve"> coding editor that is the basis for multiple well know solutions e.g. </w:t>
+        <w:t xml:space="preserve"> A block based coding editor that is the basis for multiple well know solutions e.g. </w:t>
       </w:r>
       <w:r>
         <w:t xml:space="preserve">scratch </w:t>
@@ -1128,7 +1481,6 @@
         <w:pStyle w:val="ListParagraph"/>
       </w:pPr>
       <w:r>
-        <w:lastRenderedPageBreak/>
         <w:t>Google. (13 May 2012). </w:t>
       </w:r>
       <w:proofErr w:type="spellStart"/>
@@ -1164,9 +1516,9 @@
           <w:noProof/>
         </w:rPr>
         <w:drawing>
-          <wp:inline distT="0" distB="0" distL="0" distR="0" wp14:anchorId="5E715A71" wp14:editId="3DA786E1">
-            <wp:extent cx="5353797" cy="3315163"/>
-            <wp:effectExtent l="0" t="0" r="0" b="0"/>
+          <wp:inline distT="0" distB="0" distL="0" distR="0" wp14:anchorId="5E715A71" wp14:editId="4A7CCCD9">
+            <wp:extent cx="3804920" cy="2356072"/>
+            <wp:effectExtent l="0" t="0" r="5080" b="6350"/>
             <wp:docPr id="289307284" name="Picture 1"/>
             <wp:cNvGraphicFramePr>
               <a:graphicFrameLocks xmlns:a="http://schemas.openxmlformats.org/drawingml/2006/main" noChangeAspect="1"/>
@@ -1179,7 +1531,7 @@
                     <pic:cNvPicPr/>
                   </pic:nvPicPr>
                   <pic:blipFill>
-                    <a:blip r:embed="rId10"/>
+                    <a:blip r:embed="rId8"/>
                     <a:stretch>
                       <a:fillRect/>
                     </a:stretch>
@@ -1187,7 +1539,7 @@
                   <pic:spPr>
                     <a:xfrm>
                       <a:off x="0" y="0"/>
-                      <a:ext cx="5353797" cy="3315163"/>
+                      <a:ext cx="3814486" cy="2361996"/>
                     </a:xfrm>
                     <a:prstGeom prst="rect">
                       <a:avLst/>
@@ -1217,15 +1569,7 @@
         <w:t xml:space="preserve">, </w:t>
       </w:r>
       <w:r>
-        <w:t xml:space="preserve">A </w:t>
-      </w:r>
-      <w:proofErr w:type="gramStart"/>
-      <w:r>
-        <w:t>block based</w:t>
-      </w:r>
-      <w:proofErr w:type="gramEnd"/>
-      <w:r>
-        <w:t xml:space="preserve"> coding editor that has used the </w:t>
+        <w:t xml:space="preserve">A block based coding editor that has used the </w:t>
       </w:r>
       <w:proofErr w:type="spellStart"/>
       <w:r>
@@ -1268,7 +1612,7 @@
           <w:noProof/>
         </w:rPr>
         <w:drawing>
-          <wp:inline distT="0" distB="0" distL="0" distR="0" wp14:anchorId="0636DEEA" wp14:editId="7CF22014">
+          <wp:inline distT="0" distB="0" distL="0" distR="0" wp14:anchorId="0636DEEA" wp14:editId="5EF13DB3">
             <wp:extent cx="3803650" cy="1606416"/>
             <wp:effectExtent l="0" t="0" r="6350" b="0"/>
             <wp:docPr id="710186248" name="Picture 1" descr="A screenshot of a computer program&#10;&#10;AI-generated content may be incorrect."/>
@@ -1283,7 +1627,7 @@
                     <pic:cNvPicPr/>
                   </pic:nvPicPr>
                   <pic:blipFill>
-                    <a:blip r:embed="rId11"/>
+                    <a:blip r:embed="rId9"/>
                     <a:stretch>
                       <a:fillRect/>
                     </a:stretch>
@@ -1291,7 +1635,7 @@
                   <pic:spPr>
                     <a:xfrm>
                       <a:off x="0" y="0"/>
-                      <a:ext cx="3844486" cy="1623662"/>
+                      <a:ext cx="3803650" cy="1606416"/>
                     </a:xfrm>
                     <a:prstGeom prst="rect">
                       <a:avLst/>
@@ -1382,7 +1726,7 @@
                     <pic:cNvPicPr/>
                   </pic:nvPicPr>
                   <pic:blipFill>
-                    <a:blip r:embed="rId12"/>
+                    <a:blip r:embed="rId10"/>
                     <a:stretch>
                       <a:fillRect/>
                     </a:stretch>
@@ -1406,13 +1750,348 @@
     <w:p/>
     <w:p>
       <w:pPr>
+        <w:rPr>
+          <w:sz w:val="32"/>
+          <w:szCs w:val="32"/>
+          <w:u w:val="single"/>
+        </w:rPr>
+      </w:pPr>
+      <w:r>
+        <w:rPr>
+          <w:sz w:val="32"/>
+          <w:szCs w:val="32"/>
+          <w:u w:val="single"/>
+        </w:rPr>
+        <w:t>Pros and cons</w:t>
+      </w:r>
+    </w:p>
+    <w:tbl>
+      <w:tblPr>
+        <w:tblStyle w:val="TableGrid"/>
+        <w:tblW w:w="10774" w:type="dxa"/>
+        <w:tblInd w:w="-856" w:type="dxa"/>
+        <w:tblLook w:val="04A0" w:firstRow="1" w:lastRow="0" w:firstColumn="1" w:lastColumn="0" w:noHBand="0" w:noVBand="1"/>
+      </w:tblPr>
+      <w:tblGrid>
+        <w:gridCol w:w="1702"/>
+        <w:gridCol w:w="4394"/>
+        <w:gridCol w:w="4678"/>
+      </w:tblGrid>
+      <w:tr>
+        <w:tc>
+          <w:tcPr>
+            <w:tcW w:w="1702" w:type="dxa"/>
+          </w:tcPr>
+          <w:p>
+            <w:r>
+              <w:t>Software</w:t>
+            </w:r>
+          </w:p>
+        </w:tc>
+        <w:tc>
+          <w:tcPr>
+            <w:tcW w:w="4394" w:type="dxa"/>
+          </w:tcPr>
+          <w:p>
+            <w:r>
+              <w:t>Pros</w:t>
+            </w:r>
+          </w:p>
+        </w:tc>
+        <w:tc>
+          <w:tcPr>
+            <w:tcW w:w="4678" w:type="dxa"/>
+          </w:tcPr>
+          <w:p>
+            <w:r>
+              <w:t>Cons</w:t>
+            </w:r>
+          </w:p>
+        </w:tc>
+      </w:tr>
+      <w:tr>
+        <w:tc>
+          <w:tcPr>
+            <w:tcW w:w="1702" w:type="dxa"/>
+          </w:tcPr>
+          <w:p>
+            <w:proofErr w:type="spellStart"/>
+            <w:r>
+              <w:t>Blockly</w:t>
+            </w:r>
+            <w:proofErr w:type="spellEnd"/>
+            <w:r>
+              <w:t xml:space="preserve"> </w:t>
+            </w:r>
+          </w:p>
+        </w:tc>
+        <w:tc>
+          <w:tcPr>
+            <w:tcW w:w="4394" w:type="dxa"/>
+          </w:tcPr>
+          <w:p>
+            <w:pPr>
+              <w:pStyle w:val="ListParagraph"/>
+              <w:numPr>
+                <w:ilvl w:val="0"/>
+                <w:numId w:val="1"/>
+              </w:numPr>
+            </w:pPr>
+            <w:r>
+              <w:t>Established code base</w:t>
+            </w:r>
+          </w:p>
+          <w:p>
+            <w:pPr>
+              <w:pStyle w:val="ListParagraph"/>
+              <w:numPr>
+                <w:ilvl w:val="0"/>
+                <w:numId w:val="1"/>
+              </w:numPr>
+            </w:pPr>
+            <w:r>
+              <w:t>Used across multiple platforms and is a trusted basis</w:t>
+            </w:r>
+          </w:p>
+          <w:p>
+            <w:pPr>
+              <w:pStyle w:val="ListParagraph"/>
+              <w:numPr>
+                <w:ilvl w:val="0"/>
+                <w:numId w:val="1"/>
+              </w:numPr>
+            </w:pPr>
+            <w:r>
+              <w:t>Easy to use for beginners</w:t>
+            </w:r>
+          </w:p>
+        </w:tc>
+        <w:tc>
+          <w:tcPr>
+            <w:tcW w:w="4678" w:type="dxa"/>
+          </w:tcPr>
+          <w:p>
+            <w:pPr>
+              <w:pStyle w:val="ListParagraph"/>
+              <w:numPr>
+                <w:ilvl w:val="0"/>
+                <w:numId w:val="1"/>
+              </w:numPr>
+            </w:pPr>
+            <w:r>
+              <w:t>Does not work with Arduino/microcontroller</w:t>
+            </w:r>
+          </w:p>
+          <w:p>
+            <w:pPr>
+              <w:pStyle w:val="ListParagraph"/>
+              <w:numPr>
+                <w:ilvl w:val="0"/>
+                <w:numId w:val="1"/>
+              </w:numPr>
+            </w:pPr>
+            <w:r>
+              <w:t>Older looking interface</w:t>
+            </w:r>
+          </w:p>
+          <w:p>
+            <w:pPr>
+              <w:pStyle w:val="ListParagraph"/>
+              <w:numPr>
+                <w:ilvl w:val="0"/>
+                <w:numId w:val="1"/>
+              </w:numPr>
+            </w:pPr>
+            <w:r>
+              <w:t>It is web based, whereas I would like it to be a standalone app</w:t>
+            </w:r>
+          </w:p>
+        </w:tc>
+      </w:tr>
+      <w:tr>
+        <w:tc>
+          <w:tcPr>
+            <w:tcW w:w="1702" w:type="dxa"/>
+          </w:tcPr>
+          <w:p>
+            <w:proofErr w:type="spellStart"/>
+            <w:r>
+              <w:t>Blocklyduino</w:t>
+            </w:r>
+            <w:proofErr w:type="spellEnd"/>
+          </w:p>
+        </w:tc>
+        <w:tc>
+          <w:tcPr>
+            <w:tcW w:w="4394" w:type="dxa"/>
+          </w:tcPr>
+          <w:p>
+            <w:pPr>
+              <w:pStyle w:val="ListParagraph"/>
+              <w:numPr>
+                <w:ilvl w:val="0"/>
+                <w:numId w:val="1"/>
+              </w:numPr>
+            </w:pPr>
+            <w:r>
+              <w:t xml:space="preserve">Compatible </w:t>
+            </w:r>
+            <w:r>
+              <w:t>with Arduinos</w:t>
+            </w:r>
+          </w:p>
+          <w:p>
+            <w:pPr>
+              <w:pStyle w:val="ListParagraph"/>
+              <w:numPr>
+                <w:ilvl w:val="0"/>
+                <w:numId w:val="1"/>
+              </w:numPr>
+            </w:pPr>
+            <w:r>
+              <w:t xml:space="preserve">Uses </w:t>
+            </w:r>
+            <w:proofErr w:type="spellStart"/>
+            <w:r>
+              <w:t>blockly</w:t>
+            </w:r>
+            <w:proofErr w:type="spellEnd"/>
+            <w:r>
+              <w:t xml:space="preserve"> as a basis for the coding element</w:t>
+            </w:r>
+          </w:p>
+        </w:tc>
+        <w:tc>
+          <w:tcPr>
+            <w:tcW w:w="4678" w:type="dxa"/>
+          </w:tcPr>
+          <w:p>
+            <w:pPr>
+              <w:pStyle w:val="ListParagraph"/>
+              <w:numPr>
+                <w:ilvl w:val="0"/>
+                <w:numId w:val="1"/>
+              </w:numPr>
+            </w:pPr>
+            <w:r>
+              <w:t>Is natively web based, so cannot run as a standalone app</w:t>
+            </w:r>
+          </w:p>
+          <w:p>
+            <w:pPr>
+              <w:pStyle w:val="ListParagraph"/>
+              <w:numPr>
+                <w:ilvl w:val="0"/>
+                <w:numId w:val="1"/>
+              </w:numPr>
+            </w:pPr>
+            <w:r>
+              <w:t>Requires the Arduino cli to be installed</w:t>
+            </w:r>
+          </w:p>
+        </w:tc>
+      </w:tr>
+      <w:tr>
+        <w:tc>
+          <w:tcPr>
+            <w:tcW w:w="1702" w:type="dxa"/>
+          </w:tcPr>
+          <w:p>
+            <w:proofErr w:type="spellStart"/>
+            <w:r>
+              <w:t>mBlock</w:t>
+            </w:r>
+            <w:proofErr w:type="spellEnd"/>
+          </w:p>
+        </w:tc>
+        <w:tc>
+          <w:tcPr>
+            <w:tcW w:w="4394" w:type="dxa"/>
+          </w:tcPr>
+          <w:p>
+            <w:pPr>
+              <w:pStyle w:val="ListParagraph"/>
+              <w:numPr>
+                <w:ilvl w:val="0"/>
+                <w:numId w:val="1"/>
+              </w:numPr>
+            </w:pPr>
+            <w:r>
+              <w:t xml:space="preserve">Is a fully build web </w:t>
+            </w:r>
+            <w:r>
+              <w:t>block-based coding editor</w:t>
+            </w:r>
+          </w:p>
+          <w:p>
+            <w:pPr>
+              <w:pStyle w:val="ListParagraph"/>
+              <w:numPr>
+                <w:ilvl w:val="0"/>
+                <w:numId w:val="1"/>
+              </w:numPr>
+            </w:pPr>
+            <w:r>
+              <w:t xml:space="preserve">Allows for devices to connect and upload code natively </w:t>
+            </w:r>
+          </w:p>
+        </w:tc>
+        <w:tc>
+          <w:tcPr>
+            <w:tcW w:w="4678" w:type="dxa"/>
+          </w:tcPr>
+          <w:p>
+            <w:pPr>
+              <w:pStyle w:val="ListParagraph"/>
+              <w:numPr>
+                <w:ilvl w:val="0"/>
+                <w:numId w:val="1"/>
+              </w:numPr>
+            </w:pPr>
+            <w:r>
+              <w:t xml:space="preserve">Requires that you use </w:t>
+            </w:r>
+            <w:proofErr w:type="spellStart"/>
+            <w:r>
+              <w:t>there</w:t>
+            </w:r>
+            <w:proofErr w:type="spellEnd"/>
+            <w:r>
+              <w:t xml:space="preserve"> hardware only</w:t>
+            </w:r>
+          </w:p>
+          <w:p>
+            <w:pPr>
+              <w:pStyle w:val="ListParagraph"/>
+              <w:numPr>
+                <w:ilvl w:val="0"/>
+                <w:numId w:val="1"/>
+              </w:numPr>
+            </w:pPr>
+            <w:r>
+              <w:t>Only runs in the browser, whereas I would want it to be a</w:t>
+            </w:r>
+            <w:r>
+              <w:t>n</w:t>
+            </w:r>
+            <w:r>
+              <w:t xml:space="preserve"> app </w:t>
+            </w:r>
+          </w:p>
+        </w:tc>
+      </w:tr>
+    </w:tbl>
+    <w:p/>
+    <w:p/>
+    <w:p>
+      <w:pPr>
         <w:pStyle w:val="Heading2"/>
       </w:pPr>
-      <w:bookmarkStart w:id="9" w:name="_Toc209800702"/>
+      <w:bookmarkStart w:id="4" w:name="_Toc213244603"/>
       <w:r>
         <w:t>Key features</w:t>
       </w:r>
-      <w:bookmarkEnd w:id="9"/>
+      <w:bookmarkEnd w:id="4"/>
       <w:r>
         <w:t xml:space="preserve"> </w:t>
       </w:r>
@@ -1689,6 +2368,45 @@
           </w:p>
         </w:tc>
       </w:tr>
+      <w:tr>
+        <w:trPr>
+          <w:cnfStyle w:val="000000100000" w:firstRow="0" w:lastRow="0" w:firstColumn="0" w:lastColumn="0" w:oddVBand="0" w:evenVBand="0" w:oddHBand="1" w:evenHBand="0" w:firstRowFirstColumn="0" w:firstRowLastColumn="0" w:lastRowFirstColumn="0" w:lastRowLastColumn="0"/>
+        </w:trPr>
+        <w:tc>
+          <w:tcPr>
+            <w:cnfStyle w:val="001000000000" w:firstRow="0" w:lastRow="0" w:firstColumn="1" w:lastColumn="0" w:oddVBand="0" w:evenVBand="0" w:oddHBand="0" w:evenHBand="0" w:firstRowFirstColumn="0" w:firstRowLastColumn="0" w:lastRowFirstColumn="0" w:lastRowLastColumn="0"/>
+            <w:tcW w:w="4508" w:type="dxa"/>
+          </w:tcPr>
+          <w:p>
+            <w:r>
+              <w:t xml:space="preserve">Compiling and uploading the code to the </w:t>
+            </w:r>
+            <w:proofErr w:type="spellStart"/>
+            <w:r>
+              <w:t>arduino</w:t>
+            </w:r>
+            <w:proofErr w:type="spellEnd"/>
+          </w:p>
+        </w:tc>
+        <w:tc>
+          <w:tcPr>
+            <w:tcW w:w="4508" w:type="dxa"/>
+          </w:tcPr>
+          <w:p>
+            <w:pPr>
+              <w:cnfStyle w:val="000000100000" w:firstRow="0" w:lastRow="0" w:firstColumn="0" w:lastColumn="0" w:oddVBand="0" w:evenVBand="0" w:oddHBand="1" w:evenHBand="0" w:firstRowFirstColumn="0" w:firstRowLastColumn="0" w:lastRowFirstColumn="0" w:lastRowLastColumn="0"/>
+            </w:pPr>
+            <w:r>
+              <w:t xml:space="preserve">To allow the user to compile the code and download it to the </w:t>
+            </w:r>
+            <w:proofErr w:type="spellStart"/>
+            <w:r>
+              <w:t>arduino</w:t>
+            </w:r>
+            <w:proofErr w:type="spellEnd"/>
+          </w:p>
+        </w:tc>
+      </w:tr>
     </w:tbl>
     <w:p/>
     <w:p/>
@@ -1703,25 +2421,10 @@
         <w:t xml:space="preserve">application have a usable GUI. </w:t>
       </w:r>
       <w:r>
-        <w:t xml:space="preserve">There are multiple different options to create windows within rust, </w:t>
-      </w:r>
-      <w:r>
-        <w:lastRenderedPageBreak/>
-        <w:t xml:space="preserve">each has a different use case. </w:t>
-      </w:r>
-      <w:r>
-        <w:t xml:space="preserve">By searching for Rust Gui libraries, </w:t>
-      </w:r>
-      <w:commentRangeStart w:id="10"/>
-      <w:r>
-        <w:t>I have narrowed it down to:</w:t>
-      </w:r>
-      <w:commentRangeEnd w:id="10"/>
-      <w:r>
-        <w:rPr>
-          <w:rStyle w:val="CommentReference"/>
-        </w:rPr>
-        <w:commentReference w:id="10"/>
+        <w:t xml:space="preserve">There are multiple different options to create windows within rust, each has a different use case. </w:t>
+      </w:r>
+      <w:r>
+        <w:t>By searching for Rust Gui libraries, I have narrowed it down to:</w:t>
       </w:r>
     </w:p>
     <w:p>
@@ -1732,14 +2435,14 @@
           <w:numId w:val="2"/>
         </w:numPr>
       </w:pPr>
-      <w:bookmarkStart w:id="11" w:name="_Toc209173205"/>
+      <w:bookmarkStart w:id="5" w:name="_Toc209173205"/>
       <w:r>
         <w:t>Egui</w:t>
       </w:r>
       <w:r>
         <w:t>, a window framework centred around simplicity and portability</w:t>
       </w:r>
-      <w:bookmarkEnd w:id="11"/>
+      <w:bookmarkEnd w:id="5"/>
     </w:p>
     <w:p>
       <w:pPr>
@@ -1870,6 +2573,315 @@
       </w:r>
     </w:p>
     <w:p/>
+    <w:p/>
+    <w:p/>
+    <w:p/>
+    <w:p/>
+    <w:tbl>
+      <w:tblPr>
+        <w:tblStyle w:val="TableGrid"/>
+        <w:tblW w:w="0" w:type="auto"/>
+        <w:tblLook w:val="04A0" w:firstRow="1" w:lastRow="0" w:firstColumn="1" w:lastColumn="0" w:noHBand="0" w:noVBand="1"/>
+      </w:tblPr>
+      <w:tblGrid>
+        <w:gridCol w:w="3005"/>
+        <w:gridCol w:w="3005"/>
+        <w:gridCol w:w="3006"/>
+      </w:tblGrid>
+      <w:tr>
+        <w:tc>
+          <w:tcPr>
+            <w:tcW w:w="3005" w:type="dxa"/>
+          </w:tcPr>
+          <w:p>
+            <w:r>
+              <w:lastRenderedPageBreak/>
+              <w:t>Framework</w:t>
+            </w:r>
+          </w:p>
+        </w:tc>
+        <w:tc>
+          <w:tcPr>
+            <w:tcW w:w="3005" w:type="dxa"/>
+          </w:tcPr>
+          <w:p>
+            <w:r>
+              <w:t>Pros</w:t>
+            </w:r>
+          </w:p>
+        </w:tc>
+        <w:tc>
+          <w:tcPr>
+            <w:tcW w:w="3006" w:type="dxa"/>
+          </w:tcPr>
+          <w:p>
+            <w:r>
+              <w:t>Cons</w:t>
+            </w:r>
+          </w:p>
+        </w:tc>
+      </w:tr>
+      <w:tr>
+        <w:tc>
+          <w:tcPr>
+            <w:tcW w:w="3005" w:type="dxa"/>
+          </w:tcPr>
+          <w:p>
+            <w:r>
+              <w:t>Egui</w:t>
+            </w:r>
+          </w:p>
+        </w:tc>
+        <w:tc>
+          <w:tcPr>
+            <w:tcW w:w="3005" w:type="dxa"/>
+          </w:tcPr>
+          <w:p>
+            <w:pPr>
+              <w:pStyle w:val="ListParagraph"/>
+              <w:numPr>
+                <w:ilvl w:val="0"/>
+                <w:numId w:val="2"/>
+              </w:numPr>
+            </w:pPr>
+            <w:r>
+              <w:t>Most beginner friendly</w:t>
+            </w:r>
+            <w:r>
+              <w:t xml:space="preserve"> for new user of rust</w:t>
+            </w:r>
+          </w:p>
+          <w:p>
+            <w:pPr>
+              <w:pStyle w:val="ListParagraph"/>
+              <w:numPr>
+                <w:ilvl w:val="0"/>
+                <w:numId w:val="2"/>
+              </w:numPr>
+            </w:pPr>
+            <w:r>
+              <w:t xml:space="preserve">Is cross platform and will work with any </w:t>
+            </w:r>
+            <w:proofErr w:type="spellStart"/>
+            <w:r>
+              <w:t>os</w:t>
+            </w:r>
+            <w:proofErr w:type="spellEnd"/>
+          </w:p>
+          <w:p>
+            <w:pPr>
+              <w:pStyle w:val="ListParagraph"/>
+              <w:numPr>
+                <w:ilvl w:val="0"/>
+                <w:numId w:val="2"/>
+              </w:numPr>
+            </w:pPr>
+            <w:r>
+              <w:t>It is a lightweight</w:t>
+            </w:r>
+            <w:r>
+              <w:t xml:space="preserve"> so it does not use much system memory</w:t>
+            </w:r>
+          </w:p>
+        </w:tc>
+        <w:tc>
+          <w:tcPr>
+            <w:tcW w:w="3006" w:type="dxa"/>
+          </w:tcPr>
+          <w:p>
+            <w:pPr>
+              <w:pStyle w:val="ListParagraph"/>
+              <w:numPr>
+                <w:ilvl w:val="0"/>
+                <w:numId w:val="2"/>
+              </w:numPr>
+            </w:pPr>
+            <w:r>
+              <w:t>The lightweight feel decreases as the size of the program increases</w:t>
+            </w:r>
+          </w:p>
+          <w:p>
+            <w:pPr>
+              <w:pStyle w:val="ListParagraph"/>
+              <w:numPr>
+                <w:ilvl w:val="0"/>
+                <w:numId w:val="2"/>
+              </w:numPr>
+            </w:pPr>
+            <w:r>
+              <w:t xml:space="preserve">The theme of the framework is non-native looking so it does not match any one </w:t>
+            </w:r>
+            <w:proofErr w:type="spellStart"/>
+            <w:r>
+              <w:t>os</w:t>
+            </w:r>
+            <w:proofErr w:type="spellEnd"/>
+            <w:r>
+              <w:t xml:space="preserve"> </w:t>
+            </w:r>
+          </w:p>
+        </w:tc>
+      </w:tr>
+      <w:tr>
+        <w:tc>
+          <w:tcPr>
+            <w:tcW w:w="3005" w:type="dxa"/>
+          </w:tcPr>
+          <w:p>
+            <w:r>
+              <w:t>Slint</w:t>
+            </w:r>
+          </w:p>
+        </w:tc>
+        <w:tc>
+          <w:tcPr>
+            <w:tcW w:w="3005" w:type="dxa"/>
+          </w:tcPr>
+          <w:p>
+            <w:pPr>
+              <w:pStyle w:val="ListParagraph"/>
+              <w:numPr>
+                <w:ilvl w:val="0"/>
+                <w:numId w:val="2"/>
+              </w:numPr>
+            </w:pPr>
+            <w:r>
+              <w:t>Framework is actively developed so it will always be up to date</w:t>
+            </w:r>
+          </w:p>
+          <w:p>
+            <w:pPr>
+              <w:pStyle w:val="ListParagraph"/>
+              <w:numPr>
+                <w:ilvl w:val="0"/>
+                <w:numId w:val="2"/>
+              </w:numPr>
+            </w:pPr>
+            <w:r>
+              <w:t>Has consistent design across any platform</w:t>
+            </w:r>
+          </w:p>
+        </w:tc>
+        <w:tc>
+          <w:tcPr>
+            <w:tcW w:w="3006" w:type="dxa"/>
+          </w:tcPr>
+          <w:p>
+            <w:pPr>
+              <w:pStyle w:val="ListParagraph"/>
+              <w:numPr>
+                <w:ilvl w:val="0"/>
+                <w:numId w:val="2"/>
+              </w:numPr>
+            </w:pPr>
+            <w:r>
+              <w:t>Has a limited ecosystem compared to other frameworks</w:t>
+            </w:r>
+          </w:p>
+          <w:p>
+            <w:pPr>
+              <w:pStyle w:val="ListParagraph"/>
+              <w:numPr>
+                <w:ilvl w:val="0"/>
+                <w:numId w:val="2"/>
+              </w:numPr>
+            </w:pPr>
+            <w:r>
+              <w:t xml:space="preserve">Has a smaller </w:t>
+            </w:r>
+            <w:r>
+              <w:t>following compared to other frameworks</w:t>
+            </w:r>
+          </w:p>
+        </w:tc>
+      </w:tr>
+      <w:tr>
+        <w:tc>
+          <w:tcPr>
+            <w:tcW w:w="3005" w:type="dxa"/>
+          </w:tcPr>
+          <w:p>
+            <w:proofErr w:type="spellStart"/>
+            <w:r>
+              <w:t>Gtk-rs</w:t>
+            </w:r>
+            <w:proofErr w:type="spellEnd"/>
+          </w:p>
+        </w:tc>
+        <w:tc>
+          <w:tcPr>
+            <w:tcW w:w="3005" w:type="dxa"/>
+          </w:tcPr>
+          <w:p>
+            <w:pPr>
+              <w:pStyle w:val="ListParagraph"/>
+              <w:numPr>
+                <w:ilvl w:val="0"/>
+                <w:numId w:val="2"/>
+              </w:numPr>
+            </w:pPr>
+            <w:r>
+              <w:t xml:space="preserve">Has a large range of widget </w:t>
+            </w:r>
+            <w:r>
+              <w:t>libraries for expandable</w:t>
+            </w:r>
+            <w:r>
+              <w:t xml:space="preserve"> GUIs</w:t>
+            </w:r>
+          </w:p>
+          <w:p>
+            <w:pPr>
+              <w:pStyle w:val="ListParagraph"/>
+              <w:numPr>
+                <w:ilvl w:val="0"/>
+                <w:numId w:val="2"/>
+              </w:numPr>
+            </w:pPr>
+            <w:r>
+              <w:t>Stable ecosystem that is used across multiple industries</w:t>
+            </w:r>
+          </w:p>
+        </w:tc>
+        <w:tc>
+          <w:tcPr>
+            <w:tcW w:w="3006" w:type="dxa"/>
+          </w:tcPr>
+          <w:p>
+            <w:pPr>
+              <w:pStyle w:val="ListParagraph"/>
+              <w:numPr>
+                <w:ilvl w:val="0"/>
+                <w:numId w:val="2"/>
+              </w:numPr>
+            </w:pPr>
+            <w:r>
+              <w:t xml:space="preserve">Has a complex code system </w:t>
+            </w:r>
+          </w:p>
+          <w:p>
+            <w:pPr>
+              <w:pStyle w:val="ListParagraph"/>
+              <w:numPr>
+                <w:ilvl w:val="0"/>
+                <w:numId w:val="2"/>
+              </w:numPr>
+            </w:pPr>
+            <w:r>
+              <w:t xml:space="preserve">Has an inconsistent </w:t>
+            </w:r>
+            <w:r>
+              <w:t>performance across different platforms</w:t>
+            </w:r>
+          </w:p>
+        </w:tc>
+      </w:tr>
+    </w:tbl>
+    <w:p/>
+    <w:p/>
+    <w:p/>
+    <w:p/>
+    <w:p/>
     <w:p>
       <w:r>
         <w:t xml:space="preserve">From these libraries </w:t>
@@ -1904,13 +2916,8 @@
       <w:r>
         <w:t xml:space="preserve">to use the inbuilt </w:t>
       </w:r>
-      <w:proofErr w:type="gramStart"/>
-      <w:r>
-        <w:t>std::</w:t>
-      </w:r>
-      <w:proofErr w:type="gramEnd"/>
-      <w:r>
-        <w:t xml:space="preserve">io </w:t>
+      <w:r>
+        <w:t xml:space="preserve">std::io </w:t>
       </w:r>
       <w:r>
         <w:t xml:space="preserve">library that is inbuilt into </w:t>
@@ -1958,18 +2965,14 @@
         <w:t>code will be able to compiled and sent to the Arduino.</w:t>
       </w:r>
       <w:r>
-        <w:t xml:space="preserve"> This library will allow me to read each block from the Json file and allow me to have the show attributes. T</w:t>
-      </w:r>
-      <w:r>
-        <w:t xml:space="preserve">o use Json </w:t>
-      </w:r>
-      <w:proofErr w:type="gramStart"/>
-      <w:r>
-        <w:t>files</w:t>
-      </w:r>
-      <w:proofErr w:type="gramEnd"/>
-      <w:r>
-        <w:t xml:space="preserve"> I am going to </w:t>
+        <w:t xml:space="preserve"> This </w:t>
+      </w:r>
+      <w:r>
+        <w:lastRenderedPageBreak/>
+        <w:t>library will allow me to read each block from the Json file and allow me to have the show attributes. T</w:t>
+      </w:r>
+      <w:r>
+        <w:t xml:space="preserve">o use Json files I am going to </w:t>
       </w:r>
       <w:r>
         <w:t xml:space="preserve">use </w:t>
@@ -2035,11 +3038,10 @@
         <w:rPr>
           <w:noProof/>
         </w:rPr>
-        <w:lastRenderedPageBreak/>
         <w:drawing>
-          <wp:inline distT="0" distB="0" distL="0" distR="0" wp14:anchorId="7A8E0802" wp14:editId="10D35E6C">
-            <wp:extent cx="4946650" cy="3434462"/>
-            <wp:effectExtent l="0" t="0" r="6350" b="0"/>
+          <wp:inline distT="0" distB="0" distL="0" distR="0" wp14:anchorId="7A8E0802" wp14:editId="3AB54D73">
+            <wp:extent cx="2871811" cy="1993900"/>
+            <wp:effectExtent l="0" t="0" r="5080" b="6350"/>
             <wp:docPr id="1131500693" name="Picture 2"/>
             <wp:cNvGraphicFramePr>
               <a:graphicFrameLocks xmlns:a="http://schemas.openxmlformats.org/drawingml/2006/main" noChangeAspect="1"/>
@@ -2052,7 +3054,7 @@
                     <pic:cNvPicPr/>
                   </pic:nvPicPr>
                   <pic:blipFill rotWithShape="1">
-                    <a:blip r:embed="rId13" cstate="print">
+                    <a:blip r:embed="rId11" cstate="print">
                       <a:extLst>
                         <a:ext uri="{28A0092B-C50C-407E-A947-70E740481C1C}">
                           <a14:useLocalDpi xmlns:a14="http://schemas.microsoft.com/office/drawing/2010/main" val="0"/>
@@ -2067,7 +3069,7 @@
                   <pic:spPr bwMode="auto">
                     <a:xfrm>
                       <a:off x="0" y="0"/>
-                      <a:ext cx="4956313" cy="3441171"/>
+                      <a:ext cx="2881180" cy="2000405"/>
                     </a:xfrm>
                     <a:prstGeom prst="rect">
                       <a:avLst/>
@@ -2098,259 +3100,378 @@
       <w:pPr>
         <w:pStyle w:val="Heading2"/>
       </w:pPr>
-      <w:bookmarkStart w:id="12" w:name="_Toc209800703"/>
-      <w:commentRangeStart w:id="13"/>
+      <w:bookmarkStart w:id="6" w:name="_Toc213244604"/>
       <w:r>
         <w:t>Stake</w:t>
       </w:r>
       <w:r>
         <w:t>holder</w:t>
       </w:r>
-      <w:bookmarkEnd w:id="12"/>
-      <w:commentRangeEnd w:id="13"/>
+      <w:bookmarkEnd w:id="6"/>
+    </w:p>
+    <w:p>
+      <w:r>
+        <w:t xml:space="preserve">For this project I decided to contact </w:t>
+      </w:r>
+      <w:r>
+        <w:t>Mr Turner,</w:t>
+      </w:r>
+      <w:r>
+        <w:t xml:space="preserve"> </w:t>
+      </w:r>
+      <w:r>
+        <w:t xml:space="preserve">Head of Computing/Electronics/DT/Food, I have chosen to contact him as he has experience both using Arduinos but also </w:t>
+      </w:r>
+      <w:r>
+        <w:t>has some experience coding as</w:t>
+      </w:r>
+      <w:r>
+        <w:t xml:space="preserve"> </w:t>
+      </w:r>
+      <w:r>
+        <w:t>well</w:t>
+      </w:r>
+      <w:r>
+        <w:t xml:space="preserve">. This </w:t>
+      </w:r>
+      <w:r>
+        <w:t xml:space="preserve">will allow me to gain insight into what he would want to be able to teach </w:t>
+      </w:r>
+      <w:r>
+        <w:t>KS3 student about Arduinos and begin to teach them how to code and use them</w:t>
+      </w:r>
+      <w:r>
+        <w:t xml:space="preserve">. </w:t>
+      </w:r>
+      <w:r>
+        <w:t xml:space="preserve">I have also chosen him as </w:t>
+      </w:r>
+      <w:r>
+        <w:t>I see him on a regular basis within school, allowing me to catch up and discuss ideas with him often</w:t>
+      </w:r>
+      <w:r>
+        <w:t xml:space="preserve">. </w:t>
+      </w:r>
+      <w:r>
+        <w:t>Th</w:t>
+      </w:r>
+      <w:r>
+        <w:t xml:space="preserve">roughout this project I will have discussions with him to find out </w:t>
+      </w:r>
+      <w:r>
+        <w:t xml:space="preserve">what students would want when coding and using an Arduino so that they have the most </w:t>
+      </w:r>
+      <w:r>
+        <w:t>tailored experience</w:t>
+      </w:r>
+      <w:r>
+        <w:t xml:space="preserve">. </w:t>
+      </w:r>
+    </w:p>
+    <w:p>
+      <w:pPr>
+        <w:pStyle w:val="Heading1"/>
+      </w:pPr>
+      <w:bookmarkStart w:id="7" w:name="_Toc213244605"/>
       <w:r>
         <w:rPr>
-          <w:rStyle w:val="CommentReference"/>
-          <w:rFonts w:asciiTheme="minorHAnsi" w:eastAsiaTheme="minorHAnsi" w:hAnsiTheme="minorHAnsi" w:cstheme="minorBidi"/>
-          <w:color w:val="auto"/>
+          <w:noProof/>
         </w:rPr>
-        <w:commentReference w:id="13"/>
-      </w:r>
-    </w:p>
-    <w:p>
-      <w:r>
-        <w:t xml:space="preserve">For this project I decided to contact the </w:t>
-      </w:r>
-      <w:r>
-        <w:t xml:space="preserve">Head of Computing/Electronics/DT/Food, I have chosen to contact him as he has experience both using Arduinos but also </w:t>
-      </w:r>
-      <w:r>
-        <w:t>has some experience coding as</w:t>
-      </w:r>
+        <w:drawing>
+          <wp:anchor distT="0" distB="0" distL="114300" distR="114300" simplePos="0" relativeHeight="251658240" behindDoc="0" locked="0" layoutInCell="1" allowOverlap="1" wp14:anchorId="7AEF8537" wp14:editId="4377A07B">
+            <wp:simplePos x="0" y="0"/>
+            <wp:positionH relativeFrom="page">
+              <wp:posOffset>69850</wp:posOffset>
+            </wp:positionH>
+            <wp:positionV relativeFrom="paragraph">
+              <wp:posOffset>441325</wp:posOffset>
+            </wp:positionV>
+            <wp:extent cx="7445957" cy="3059723"/>
+            <wp:effectExtent l="0" t="0" r="3175" b="7620"/>
+            <wp:wrapNone/>
+            <wp:docPr id="838251383" name="Picture 1" descr="A diagram of a company&#10;&#10;AI-generated content may be incorrect."/>
+            <wp:cNvGraphicFramePr>
+              <a:graphicFrameLocks xmlns:a="http://schemas.openxmlformats.org/drawingml/2006/main" noChangeAspect="1"/>
+            </wp:cNvGraphicFramePr>
+            <a:graphic xmlns:a="http://schemas.openxmlformats.org/drawingml/2006/main">
+              <a:graphicData uri="http://schemas.openxmlformats.org/drawingml/2006/picture">
+                <pic:pic xmlns:pic="http://schemas.openxmlformats.org/drawingml/2006/picture">
+                  <pic:nvPicPr>
+                    <pic:cNvPr id="838251383" name="Picture 1" descr="A diagram of a company&#10;&#10;AI-generated content may be incorrect."/>
+                    <pic:cNvPicPr/>
+                  </pic:nvPicPr>
+                  <pic:blipFill rotWithShape="1">
+                    <a:blip r:embed="rId12">
+                      <a:extLst>
+                        <a:ext uri="{28A0092B-C50C-407E-A947-70E740481C1C}">
+                          <a14:useLocalDpi xmlns:a14="http://schemas.microsoft.com/office/drawing/2010/main" val="0"/>
+                        </a:ext>
+                      </a:extLst>
+                    </a:blip>
+                    <a:srcRect t="1592"/>
+                    <a:stretch>
+                      <a:fillRect/>
+                    </a:stretch>
+                  </pic:blipFill>
+                  <pic:spPr bwMode="auto">
+                    <a:xfrm>
+                      <a:off x="0" y="0"/>
+                      <a:ext cx="7445957" cy="3059723"/>
+                    </a:xfrm>
+                    <a:prstGeom prst="rect">
+                      <a:avLst/>
+                    </a:prstGeom>
+                    <a:ln>
+                      <a:noFill/>
+                    </a:ln>
+                    <a:extLst>
+                      <a:ext uri="{53640926-AAD7-44D8-BBD7-CCE9431645EC}">
+                        <a14:shadowObscured xmlns:a14="http://schemas.microsoft.com/office/drawing/2010/main"/>
+                      </a:ext>
+                    </a:extLst>
+                  </pic:spPr>
+                </pic:pic>
+              </a:graphicData>
+            </a:graphic>
+            <wp14:sizeRelH relativeFrom="margin">
+              <wp14:pctWidth>0</wp14:pctWidth>
+            </wp14:sizeRelH>
+            <wp14:sizeRelV relativeFrom="margin">
+              <wp14:pctHeight>0</wp14:pctHeight>
+            </wp14:sizeRelV>
+          </wp:anchor>
+        </w:drawing>
+      </w:r>
+      <w:r>
+        <w:t>Design</w:t>
+      </w:r>
+      <w:bookmarkEnd w:id="7"/>
+    </w:p>
+    <w:p/>
+    <w:p/>
+    <w:p/>
+    <w:p/>
+    <w:p/>
+    <w:p/>
+    <w:p/>
+    <w:p>
+      <w:r>
+        <w:t xml:space="preserve">For this program to be available to </w:t>
+      </w:r>
+      <w:r>
+        <w:t xml:space="preserve">as many students as possible this program will have to work on as wide a range of </w:t>
+      </w:r>
+      <w:r>
+        <w:t xml:space="preserve">devices of different specifications as possible. Normally </w:t>
+      </w:r>
+      <w:r>
+        <w:t xml:space="preserve">the program will work on the machines within school, they are </w:t>
+      </w:r>
+      <w:r>
+        <w:t xml:space="preserve">Dell OptiPlex </w:t>
+      </w:r>
+      <w:r>
+        <w:t xml:space="preserve">3280 AIO computers with </w:t>
+      </w:r>
+      <w:r>
+        <w:t xml:space="preserve">Intel core I3 10100T CPU and 8GB of RAM with integrated </w:t>
+      </w:r>
+      <w:r>
+        <w:t>Intel UHD graphics 630</w:t>
+      </w:r>
+      <w:r>
+        <w:t xml:space="preserve">. </w:t>
+      </w:r>
+    </w:p>
+    <w:p/>
+    <w:p>
+      <w:pPr>
+        <w:pStyle w:val="Heading1"/>
+      </w:pPr>
+      <w:bookmarkStart w:id="8" w:name="_Toc213244606"/>
+      <w:r>
+        <w:t>Sprint</w:t>
+      </w:r>
+      <w:r>
+        <w:t>s</w:t>
+      </w:r>
+      <w:r>
+        <w:t>:</w:t>
+      </w:r>
+      <w:bookmarkEnd w:id="8"/>
+    </w:p>
+    <w:p>
+      <w:pPr>
+        <w:pStyle w:val="Heading2"/>
+      </w:pPr>
+      <w:bookmarkStart w:id="9" w:name="_Toc213244607"/>
+      <w:r>
+        <w:t>Sprint 1</w:t>
+      </w:r>
+      <w:bookmarkEnd w:id="9"/>
       <w:r>
         <w:t xml:space="preserve"> </w:t>
       </w:r>
-      <w:r>
-        <w:t>well</w:t>
-      </w:r>
-      <w:r>
-        <w:t xml:space="preserve">. This </w:t>
-      </w:r>
-      <w:r>
-        <w:t xml:space="preserve">will allow me to gain insight into what he would want to be able to teach </w:t>
-      </w:r>
-      <w:r>
-        <w:t>KS3 student about Arduinos and begin to teach them how to code and use them</w:t>
-      </w:r>
-      <w:r>
-        <w:t xml:space="preserve">. </w:t>
-      </w:r>
-      <w:r>
-        <w:t xml:space="preserve">I have also chosen him as </w:t>
-      </w:r>
-      <w:r>
-        <w:t>I see him on a regular basis within school, allowing me to catch up and discuss ideas with him often</w:t>
+    </w:p>
+    <w:p>
+      <w:r>
+        <w:t xml:space="preserve">For my first sprint </w:t>
+      </w:r>
+      <w:r>
+        <w:t>I</w:t>
+      </w:r>
+      <w:r>
+        <w:t xml:space="preserve"> am going to o</w:t>
+      </w:r>
+      <w:r>
+        <w:t>pen window</w:t>
+      </w:r>
+    </w:p>
+    <w:p>
+      <w:pPr>
+        <w:pStyle w:val="Heading1"/>
+      </w:pPr>
+      <w:bookmarkStart w:id="10" w:name="_Toc213244608"/>
+      <w:r>
+        <w:t>To Do:</w:t>
+      </w:r>
+      <w:bookmarkEnd w:id="10"/>
+    </w:p>
+    <w:p>
+      <w:r>
+        <w:t>Begin sprint 1: opening a window</w:t>
+      </w:r>
+      <w:r>
+        <w:t xml:space="preserve"> -&gt; analysis -&gt; design + success criteria -&gt; develop -&gt; test -&gt; evaluate</w:t>
       </w:r>
     </w:p>
     <w:p/>
     <w:p>
-      <w:pPr>
-        <w:pStyle w:val="Heading1"/>
-      </w:pPr>
-      <w:bookmarkStart w:id="14" w:name="_Toc209800704"/>
-      <w:r>
-        <w:t>To Do:</w:t>
-      </w:r>
-      <w:bookmarkEnd w:id="14"/>
-    </w:p>
-    <w:p>
-      <w:pPr>
-        <w:rPr>
-          <w:i/>
-          <w:iCs/>
-        </w:rPr>
-      </w:pPr>
-      <w:r>
-        <w:rPr>
-          <w:i/>
-          <w:iCs/>
-        </w:rPr>
-        <w:t>Email Mr turner!!!</w:t>
+      <w:r>
+        <w:t>Analysis</w:t>
+      </w:r>
+      <w:r>
+        <w:t>+</w:t>
+      </w:r>
+      <w:r>
+        <w:t xml:space="preserve">intro+justification, </w:t>
+      </w:r>
+      <w:r>
+        <w:t xml:space="preserve">success criteria, tests, </w:t>
+      </w:r>
+      <w:r>
+        <w:t xml:space="preserve">design, development, test results, </w:t>
+      </w:r>
+      <w:r>
+        <w:t>evaluation</w:t>
+      </w:r>
+      <w:r>
+        <w:t xml:space="preserve">  </w:t>
       </w:r>
     </w:p>
     <w:sectPr>
+      <w:headerReference w:type="default" r:id="rId13"/>
       <w:pgSz w:w="11906" w:h="16838"/>
       <w:pgMar w:top="1440" w:right="1440" w:bottom="1440" w:left="1440" w:header="708" w:footer="708" w:gutter="0"/>
       <w:cols w:space="708"/>
+      <w:titlePg/>
       <w:docGrid w:linePitch="360"/>
     </w:sectPr>
   </w:body>
 </w:document>
 </file>
 
-<file path=word/comments.xml><?xml version="1.0" encoding="utf-8"?>
-<w:comments xmlns:wpc="http://schemas.microsoft.com/office/word/2010/wordprocessingCanvas" xmlns:cx="http://schemas.microsoft.com/office/drawing/2014/chartex" xmlns:cx1="http://schemas.microsoft.com/office/drawing/2015/9/8/chartex" xmlns:cx2="http://schemas.microsoft.com/office/drawing/2015/10/21/chartex" xmlns:cx3="http://schemas.microsoft.com/office/drawing/2016/5/9/chartex" xmlns:cx4="http://schemas.microsoft.com/office/drawing/2016/5/10/chartex" xmlns:cx5="http://schemas.microsoft.com/office/drawing/2016/5/11/chartex" xmlns:cx6="http://schemas.microsoft.com/office/drawing/2016/5/12/chartex" xmlns:cx7="http://schemas.microsoft.com/office/drawing/2016/5/13/chartex" xmlns:cx8="http://schemas.microsoft.com/office/drawing/2016/5/14/chartex" xmlns:mc="http://schemas.openxmlformats.org/markup-compatibility/2006" xmlns:aink="http://schemas.microsoft.com/office/drawing/2016/ink" xmlns:am3d="http://schemas.microsoft.com/office/drawing/2017/model3d" xmlns:o="urn:schemas-microsoft-com:office:office" xmlns:oel="http://schemas.microsoft.com/office/2019/extlst" xmlns:r="http://schemas.openxmlformats.org/officeDocument/2006/relationships" xmlns:m="http://schemas.openxmlformats.org/officeDocument/2006/math" xmlns:v="urn:schemas-microsoft-com:vml" xmlns:wp14="http://schemas.microsoft.com/office/word/2010/wordprocessingDrawing" xmlns:wp="http://schemas.openxmlformats.org/drawingml/2006/wordprocessingDrawing" xmlns:w10="urn:schemas-microsoft-com:office:word" xmlns:w="http://schemas.openxmlformats.org/wordprocessingml/2006/main" xmlns:w14="http://schemas.microsoft.com/office/word/2010/wordml" xmlns:w15="http://schemas.microsoft.com/office/word/2012/wordml" xmlns:w16cex="http://schemas.microsoft.com/office/word/2018/wordml/cex" xmlns:w16cid="http://schemas.microsoft.com/office/word/2016/wordml/cid" xmlns:w16="http://schemas.microsoft.com/office/word/2018/wordml" xmlns:w16du="http://schemas.microsoft.com/office/word/2023/wordml/word16du" xmlns:w16sdtdh="http://schemas.microsoft.com/office/word/2020/wordml/sdtdatahash" xmlns:w16sdtfl="http://schemas.microsoft.com/office/word/2024/wordml/sdtformatlock" xmlns:w16se="http://schemas.microsoft.com/office/word/2015/wordml/symex" xmlns:wpg="http://schemas.microsoft.com/office/word/2010/wordprocessingGroup" xmlns:wpi="http://schemas.microsoft.com/office/word/2010/wordprocessingInk" xmlns:wne="http://schemas.microsoft.com/office/word/2006/wordml" xmlns:wps="http://schemas.microsoft.com/office/word/2010/wordprocessingShape" mc:Ignorable="w14 w15 w16se w16cid w16 w16cex w16sdtdh w16sdtfl w16du wp14">
-  <w:comment w:id="1" w:author="Mr I MAJOR" w:date="2025-10-08T08:28:00Z" w:initials="IM">
-    <w:p>
-      <w:pPr>
-        <w:pStyle w:val="CommentText"/>
-      </w:pPr>
-      <w:r>
-        <w:rPr>
-          <w:rStyle w:val="CommentReference"/>
-        </w:rPr>
-        <w:annotationRef/>
-      </w:r>
-      <w:r>
-        <w:t xml:space="preserve">Hi Dexter, don’t worry about naming the project (assuming that is what the InsertNameHere is for, that can come much later. For now I’d like to see a lot of lovely rich detail here about why you are doing this project, who it is aimed at, what it aims to achieve. For example: Talk about your passion for microcontrollers if they are going to be a focus. Talk about your stakeholder and his need for a block-based coding language to easily allow students to code microcontrollers without getting hung up on syntax. Talk about which ages this is designed to be used by, what experience you had personally at that age, what experience you have had of working with students of that age to help them grasp microcontrollers (Tuesday Tech Club), etc. etc. </w:t>
-      </w:r>
-      <w:r>
-        <w:br/>
-        <w:t xml:space="preserve">This is hopefully going to be 1-2 pages of introduction where you could also start to mention what block based coding looks like, examples of block based languages and generally make it a much more detailed introduction to set the scene. </w:t>
-      </w:r>
-    </w:p>
-  </w:comment>
-  <w:comment w:id="4" w:author="Mr I MAJOR" w:date="2025-10-08T08:29:00Z" w:initials="IM">
-    <w:p>
-      <w:pPr>
-        <w:pStyle w:val="CommentText"/>
-      </w:pPr>
-      <w:r>
-        <w:rPr>
-          <w:rStyle w:val="CommentReference"/>
-        </w:rPr>
-        <w:annotationRef/>
-      </w:r>
-      <w:r>
-        <w:t>How about which microcontrollers you will be working with, what IDE you are planning to use to develop, are you doing automated testing...</w:t>
-      </w:r>
-    </w:p>
-  </w:comment>
-  <w:comment w:id="5" w:author="Mr I MAJOR" w:date="2025-10-08T08:33:00Z" w:initials="IM">
-    <w:p>
-      <w:pPr>
-        <w:pStyle w:val="CommentText"/>
-      </w:pPr>
-      <w:r>
-        <w:rPr>
-          <w:rStyle w:val="CommentReference"/>
-        </w:rPr>
-        <w:annotationRef/>
-      </w:r>
-      <w:r>
-        <w:t>Can you elaborate?</w:t>
-      </w:r>
-    </w:p>
-  </w:comment>
-  <w:comment w:id="6" w:author="Mr I MAJOR" w:date="2025-10-08T08:34:00Z" w:initials="IM">
-    <w:p>
-      <w:pPr>
-        <w:pStyle w:val="CommentText"/>
-      </w:pPr>
-      <w:r>
-        <w:rPr>
-          <w:rStyle w:val="CommentReference"/>
-        </w:rPr>
-        <w:annotationRef/>
-      </w:r>
-      <w:r>
-        <w:t>Dumb question but isn’t it capitalised?</w:t>
-      </w:r>
-    </w:p>
-  </w:comment>
-  <w:comment w:id="8" w:author="Mr I MAJOR" w:date="2025-10-08T08:35:00Z" w:initials="IM">
-    <w:p>
-      <w:pPr>
-        <w:pStyle w:val="CommentText"/>
-      </w:pPr>
-      <w:r>
-        <w:rPr>
-          <w:rStyle w:val="CommentReference"/>
-        </w:rPr>
-        <w:annotationRef/>
-      </w:r>
-      <w:r>
-        <w:t>It is a great idea to look for partial solutions, not necessarily full solutions. For each one you list try to pull out the key features and be critical, which work well, which don’t. From this develop the list of features you are going to implement in your own solution.</w:t>
-      </w:r>
-    </w:p>
-  </w:comment>
-  <w:comment w:id="10" w:author="Mr I MAJOR" w:date="2025-10-08T08:37:00Z" w:initials="IM">
-    <w:p>
-      <w:pPr>
-        <w:pStyle w:val="CommentText"/>
-      </w:pPr>
-      <w:r>
-        <w:rPr>
-          <w:rStyle w:val="CommentReference"/>
-        </w:rPr>
-        <w:annotationRef/>
-      </w:r>
-      <w:r>
-        <w:t>Again, try to be more descriptive of the key features of each of these libraries, their advantages and disadvantages etc.</w:t>
-      </w:r>
-    </w:p>
-  </w:comment>
-  <w:comment w:id="13" w:author="Mr I MAJOR" w:date="2025-10-08T08:41:00Z" w:initials="IM">
-    <w:p>
-      <w:pPr>
-        <w:pStyle w:val="CommentText"/>
-      </w:pPr>
-      <w:r>
-        <w:rPr>
-          <w:rStyle w:val="CommentReference"/>
-        </w:rPr>
-        <w:annotationRef/>
-      </w:r>
-      <w:r>
-        <w:t xml:space="preserve">“Identified suitable stakeholders for the project and described them explaining how they will make use of the proposed solution and why it is appropriate to their needs” </w:t>
-      </w:r>
-      <w:r>
-        <w:br/>
-        <w:t>You have identified them (you could name Mr Turner if you wish), described them and explained (in bare outline) how they will use the solution and why it is appropriate to their needs, but I’d love to see more detail. For example, please think about interviewing him and collecting his thoughts about what he wants the solution to do (key features), these could then be ranked from mission critical to ‘nice if’.</w:t>
-      </w:r>
-      <w:r>
-        <w:br/>
-        <w:t>It might also be worth talking to a lower school student (maybe someone like Riley from the club last year) about how they find block coding and what they would like?? Just a thought.</w:t>
-      </w:r>
-    </w:p>
-  </w:comment>
-</w:comments>
+<file path=word/endnotes.xml><?xml version="1.0" encoding="utf-8"?>
+<w:endnotes xmlns:wpc="http://schemas.microsoft.com/office/word/2010/wordprocessingCanvas" xmlns:cx="http://schemas.microsoft.com/office/drawing/2014/chartex" xmlns:cx1="http://schemas.microsoft.com/office/drawing/2015/9/8/chartex" xmlns:cx2="http://schemas.microsoft.com/office/drawing/2015/10/21/chartex" xmlns:cx3="http://schemas.microsoft.com/office/drawing/2016/5/9/chartex" xmlns:cx4="http://schemas.microsoft.com/office/drawing/2016/5/10/chartex" xmlns:cx5="http://schemas.microsoft.com/office/drawing/2016/5/11/chartex" xmlns:cx6="http://schemas.microsoft.com/office/drawing/2016/5/12/chartex" xmlns:cx7="http://schemas.microsoft.com/office/drawing/2016/5/13/chartex" xmlns:cx8="http://schemas.microsoft.com/office/drawing/2016/5/14/chartex" xmlns:mc="http://schemas.openxmlformats.org/markup-compatibility/2006" xmlns:aink="http://schemas.microsoft.com/office/drawing/2016/ink" xmlns:am3d="http://schemas.microsoft.com/office/drawing/2017/model3d" xmlns:o="urn:schemas-microsoft-com:office:office" xmlns:oel="http://schemas.microsoft.com/office/2019/extlst" xmlns:r="http://schemas.openxmlformats.org/officeDocument/2006/relationships" xmlns:m="http://schemas.openxmlformats.org/officeDocument/2006/math" xmlns:v="urn:schemas-microsoft-com:vml" xmlns:wp14="http://schemas.microsoft.com/office/word/2010/wordprocessingDrawing" xmlns:wp="http://schemas.openxmlformats.org/drawingml/2006/wordprocessingDrawing" xmlns:w10="urn:schemas-microsoft-com:office:word" xmlns:w="http://schemas.openxmlformats.org/wordprocessingml/2006/main" xmlns:w14="http://schemas.microsoft.com/office/word/2010/wordml" xmlns:w15="http://schemas.microsoft.com/office/word/2012/wordml" xmlns:w16cex="http://schemas.microsoft.com/office/word/2018/wordml/cex" xmlns:w16cid="http://schemas.microsoft.com/office/word/2016/wordml/cid" xmlns:w16="http://schemas.microsoft.com/office/word/2018/wordml" xmlns:w16du="http://schemas.microsoft.com/office/word/2023/wordml/word16du" xmlns:w16sdtdh="http://schemas.microsoft.com/office/word/2020/wordml/sdtdatahash" xmlns:w16sdtfl="http://schemas.microsoft.com/office/word/2024/wordml/sdtformatlock" xmlns:w16se="http://schemas.microsoft.com/office/word/2015/wordml/symex" xmlns:wpg="http://schemas.microsoft.com/office/word/2010/wordprocessingGroup" xmlns:wpi="http://schemas.microsoft.com/office/word/2010/wordprocessingInk" xmlns:wne="http://schemas.microsoft.com/office/word/2006/wordml" xmlns:wps="http://schemas.microsoft.com/office/word/2010/wordprocessingShape" mc:Ignorable="w14 w15 w16se w16cid w16 w16cex w16sdtdh w16sdtfl w16du wp14">
+  <w:endnote w:type="separator" w:id="-1">
+    <w:p>
+      <w:pPr>
+        <w:spacing w:after="0" w:line="240" w:lineRule="auto"/>
+      </w:pPr>
+      <w:r>
+        <w:separator/>
+      </w:r>
+    </w:p>
+  </w:endnote>
+  <w:endnote w:type="continuationSeparator" w:id="0">
+    <w:p>
+      <w:pPr>
+        <w:spacing w:after="0" w:line="240" w:lineRule="auto"/>
+      </w:pPr>
+      <w:r>
+        <w:continuationSeparator/>
+      </w:r>
+    </w:p>
+  </w:endnote>
+</w:endnotes>
 </file>
 
-<file path=word/commentsExtended.xml><?xml version="1.0" encoding="utf-8"?>
-<w15:commentsEx xmlns:wpc="http://schemas.microsoft.com/office/word/2010/wordprocessingCanvas" xmlns:cx="http://schemas.microsoft.com/office/drawing/2014/chartex" xmlns:cx1="http://schemas.microsoft.com/office/drawing/2015/9/8/chartex" xmlns:cx2="http://schemas.microsoft.com/office/drawing/2015/10/21/chartex" xmlns:cx3="http://schemas.microsoft.com/office/drawing/2016/5/9/chartex" xmlns:cx4="http://schemas.microsoft.com/office/drawing/2016/5/10/chartex" xmlns:cx5="http://schemas.microsoft.com/office/drawing/2016/5/11/chartex" xmlns:cx6="http://schemas.microsoft.com/office/drawing/2016/5/12/chartex" xmlns:cx7="http://schemas.microsoft.com/office/drawing/2016/5/13/chartex" xmlns:cx8="http://schemas.microsoft.com/office/drawing/2016/5/14/chartex" xmlns:mc="http://schemas.openxmlformats.org/markup-compatibility/2006" xmlns:aink="http://schemas.microsoft.com/office/drawing/2016/ink" xmlns:am3d="http://schemas.microsoft.com/office/drawing/2017/model3d" xmlns:o="urn:schemas-microsoft-com:office:office" xmlns:oel="http://schemas.microsoft.com/office/2019/extlst" xmlns:r="http://schemas.openxmlformats.org/officeDocument/2006/relationships" xmlns:m="http://schemas.openxmlformats.org/officeDocument/2006/math" xmlns:v="urn:schemas-microsoft-com:vml" xmlns:wp14="http://schemas.microsoft.com/office/word/2010/wordprocessingDrawing" xmlns:wp="http://schemas.openxmlformats.org/drawingml/2006/wordprocessingDrawing" xmlns:w10="urn:schemas-microsoft-com:office:word" xmlns:w="http://schemas.openxmlformats.org/wordprocessingml/2006/main" xmlns:w14="http://schemas.microsoft.com/office/word/2010/wordml" xmlns:w15="http://schemas.microsoft.com/office/word/2012/wordml" xmlns:w16cex="http://schemas.microsoft.com/office/word/2018/wordml/cex" xmlns:w16cid="http://schemas.microsoft.com/office/word/2016/wordml/cid" xmlns:w16="http://schemas.microsoft.com/office/word/2018/wordml" xmlns:w16du="http://schemas.microsoft.com/office/word/2023/wordml/word16du" xmlns:w16sdtdh="http://schemas.microsoft.com/office/word/2020/wordml/sdtdatahash" xmlns:w16sdtfl="http://schemas.microsoft.com/office/word/2024/wordml/sdtformatlock" xmlns:w16se="http://schemas.microsoft.com/office/word/2015/wordml/symex" xmlns:wpg="http://schemas.microsoft.com/office/word/2010/wordprocessingGroup" xmlns:wpi="http://schemas.microsoft.com/office/word/2010/wordprocessingInk" xmlns:wne="http://schemas.microsoft.com/office/word/2006/wordml" xmlns:wps="http://schemas.microsoft.com/office/word/2010/wordprocessingShape" mc:Ignorable="w14 w15 w16se w16cid w16 w16cex w16sdtdh w16sdtfl w16du wp14">
-  <w15:commentEx w15:paraId="2F2A87BC" w15:done="0"/>
-  <w15:commentEx w15:paraId="20C5020B" w15:done="0"/>
-  <w15:commentEx w15:paraId="1EC789E0" w15:done="0"/>
-  <w15:commentEx w15:paraId="793D9E8A" w15:done="1"/>
-  <w15:commentEx w15:paraId="099D1DA2" w15:done="0"/>
-  <w15:commentEx w15:paraId="68FCDA9D" w15:done="0"/>
-  <w15:commentEx w15:paraId="61855B77" w15:done="0"/>
-</w15:commentsEx>
+<file path=word/footnotes.xml><?xml version="1.0" encoding="utf-8"?>
+<w:footnotes xmlns:wpc="http://schemas.microsoft.com/office/word/2010/wordprocessingCanvas" xmlns:cx="http://schemas.microsoft.com/office/drawing/2014/chartex" xmlns:cx1="http://schemas.microsoft.com/office/drawing/2015/9/8/chartex" xmlns:cx2="http://schemas.microsoft.com/office/drawing/2015/10/21/chartex" xmlns:cx3="http://schemas.microsoft.com/office/drawing/2016/5/9/chartex" xmlns:cx4="http://schemas.microsoft.com/office/drawing/2016/5/10/chartex" xmlns:cx5="http://schemas.microsoft.com/office/drawing/2016/5/11/chartex" xmlns:cx6="http://schemas.microsoft.com/office/drawing/2016/5/12/chartex" xmlns:cx7="http://schemas.microsoft.com/office/drawing/2016/5/13/chartex" xmlns:cx8="http://schemas.microsoft.com/office/drawing/2016/5/14/chartex" xmlns:mc="http://schemas.openxmlformats.org/markup-compatibility/2006" xmlns:aink="http://schemas.microsoft.com/office/drawing/2016/ink" xmlns:am3d="http://schemas.microsoft.com/office/drawing/2017/model3d" xmlns:o="urn:schemas-microsoft-com:office:office" xmlns:oel="http://schemas.microsoft.com/office/2019/extlst" xmlns:r="http://schemas.openxmlformats.org/officeDocument/2006/relationships" xmlns:m="http://schemas.openxmlformats.org/officeDocument/2006/math" xmlns:v="urn:schemas-microsoft-com:vml" xmlns:wp14="http://schemas.microsoft.com/office/word/2010/wordprocessingDrawing" xmlns:wp="http://schemas.openxmlformats.org/drawingml/2006/wordprocessingDrawing" xmlns:w10="urn:schemas-microsoft-com:office:word" xmlns:w="http://schemas.openxmlformats.org/wordprocessingml/2006/main" xmlns:w14="http://schemas.microsoft.com/office/word/2010/wordml" xmlns:w15="http://schemas.microsoft.com/office/word/2012/wordml" xmlns:w16cex="http://schemas.microsoft.com/office/word/2018/wordml/cex" xmlns:w16cid="http://schemas.microsoft.com/office/word/2016/wordml/cid" xmlns:w16="http://schemas.microsoft.com/office/word/2018/wordml" xmlns:w16du="http://schemas.microsoft.com/office/word/2023/wordml/word16du" xmlns:w16sdtdh="http://schemas.microsoft.com/office/word/2020/wordml/sdtdatahash" xmlns:w16sdtfl="http://schemas.microsoft.com/office/word/2024/wordml/sdtformatlock" xmlns:w16se="http://schemas.microsoft.com/office/word/2015/wordml/symex" xmlns:wpg="http://schemas.microsoft.com/office/word/2010/wordprocessingGroup" xmlns:wpi="http://schemas.microsoft.com/office/word/2010/wordprocessingInk" xmlns:wne="http://schemas.microsoft.com/office/word/2006/wordml" xmlns:wps="http://schemas.microsoft.com/office/word/2010/wordprocessingShape" mc:Ignorable="w14 w15 w16se w16cid w16 w16cex w16sdtdh w16sdtfl w16du wp14">
+  <w:footnote w:type="separator" w:id="-1">
+    <w:p>
+      <w:pPr>
+        <w:spacing w:after="0" w:line="240" w:lineRule="auto"/>
+      </w:pPr>
+      <w:r>
+        <w:separator/>
+      </w:r>
+    </w:p>
+  </w:footnote>
+  <w:footnote w:type="continuationSeparator" w:id="0">
+    <w:p>
+      <w:pPr>
+        <w:spacing w:after="0" w:line="240" w:lineRule="auto"/>
+      </w:pPr>
+      <w:r>
+        <w:continuationSeparator/>
+      </w:r>
+    </w:p>
+  </w:footnote>
+</w:footnotes>
 </file>
 
-<file path=word/commentsExtensible.xml><?xml version="1.0" encoding="utf-8"?>
-<w16cex:commentsExtensible xmlns:wpc="http://schemas.microsoft.com/office/word/2010/wordprocessingCanvas" xmlns:cx="http://schemas.microsoft.com/office/drawing/2014/chartex" xmlns:cx1="http://schemas.microsoft.com/office/drawing/2015/9/8/chartex" xmlns:cx2="http://schemas.microsoft.com/office/drawing/2015/10/21/chartex" xmlns:cx3="http://schemas.microsoft.com/office/drawing/2016/5/9/chartex" xmlns:cx4="http://schemas.microsoft.com/office/drawing/2016/5/10/chartex" xmlns:cx5="http://schemas.microsoft.com/office/drawing/2016/5/11/chartex" xmlns:cx6="http://schemas.microsoft.com/office/drawing/2016/5/12/chartex" xmlns:cx7="http://schemas.microsoft.com/office/drawing/2016/5/13/chartex" xmlns:cx8="http://schemas.microsoft.com/office/drawing/2016/5/14/chartex" xmlns:cr="http://schemas.microsoft.com/office/comments/2020/reactions" xmlns:mc="http://schemas.openxmlformats.org/markup-compatibility/2006" xmlns:aink="http://schemas.microsoft.com/office/drawing/2016/ink" xmlns:am3d="http://schemas.microsoft.com/office/drawing/2017/model3d" xmlns:o="urn:schemas-microsoft-com:office:office" xmlns:oel="http://schemas.microsoft.com/office/2019/extlst" xmlns:r="http://schemas.openxmlformats.org/officeDocument/2006/relationships" xmlns:m="http://schemas.openxmlformats.org/officeDocument/2006/math" xmlns:v="urn:schemas-microsoft-com:vml" xmlns:wp14="http://schemas.microsoft.com/office/word/2010/wordprocessingDrawing" xmlns:wp="http://schemas.openxmlformats.org/drawingml/2006/wordprocessingDrawing" xmlns:w10="urn:schemas-microsoft-com:office:word" xmlns:w="http://schemas.openxmlformats.org/wordprocessingml/2006/main" xmlns:w14="http://schemas.microsoft.com/office/word/2010/wordml" xmlns:w15="http://schemas.microsoft.com/office/word/2012/wordml" xmlns:w16cex="http://schemas.microsoft.com/office/word/2018/wordml/cex" xmlns:w16cid="http://schemas.microsoft.com/office/word/2016/wordml/cid" xmlns:w16="http://schemas.microsoft.com/office/word/2018/wordml" xmlns:w16du="http://schemas.microsoft.com/office/word/2023/wordml/word16du" xmlns:w16sdtdh="http://schemas.microsoft.com/office/word/2020/wordml/sdtdatahash" xmlns:w16sdtfl="http://schemas.microsoft.com/office/word/2024/wordml/sdtformatlock" xmlns:w16se="http://schemas.microsoft.com/office/word/2015/wordml/symex" xmlns:wpg="http://schemas.microsoft.com/office/word/2010/wordprocessingGroup" xmlns:wpi="http://schemas.microsoft.com/office/word/2010/wordprocessingInk" xmlns:wne="http://schemas.microsoft.com/office/word/2006/wordml" xmlns:wps="http://schemas.microsoft.com/office/word/2010/wordprocessingShape" mc:Ignorable="w14 w15 w16se w16cid w16 w16cex w16sdtdh w16sdtfl cr w16du wp14">
-  <w16cex:commentExtensible w16cex:durableId="50B2785C" w16cex:dateUtc="2025-10-08T07:28:00Z"/>
-  <w16cex:commentExtensible w16cex:durableId="68100D79" w16cex:dateUtc="2025-10-08T07:29:00Z"/>
-  <w16cex:commentExtensible w16cex:durableId="1E51EA32" w16cex:dateUtc="2025-10-08T07:33:00Z"/>
-  <w16cex:commentExtensible w16cex:durableId="32F8B9C0" w16cex:dateUtc="2025-10-08T07:34:00Z"/>
-  <w16cex:commentExtensible w16cex:durableId="4E0628C8" w16cex:dateUtc="2025-10-08T07:35:00Z"/>
-  <w16cex:commentExtensible w16cex:durableId="1366EED9" w16cex:dateUtc="2025-10-08T07:37:00Z"/>
-  <w16cex:commentExtensible w16cex:durableId="4E9E6FB8" w16cex:dateUtc="2025-10-08T07:41:00Z"/>
-</w16cex:commentsExtensible>
-</file>
-
-<file path=word/commentsIds.xml><?xml version="1.0" encoding="utf-8"?>
-<w16cid:commentsIds xmlns:wpc="http://schemas.microsoft.com/office/word/2010/wordprocessingCanvas" xmlns:cx="http://schemas.microsoft.com/office/drawing/2014/chartex" xmlns:cx1="http://schemas.microsoft.com/office/drawing/2015/9/8/chartex" xmlns:cx2="http://schemas.microsoft.com/office/drawing/2015/10/21/chartex" xmlns:cx3="http://schemas.microsoft.com/office/drawing/2016/5/9/chartex" xmlns:cx4="http://schemas.microsoft.com/office/drawing/2016/5/10/chartex" xmlns:cx5="http://schemas.microsoft.com/office/drawing/2016/5/11/chartex" xmlns:cx6="http://schemas.microsoft.com/office/drawing/2016/5/12/chartex" xmlns:cx7="http://schemas.microsoft.com/office/drawing/2016/5/13/chartex" xmlns:cx8="http://schemas.microsoft.com/office/drawing/2016/5/14/chartex" xmlns:mc="http://schemas.openxmlformats.org/markup-compatibility/2006" xmlns:aink="http://schemas.microsoft.com/office/drawing/2016/ink" xmlns:am3d="http://schemas.microsoft.com/office/drawing/2017/model3d" xmlns:o="urn:schemas-microsoft-com:office:office" xmlns:oel="http://schemas.microsoft.com/office/2019/extlst" xmlns:r="http://schemas.openxmlformats.org/officeDocument/2006/relationships" xmlns:m="http://schemas.openxmlformats.org/officeDocument/2006/math" xmlns:v="urn:schemas-microsoft-com:vml" xmlns:wp14="http://schemas.microsoft.com/office/word/2010/wordprocessingDrawing" xmlns:wp="http://schemas.openxmlformats.org/drawingml/2006/wordprocessingDrawing" xmlns:w10="urn:schemas-microsoft-com:office:word" xmlns:w="http://schemas.openxmlformats.org/wordprocessingml/2006/main" xmlns:w14="http://schemas.microsoft.com/office/word/2010/wordml" xmlns:w15="http://schemas.microsoft.com/office/word/2012/wordml" xmlns:w16cex="http://schemas.microsoft.com/office/word/2018/wordml/cex" xmlns:w16cid="http://schemas.microsoft.com/office/word/2016/wordml/cid" xmlns:w16="http://schemas.microsoft.com/office/word/2018/wordml" xmlns:w16du="http://schemas.microsoft.com/office/word/2023/wordml/word16du" xmlns:w16sdtdh="http://schemas.microsoft.com/office/word/2020/wordml/sdtdatahash" xmlns:w16sdtfl="http://schemas.microsoft.com/office/word/2024/wordml/sdtformatlock" xmlns:w16se="http://schemas.microsoft.com/office/word/2015/wordml/symex" xmlns:wpg="http://schemas.microsoft.com/office/word/2010/wordprocessingGroup" xmlns:wpi="http://schemas.microsoft.com/office/word/2010/wordprocessingInk" xmlns:wne="http://schemas.microsoft.com/office/word/2006/wordml" xmlns:wps="http://schemas.microsoft.com/office/word/2010/wordprocessingShape" mc:Ignorable="w14 w15 w16se w16cid w16 w16cex w16sdtdh w16sdtfl w16du wp14">
-  <w16cid:commentId w16cid:paraId="2F2A87BC" w16cid:durableId="50B2785C"/>
-  <w16cid:commentId w16cid:paraId="20C5020B" w16cid:durableId="68100D79"/>
-  <w16cid:commentId w16cid:paraId="1EC789E0" w16cid:durableId="1E51EA32"/>
-  <w16cid:commentId w16cid:paraId="793D9E8A" w16cid:durableId="32F8B9C0"/>
-  <w16cid:commentId w16cid:paraId="099D1DA2" w16cid:durableId="4E0628C8"/>
-  <w16cid:commentId w16cid:paraId="68FCDA9D" w16cid:durableId="1366EED9"/>
-  <w16cid:commentId w16cid:paraId="61855B77" w16cid:durableId="4E9E6FB8"/>
-</w16cid:commentsIds>
+<file path=word/header1.xml><?xml version="1.0" encoding="utf-8"?>
+<w:hdr xmlns:wpc="http://schemas.microsoft.com/office/word/2010/wordprocessingCanvas" xmlns:cx="http://schemas.microsoft.com/office/drawing/2014/chartex" xmlns:cx1="http://schemas.microsoft.com/office/drawing/2015/9/8/chartex" xmlns:cx2="http://schemas.microsoft.com/office/drawing/2015/10/21/chartex" xmlns:cx3="http://schemas.microsoft.com/office/drawing/2016/5/9/chartex" xmlns:cx4="http://schemas.microsoft.com/office/drawing/2016/5/10/chartex" xmlns:cx5="http://schemas.microsoft.com/office/drawing/2016/5/11/chartex" xmlns:cx6="http://schemas.microsoft.com/office/drawing/2016/5/12/chartex" xmlns:cx7="http://schemas.microsoft.com/office/drawing/2016/5/13/chartex" xmlns:cx8="http://schemas.microsoft.com/office/drawing/2016/5/14/chartex" xmlns:mc="http://schemas.openxmlformats.org/markup-compatibility/2006" xmlns:aink="http://schemas.microsoft.com/office/drawing/2016/ink" xmlns:am3d="http://schemas.microsoft.com/office/drawing/2017/model3d" xmlns:o="urn:schemas-microsoft-com:office:office" xmlns:oel="http://schemas.microsoft.com/office/2019/extlst" xmlns:r="http://schemas.openxmlformats.org/officeDocument/2006/relationships" xmlns:m="http://schemas.openxmlformats.org/officeDocument/2006/math" xmlns:v="urn:schemas-microsoft-com:vml" xmlns:wp14="http://schemas.microsoft.com/office/word/2010/wordprocessingDrawing" xmlns:wp="http://schemas.openxmlformats.org/drawingml/2006/wordprocessingDrawing" xmlns:w10="urn:schemas-microsoft-com:office:word" xmlns:w="http://schemas.openxmlformats.org/wordprocessingml/2006/main" xmlns:w14="http://schemas.microsoft.com/office/word/2010/wordml" xmlns:w15="http://schemas.microsoft.com/office/word/2012/wordml" xmlns:w16cex="http://schemas.microsoft.com/office/word/2018/wordml/cex" xmlns:w16cid="http://schemas.microsoft.com/office/word/2016/wordml/cid" xmlns:w16="http://schemas.microsoft.com/office/word/2018/wordml" xmlns:w16du="http://schemas.microsoft.com/office/word/2023/wordml/word16du" xmlns:w16sdtdh="http://schemas.microsoft.com/office/word/2020/wordml/sdtdatahash" xmlns:w16sdtfl="http://schemas.microsoft.com/office/word/2024/wordml/sdtformatlock" xmlns:w16se="http://schemas.microsoft.com/office/word/2015/wordml/symex" xmlns:wpg="http://schemas.microsoft.com/office/word/2010/wordprocessingGroup" xmlns:wpi="http://schemas.microsoft.com/office/word/2010/wordprocessingInk" xmlns:wne="http://schemas.microsoft.com/office/word/2006/wordml" xmlns:wps="http://schemas.microsoft.com/office/word/2010/wordprocessingShape" mc:Ignorable="w14 w15 w16se w16cid w16 w16cex w16sdtdh w16sdtfl w16du wp14">
+  <w:p>
+    <w:pPr>
+      <w:pStyle w:val="Header"/>
+    </w:pPr>
+    <w:r>
+      <w:t xml:space="preserve">Candidate Name: </w:t>
+    </w:r>
+    <w:r>
+      <w:t>Dexter Jeal</w:t>
+    </w:r>
+    <w:r>
+      <w:tab/>
+    </w:r>
+    <w:r>
+      <w:tab/>
+      <w:t>Centre Name: Clevedon School</w:t>
+    </w:r>
+  </w:p>
+  <w:p>
+    <w:pPr>
+      <w:pStyle w:val="Header"/>
+    </w:pPr>
+    <w:r>
+      <w:t>Candidate Number:</w:t>
+    </w:r>
+    <w:r>
+      <w:t>1112</w:t>
+    </w:r>
+    <w:r>
+      <w:tab/>
+    </w:r>
+    <w:r>
+      <w:tab/>
+    </w:r>
+    <w:r>
+      <w:t>Centre Number: 50629</w:t>
+    </w:r>
+  </w:p>
+</w:hdr>
 </file>
 
 <file path=word/numbering.xml><?xml version="1.0" encoding="utf-8"?>
@@ -2586,14 +3707,6 @@
     <w:abstractNumId w:val="1"/>
   </w:num>
 </w:numbering>
-</file>
-
-<file path=word/people.xml><?xml version="1.0" encoding="utf-8"?>
-<w15:people xmlns:wpc="http://schemas.microsoft.com/office/word/2010/wordprocessingCanvas" xmlns:cx="http://schemas.microsoft.com/office/drawing/2014/chartex" xmlns:cx1="http://schemas.microsoft.com/office/drawing/2015/9/8/chartex" xmlns:cx2="http://schemas.microsoft.com/office/drawing/2015/10/21/chartex" xmlns:cx3="http://schemas.microsoft.com/office/drawing/2016/5/9/chartex" xmlns:cx4="http://schemas.microsoft.com/office/drawing/2016/5/10/chartex" xmlns:cx5="http://schemas.microsoft.com/office/drawing/2016/5/11/chartex" xmlns:cx6="http://schemas.microsoft.com/office/drawing/2016/5/12/chartex" xmlns:cx7="http://schemas.microsoft.com/office/drawing/2016/5/13/chartex" xmlns:cx8="http://schemas.microsoft.com/office/drawing/2016/5/14/chartex" xmlns:mc="http://schemas.openxmlformats.org/markup-compatibility/2006" xmlns:aink="http://schemas.microsoft.com/office/drawing/2016/ink" xmlns:am3d="http://schemas.microsoft.com/office/drawing/2017/model3d" xmlns:o="urn:schemas-microsoft-com:office:office" xmlns:oel="http://schemas.microsoft.com/office/2019/extlst" xmlns:r="http://schemas.openxmlformats.org/officeDocument/2006/relationships" xmlns:m="http://schemas.openxmlformats.org/officeDocument/2006/math" xmlns:v="urn:schemas-microsoft-com:vml" xmlns:wp14="http://schemas.microsoft.com/office/word/2010/wordprocessingDrawing" xmlns:wp="http://schemas.openxmlformats.org/drawingml/2006/wordprocessingDrawing" xmlns:w10="urn:schemas-microsoft-com:office:word" xmlns:w="http://schemas.openxmlformats.org/wordprocessingml/2006/main" xmlns:w14="http://schemas.microsoft.com/office/word/2010/wordml" xmlns:w15="http://schemas.microsoft.com/office/word/2012/wordml" xmlns:w16cex="http://schemas.microsoft.com/office/word/2018/wordml/cex" xmlns:w16cid="http://schemas.microsoft.com/office/word/2016/wordml/cid" xmlns:w16="http://schemas.microsoft.com/office/word/2018/wordml" xmlns:w16du="http://schemas.microsoft.com/office/word/2023/wordml/word16du" xmlns:w16sdtdh="http://schemas.microsoft.com/office/word/2020/wordml/sdtdatahash" xmlns:w16sdtfl="http://schemas.microsoft.com/office/word/2024/wordml/sdtformatlock" xmlns:w16se="http://schemas.microsoft.com/office/word/2015/wordml/symex" xmlns:wpg="http://schemas.microsoft.com/office/word/2010/wordprocessingGroup" xmlns:wpi="http://schemas.microsoft.com/office/word/2010/wordprocessingInk" xmlns:wne="http://schemas.microsoft.com/office/word/2006/wordml" xmlns:wps="http://schemas.microsoft.com/office/word/2010/wordprocessingShape" mc:Ignorable="w14 w15 w16se w16cid w16 w16cex w16sdtdh w16sdtfl w16du wp14">
-  <w15:person w15:author="Mr I MAJOR">
-    <w15:presenceInfo w15:providerId="AD" w15:userId="S::imajor@clevedonschool.org.uk::bed1effd-9d0b-4366-83d7-2793b8f67739"/>
-  </w15:person>
-</w15:people>
 </file>
 
 <file path=word/styles.xml><?xml version="1.0" encoding="utf-8"?>
@@ -3728,6 +4841,50 @@
       <w:szCs w:val="20"/>
     </w:rPr>
   </w:style>
+  <w:style w:type="paragraph" w:styleId="Header">
+    <w:name w:val="header"/>
+    <w:basedOn w:val="Normal"/>
+    <w:link w:val="HeaderChar"/>
+    <w:uiPriority w:val="99"/>
+    <w:unhideWhenUsed/>
+    <w:rsid w:val="00714F2E"/>
+    <w:pPr>
+      <w:tabs>
+        <w:tab w:val="center" w:pos="4513"/>
+        <w:tab w:val="right" w:pos="9026"/>
+      </w:tabs>
+      <w:spacing w:after="0" w:line="240" w:lineRule="auto"/>
+    </w:pPr>
+  </w:style>
+  <w:style w:type="character" w:customStyle="1" w:styleId="HeaderChar">
+    <w:name w:val="Header Char"/>
+    <w:basedOn w:val="DefaultParagraphFont"/>
+    <w:link w:val="Header"/>
+    <w:uiPriority w:val="99"/>
+    <w:rsid w:val="00714F2E"/>
+  </w:style>
+  <w:style w:type="paragraph" w:styleId="Footer">
+    <w:name w:val="footer"/>
+    <w:basedOn w:val="Normal"/>
+    <w:link w:val="FooterChar"/>
+    <w:uiPriority w:val="99"/>
+    <w:unhideWhenUsed/>
+    <w:rsid w:val="00714F2E"/>
+    <w:pPr>
+      <w:tabs>
+        <w:tab w:val="center" w:pos="4513"/>
+        <w:tab w:val="right" w:pos="9026"/>
+      </w:tabs>
+      <w:spacing w:after="0" w:line="240" w:lineRule="auto"/>
+    </w:pPr>
+  </w:style>
+  <w:style w:type="character" w:customStyle="1" w:styleId="FooterChar">
+    <w:name w:val="Footer Char"/>
+    <w:basedOn w:val="DefaultParagraphFont"/>
+    <w:link w:val="Footer"/>
+    <w:uiPriority w:val="99"/>
+    <w:rsid w:val="00714F2E"/>
+  </w:style>
 </w:styles>
 </file>
 

</xml_diff>

<commit_message>
Updated filestructure with code file
</commit_message>
<xml_diff>
--- a/Writeup/OFFICIAL_NEA_WRITEUP.docx
+++ b/Writeup/OFFICIAL_NEA_WRITEUP.docx
@@ -140,15 +140,29 @@
       <w:r>
         <w:t xml:space="preserve"> </w:t>
       </w:r>
-      <w:proofErr w:type="spellStart"/>
       <w:r>
         <w:rPr>
           <w:i/>
           <w:iCs/>
         </w:rPr>
-        <w:t>InsertNameHere</w:t>
-      </w:r>
-      <w:proofErr w:type="spellEnd"/>
+        <w:t xml:space="preserve">Blocks </w:t>
+      </w:r>
+      <w:proofErr w:type="gramStart"/>
+      <w:r>
+        <w:rPr>
+          <w:i/>
+          <w:iCs/>
+        </w:rPr>
+        <w:t>For</w:t>
+      </w:r>
+      <w:proofErr w:type="gramEnd"/>
+      <w:r>
+        <w:rPr>
+          <w:i/>
+          <w:iCs/>
+        </w:rPr>
+        <w:t xml:space="preserve"> Arduino</w:t>
+      </w:r>
     </w:p>
     <w:p>
       <w:pPr>
@@ -293,7 +307,7 @@
           <w:r>
             <w:fldChar w:fldCharType="separate"/>
           </w:r>
-          <w:hyperlink w:anchor="_Toc213244599" w:history="1">
+          <w:hyperlink w:anchor="_Toc213846624" w:history="1">
             <w:r>
               <w:rPr>
                 <w:rStyle w:val="Hyperlink"/>
@@ -320,7 +334,7 @@
                 <w:noProof/>
                 <w:webHidden/>
               </w:rPr>
-              <w:instrText xml:space="preserve"> PAGEREF _Toc213244599 \h </w:instrText>
+              <w:instrText xml:space="preserve"> PAGEREF _Toc213846624 \h </w:instrText>
             </w:r>
             <w:r>
               <w:rPr>
@@ -363,7 +377,7 @@
               <w:lang w:eastAsia="en-GB"/>
             </w:rPr>
           </w:pPr>
-          <w:hyperlink w:anchor="_Toc213244600" w:history="1">
+          <w:hyperlink w:anchor="_Toc213846625" w:history="1">
             <w:r>
               <w:rPr>
                 <w:rStyle w:val="Hyperlink"/>
@@ -390,7 +404,7 @@
                 <w:noProof/>
                 <w:webHidden/>
               </w:rPr>
-              <w:instrText xml:space="preserve"> PAGEREF _Toc213244600 \h </w:instrText>
+              <w:instrText xml:space="preserve"> PAGEREF _Toc213846625 \h </w:instrText>
             </w:r>
             <w:r>
               <w:rPr>
@@ -433,7 +447,7 @@
               <w:lang w:eastAsia="en-GB"/>
             </w:rPr>
           </w:pPr>
-          <w:hyperlink w:anchor="_Toc213244601" w:history="1">
+          <w:hyperlink w:anchor="_Toc213846626" w:history="1">
             <w:r>
               <w:rPr>
                 <w:rStyle w:val="Hyperlink"/>
@@ -460,7 +474,7 @@
                 <w:noProof/>
                 <w:webHidden/>
               </w:rPr>
-              <w:instrText xml:space="preserve"> PAGEREF _Toc213244601 \h </w:instrText>
+              <w:instrText xml:space="preserve"> PAGEREF _Toc213846626 \h </w:instrText>
             </w:r>
             <w:r>
               <w:rPr>
@@ -503,7 +517,7 @@
               <w:lang w:eastAsia="en-GB"/>
             </w:rPr>
           </w:pPr>
-          <w:hyperlink w:anchor="_Toc213244602" w:history="1">
+          <w:hyperlink w:anchor="_Toc213846627" w:history="1">
             <w:r>
               <w:rPr>
                 <w:rStyle w:val="Hyperlink"/>
@@ -530,7 +544,7 @@
                 <w:noProof/>
                 <w:webHidden/>
               </w:rPr>
-              <w:instrText xml:space="preserve"> PAGEREF _Toc213244602 \h </w:instrText>
+              <w:instrText xml:space="preserve"> PAGEREF _Toc213846627 \h </w:instrText>
             </w:r>
             <w:r>
               <w:rPr>
@@ -573,7 +587,7 @@
               <w:lang w:eastAsia="en-GB"/>
             </w:rPr>
           </w:pPr>
-          <w:hyperlink w:anchor="_Toc213244603" w:history="1">
+          <w:hyperlink w:anchor="_Toc213846628" w:history="1">
             <w:r>
               <w:rPr>
                 <w:rStyle w:val="Hyperlink"/>
@@ -600,7 +614,7 @@
                 <w:noProof/>
                 <w:webHidden/>
               </w:rPr>
-              <w:instrText xml:space="preserve"> PAGEREF _Toc213244603 \h </w:instrText>
+              <w:instrText xml:space="preserve"> PAGEREF _Toc213846628 \h </w:instrText>
             </w:r>
             <w:r>
               <w:rPr>
@@ -620,7 +634,7 @@
                 <w:noProof/>
                 <w:webHidden/>
               </w:rPr>
-              <w:t>5</w:t>
+              <w:t>6</w:t>
             </w:r>
             <w:r>
               <w:rPr>
@@ -643,7 +657,7 @@
               <w:lang w:eastAsia="en-GB"/>
             </w:rPr>
           </w:pPr>
-          <w:hyperlink w:anchor="_Toc213244604" w:history="1">
+          <w:hyperlink w:anchor="_Toc213846629" w:history="1">
             <w:r>
               <w:rPr>
                 <w:rStyle w:val="Hyperlink"/>
@@ -670,7 +684,7 @@
                 <w:noProof/>
                 <w:webHidden/>
               </w:rPr>
-              <w:instrText xml:space="preserve"> PAGEREF _Toc213244604 \h </w:instrText>
+              <w:instrText xml:space="preserve"> PAGEREF _Toc213846629 \h </w:instrText>
             </w:r>
             <w:r>
               <w:rPr>
@@ -713,27 +727,153 @@
               <w:lang w:eastAsia="en-GB"/>
             </w:rPr>
           </w:pPr>
-          <w:hyperlink w:anchor="_Toc213244605" w:history="1">
+          <w:hyperlink w:anchor="_Toc213846630" w:history="1">
             <w:r>
               <w:rPr>
                 <w:rStyle w:val="Hyperlink"/>
                 <w:noProof/>
               </w:rPr>
-              <w:t>Des</w:t>
-            </w:r>
+              <w:t>Design</w:t>
+            </w:r>
+            <w:r>
+              <w:rPr>
+                <w:noProof/>
+                <w:webHidden/>
+              </w:rPr>
+              <w:tab/>
+            </w:r>
+            <w:r>
+              <w:rPr>
+                <w:noProof/>
+                <w:webHidden/>
+              </w:rPr>
+              <w:fldChar w:fldCharType="begin"/>
+            </w:r>
+            <w:r>
+              <w:rPr>
+                <w:noProof/>
+                <w:webHidden/>
+              </w:rPr>
+              <w:instrText xml:space="preserve"> PAGEREF _Toc213846630 \h </w:instrText>
+            </w:r>
+            <w:r>
+              <w:rPr>
+                <w:noProof/>
+                <w:webHidden/>
+              </w:rPr>
+            </w:r>
+            <w:r>
+              <w:rPr>
+                <w:noProof/>
+                <w:webHidden/>
+              </w:rPr>
+              <w:fldChar w:fldCharType="separate"/>
+            </w:r>
+            <w:r>
+              <w:rPr>
+                <w:noProof/>
+                <w:webHidden/>
+              </w:rPr>
+              <w:t>9</w:t>
+            </w:r>
+            <w:r>
+              <w:rPr>
+                <w:noProof/>
+                <w:webHidden/>
+              </w:rPr>
+              <w:fldChar w:fldCharType="end"/>
+            </w:r>
+          </w:hyperlink>
+        </w:p>
+        <w:p>
+          <w:pPr>
+            <w:pStyle w:val="TOC2"/>
+            <w:tabs>
+              <w:tab w:val="right" w:leader="dot" w:pos="9016"/>
+            </w:tabs>
+            <w:rPr>
+              <w:rFonts w:eastAsiaTheme="minorEastAsia"/>
+              <w:noProof/>
+              <w:lang w:eastAsia="en-GB"/>
+            </w:rPr>
+          </w:pPr>
+          <w:hyperlink w:anchor="_Toc213846631" w:history="1">
             <w:r>
               <w:rPr>
                 <w:rStyle w:val="Hyperlink"/>
                 <w:noProof/>
               </w:rPr>
-              <w:t>i</w:t>
-            </w:r>
+              <w:t>Hardware specifications</w:t>
+            </w:r>
+            <w:r>
+              <w:rPr>
+                <w:noProof/>
+                <w:webHidden/>
+              </w:rPr>
+              <w:tab/>
+            </w:r>
+            <w:r>
+              <w:rPr>
+                <w:noProof/>
+                <w:webHidden/>
+              </w:rPr>
+              <w:fldChar w:fldCharType="begin"/>
+            </w:r>
+            <w:r>
+              <w:rPr>
+                <w:noProof/>
+                <w:webHidden/>
+              </w:rPr>
+              <w:instrText xml:space="preserve"> PAGEREF _Toc213846631 \h </w:instrText>
+            </w:r>
+            <w:r>
+              <w:rPr>
+                <w:noProof/>
+                <w:webHidden/>
+              </w:rPr>
+            </w:r>
+            <w:r>
+              <w:rPr>
+                <w:noProof/>
+                <w:webHidden/>
+              </w:rPr>
+              <w:fldChar w:fldCharType="separate"/>
+            </w:r>
+            <w:r>
+              <w:rPr>
+                <w:noProof/>
+                <w:webHidden/>
+              </w:rPr>
+              <w:t>9</w:t>
+            </w:r>
+            <w:r>
+              <w:rPr>
+                <w:noProof/>
+                <w:webHidden/>
+              </w:rPr>
+              <w:fldChar w:fldCharType="end"/>
+            </w:r>
+          </w:hyperlink>
+        </w:p>
+        <w:p>
+          <w:pPr>
+            <w:pStyle w:val="TOC2"/>
+            <w:tabs>
+              <w:tab w:val="right" w:leader="dot" w:pos="9016"/>
+            </w:tabs>
+            <w:rPr>
+              <w:rFonts w:eastAsiaTheme="minorEastAsia"/>
+              <w:noProof/>
+              <w:lang w:eastAsia="en-GB"/>
+            </w:rPr>
+          </w:pPr>
+          <w:hyperlink w:anchor="_Toc213846632" w:history="1">
             <w:r>
               <w:rPr>
                 <w:rStyle w:val="Hyperlink"/>
                 <w:noProof/>
               </w:rPr>
-              <w:t>gn</w:t>
+              <w:t>Software specifications</w:t>
             </w:r>
             <w:r>
               <w:rPr>
@@ -754,7 +894,7 @@
                 <w:noProof/>
                 <w:webHidden/>
               </w:rPr>
-              <w:instrText xml:space="preserve"> PAGEREF _Toc213244605 \h </w:instrText>
+              <w:instrText xml:space="preserve"> PAGEREF _Toc213846632 \h </w:instrText>
             </w:r>
             <w:r>
               <w:rPr>
@@ -774,7 +914,7 @@
                 <w:noProof/>
                 <w:webHidden/>
               </w:rPr>
-              <w:t>8</w:t>
+              <w:t>9</w:t>
             </w:r>
             <w:r>
               <w:rPr>
@@ -797,7 +937,7 @@
               <w:lang w:eastAsia="en-GB"/>
             </w:rPr>
           </w:pPr>
-          <w:hyperlink w:anchor="_Toc213244606" w:history="1">
+          <w:hyperlink w:anchor="_Toc213846633" w:history="1">
             <w:r>
               <w:rPr>
                 <w:rStyle w:val="Hyperlink"/>
@@ -824,7 +964,7 @@
                 <w:noProof/>
                 <w:webHidden/>
               </w:rPr>
-              <w:instrText xml:space="preserve"> PAGEREF _Toc213244606 \h </w:instrText>
+              <w:instrText xml:space="preserve"> PAGEREF _Toc213846633 \h </w:instrText>
             </w:r>
             <w:r>
               <w:rPr>
@@ -867,7 +1007,7 @@
               <w:lang w:eastAsia="en-GB"/>
             </w:rPr>
           </w:pPr>
-          <w:hyperlink w:anchor="_Toc213244607" w:history="1">
+          <w:hyperlink w:anchor="_Toc213846634" w:history="1">
             <w:r>
               <w:rPr>
                 <w:rStyle w:val="Hyperlink"/>
@@ -894,7 +1034,7 @@
                 <w:noProof/>
                 <w:webHidden/>
               </w:rPr>
-              <w:instrText xml:space="preserve"> PAGEREF _Toc213244607 \h </w:instrText>
+              <w:instrText xml:space="preserve"> PAGEREF _Toc213846634 \h </w:instrText>
             </w:r>
             <w:r>
               <w:rPr>
@@ -914,7 +1054,357 @@
                 <w:noProof/>
                 <w:webHidden/>
               </w:rPr>
-              <w:t>9</w:t>
+              <w:t>10</w:t>
+            </w:r>
+            <w:r>
+              <w:rPr>
+                <w:noProof/>
+                <w:webHidden/>
+              </w:rPr>
+              <w:fldChar w:fldCharType="end"/>
+            </w:r>
+          </w:hyperlink>
+        </w:p>
+        <w:p>
+          <w:pPr>
+            <w:pStyle w:val="TOC3"/>
+            <w:tabs>
+              <w:tab w:val="right" w:leader="dot" w:pos="9016"/>
+            </w:tabs>
+            <w:rPr>
+              <w:rFonts w:eastAsiaTheme="minorEastAsia"/>
+              <w:noProof/>
+              <w:lang w:eastAsia="en-GB"/>
+            </w:rPr>
+          </w:pPr>
+          <w:hyperlink w:anchor="_Toc213846635" w:history="1">
+            <w:r>
+              <w:rPr>
+                <w:rStyle w:val="Hyperlink"/>
+                <w:noProof/>
+              </w:rPr>
+              <w:t>Intro</w:t>
+            </w:r>
+            <w:r>
+              <w:rPr>
+                <w:noProof/>
+                <w:webHidden/>
+              </w:rPr>
+              <w:tab/>
+            </w:r>
+            <w:r>
+              <w:rPr>
+                <w:noProof/>
+                <w:webHidden/>
+              </w:rPr>
+              <w:fldChar w:fldCharType="begin"/>
+            </w:r>
+            <w:r>
+              <w:rPr>
+                <w:noProof/>
+                <w:webHidden/>
+              </w:rPr>
+              <w:instrText xml:space="preserve"> PAGEREF _Toc213846635 \h </w:instrText>
+            </w:r>
+            <w:r>
+              <w:rPr>
+                <w:noProof/>
+                <w:webHidden/>
+              </w:rPr>
+            </w:r>
+            <w:r>
+              <w:rPr>
+                <w:noProof/>
+                <w:webHidden/>
+              </w:rPr>
+              <w:fldChar w:fldCharType="separate"/>
+            </w:r>
+            <w:r>
+              <w:rPr>
+                <w:noProof/>
+                <w:webHidden/>
+              </w:rPr>
+              <w:t>10</w:t>
+            </w:r>
+            <w:r>
+              <w:rPr>
+                <w:noProof/>
+                <w:webHidden/>
+              </w:rPr>
+              <w:fldChar w:fldCharType="end"/>
+            </w:r>
+          </w:hyperlink>
+        </w:p>
+        <w:p>
+          <w:pPr>
+            <w:pStyle w:val="TOC3"/>
+            <w:tabs>
+              <w:tab w:val="right" w:leader="dot" w:pos="9016"/>
+            </w:tabs>
+            <w:rPr>
+              <w:rFonts w:eastAsiaTheme="minorEastAsia"/>
+              <w:noProof/>
+              <w:lang w:eastAsia="en-GB"/>
+            </w:rPr>
+          </w:pPr>
+          <w:hyperlink w:anchor="_Toc213846636" w:history="1">
+            <w:r>
+              <w:rPr>
+                <w:rStyle w:val="Hyperlink"/>
+                <w:noProof/>
+              </w:rPr>
+              <w:t>Analysis</w:t>
+            </w:r>
+            <w:r>
+              <w:rPr>
+                <w:noProof/>
+                <w:webHidden/>
+              </w:rPr>
+              <w:tab/>
+            </w:r>
+            <w:r>
+              <w:rPr>
+                <w:noProof/>
+                <w:webHidden/>
+              </w:rPr>
+              <w:fldChar w:fldCharType="begin"/>
+            </w:r>
+            <w:r>
+              <w:rPr>
+                <w:noProof/>
+                <w:webHidden/>
+              </w:rPr>
+              <w:instrText xml:space="preserve"> PAGEREF _Toc213846636 \h </w:instrText>
+            </w:r>
+            <w:r>
+              <w:rPr>
+                <w:noProof/>
+                <w:webHidden/>
+              </w:rPr>
+            </w:r>
+            <w:r>
+              <w:rPr>
+                <w:noProof/>
+                <w:webHidden/>
+              </w:rPr>
+              <w:fldChar w:fldCharType="separate"/>
+            </w:r>
+            <w:r>
+              <w:rPr>
+                <w:noProof/>
+                <w:webHidden/>
+              </w:rPr>
+              <w:t>10</w:t>
+            </w:r>
+            <w:r>
+              <w:rPr>
+                <w:noProof/>
+                <w:webHidden/>
+              </w:rPr>
+              <w:fldChar w:fldCharType="end"/>
+            </w:r>
+          </w:hyperlink>
+        </w:p>
+        <w:p>
+          <w:pPr>
+            <w:pStyle w:val="TOC3"/>
+            <w:tabs>
+              <w:tab w:val="right" w:leader="dot" w:pos="9016"/>
+            </w:tabs>
+            <w:rPr>
+              <w:rFonts w:eastAsiaTheme="minorEastAsia"/>
+              <w:noProof/>
+              <w:lang w:eastAsia="en-GB"/>
+            </w:rPr>
+          </w:pPr>
+          <w:hyperlink w:anchor="_Toc213846637" w:history="1">
+            <w:r>
+              <w:rPr>
+                <w:rStyle w:val="Hyperlink"/>
+                <w:noProof/>
+              </w:rPr>
+              <w:t>Success Criteria</w:t>
+            </w:r>
+            <w:r>
+              <w:rPr>
+                <w:noProof/>
+                <w:webHidden/>
+              </w:rPr>
+              <w:tab/>
+            </w:r>
+            <w:r>
+              <w:rPr>
+                <w:noProof/>
+                <w:webHidden/>
+              </w:rPr>
+              <w:fldChar w:fldCharType="begin"/>
+            </w:r>
+            <w:r>
+              <w:rPr>
+                <w:noProof/>
+                <w:webHidden/>
+              </w:rPr>
+              <w:instrText xml:space="preserve"> PAGEREF _Toc213846637 \h </w:instrText>
+            </w:r>
+            <w:r>
+              <w:rPr>
+                <w:noProof/>
+                <w:webHidden/>
+              </w:rPr>
+            </w:r>
+            <w:r>
+              <w:rPr>
+                <w:noProof/>
+                <w:webHidden/>
+              </w:rPr>
+              <w:fldChar w:fldCharType="separate"/>
+            </w:r>
+            <w:r>
+              <w:rPr>
+                <w:noProof/>
+                <w:webHidden/>
+              </w:rPr>
+              <w:t>10</w:t>
+            </w:r>
+            <w:r>
+              <w:rPr>
+                <w:noProof/>
+                <w:webHidden/>
+              </w:rPr>
+              <w:fldChar w:fldCharType="end"/>
+            </w:r>
+          </w:hyperlink>
+        </w:p>
+        <w:p>
+          <w:pPr>
+            <w:pStyle w:val="TOC3"/>
+            <w:tabs>
+              <w:tab w:val="right" w:leader="dot" w:pos="9016"/>
+            </w:tabs>
+            <w:rPr>
+              <w:rFonts w:eastAsiaTheme="minorEastAsia"/>
+              <w:noProof/>
+              <w:lang w:eastAsia="en-GB"/>
+            </w:rPr>
+          </w:pPr>
+          <w:hyperlink w:anchor="_Toc213846638" w:history="1">
+            <w:r>
+              <w:rPr>
+                <w:rStyle w:val="Hyperlink"/>
+                <w:noProof/>
+              </w:rPr>
+              <w:t>Pre development tests</w:t>
+            </w:r>
+            <w:r>
+              <w:rPr>
+                <w:noProof/>
+                <w:webHidden/>
+              </w:rPr>
+              <w:tab/>
+            </w:r>
+            <w:r>
+              <w:rPr>
+                <w:noProof/>
+                <w:webHidden/>
+              </w:rPr>
+              <w:fldChar w:fldCharType="begin"/>
+            </w:r>
+            <w:r>
+              <w:rPr>
+                <w:noProof/>
+                <w:webHidden/>
+              </w:rPr>
+              <w:instrText xml:space="preserve"> PAGEREF _Toc213846638 \h </w:instrText>
+            </w:r>
+            <w:r>
+              <w:rPr>
+                <w:noProof/>
+                <w:webHidden/>
+              </w:rPr>
+            </w:r>
+            <w:r>
+              <w:rPr>
+                <w:noProof/>
+                <w:webHidden/>
+              </w:rPr>
+              <w:fldChar w:fldCharType="separate"/>
+            </w:r>
+            <w:r>
+              <w:rPr>
+                <w:noProof/>
+                <w:webHidden/>
+              </w:rPr>
+              <w:t>11</w:t>
+            </w:r>
+            <w:r>
+              <w:rPr>
+                <w:noProof/>
+                <w:webHidden/>
+              </w:rPr>
+              <w:fldChar w:fldCharType="end"/>
+            </w:r>
+          </w:hyperlink>
+        </w:p>
+        <w:p>
+          <w:pPr>
+            <w:pStyle w:val="TOC3"/>
+            <w:tabs>
+              <w:tab w:val="right" w:leader="dot" w:pos="9016"/>
+            </w:tabs>
+            <w:rPr>
+              <w:rFonts w:eastAsiaTheme="minorEastAsia"/>
+              <w:noProof/>
+              <w:lang w:eastAsia="en-GB"/>
+            </w:rPr>
+          </w:pPr>
+          <w:hyperlink w:anchor="_Toc213846639" w:history="1">
+            <w:r>
+              <w:rPr>
+                <w:rStyle w:val="Hyperlink"/>
+                <w:noProof/>
+              </w:rPr>
+              <w:t>Design</w:t>
+            </w:r>
+            <w:r>
+              <w:rPr>
+                <w:noProof/>
+                <w:webHidden/>
+              </w:rPr>
+              <w:tab/>
+            </w:r>
+            <w:r>
+              <w:rPr>
+                <w:noProof/>
+                <w:webHidden/>
+              </w:rPr>
+              <w:fldChar w:fldCharType="begin"/>
+            </w:r>
+            <w:r>
+              <w:rPr>
+                <w:noProof/>
+                <w:webHidden/>
+              </w:rPr>
+              <w:instrText xml:space="preserve"> PAGEREF _Toc213846639 \h </w:instrText>
+            </w:r>
+            <w:r>
+              <w:rPr>
+                <w:noProof/>
+                <w:webHidden/>
+              </w:rPr>
+            </w:r>
+            <w:r>
+              <w:rPr>
+                <w:noProof/>
+                <w:webHidden/>
+              </w:rPr>
+              <w:fldChar w:fldCharType="separate"/>
+            </w:r>
+            <w:r>
+              <w:rPr>
+                <w:noProof/>
+                <w:webHidden/>
+              </w:rPr>
+              <w:t>11</w:t>
             </w:r>
             <w:r>
               <w:rPr>
@@ -937,7 +1427,7 @@
               <w:lang w:eastAsia="en-GB"/>
             </w:rPr>
           </w:pPr>
-          <w:hyperlink w:anchor="_Toc213244608" w:history="1">
+          <w:hyperlink w:anchor="_Toc213846640" w:history="1">
             <w:r>
               <w:rPr>
                 <w:rStyle w:val="Hyperlink"/>
@@ -964,7 +1454,7 @@
                 <w:noProof/>
                 <w:webHidden/>
               </w:rPr>
-              <w:instrText xml:space="preserve"> PAGEREF _Toc213244608 \h </w:instrText>
+              <w:instrText xml:space="preserve"> PAGEREF _Toc213846640 \h </w:instrText>
             </w:r>
             <w:r>
               <w:rPr>
@@ -984,7 +1474,7 @@
                 <w:noProof/>
                 <w:webHidden/>
               </w:rPr>
-              <w:t>9</w:t>
+              <w:t>11</w:t>
             </w:r>
             <w:r>
               <w:rPr>
@@ -1012,7 +1502,7 @@
       <w:pPr>
         <w:pStyle w:val="Heading1"/>
       </w:pPr>
-      <w:bookmarkStart w:id="0" w:name="_Toc213244599"/>
+      <w:bookmarkStart w:id="0" w:name="_Toc213846624"/>
       <w:r>
         <w:t>Introduction</w:t>
       </w:r>
@@ -1032,7 +1522,15 @@
         <w:t xml:space="preserve">: </w:t>
       </w:r>
       <w:r>
-        <w:t xml:space="preserve">A block based </w:t>
+        <w:t xml:space="preserve">A </w:t>
+      </w:r>
+      <w:proofErr w:type="gramStart"/>
+      <w:r>
+        <w:t>block based</w:t>
+      </w:r>
+      <w:proofErr w:type="gramEnd"/>
+      <w:r>
+        <w:t xml:space="preserve"> </w:t>
       </w:r>
       <w:r>
         <w:t xml:space="preserve">coding editor to allow </w:t>
@@ -1044,7 +1542,15 @@
         <w:t xml:space="preserve">, by giving them a familiar interface </w:t>
       </w:r>
       <w:r>
-        <w:t xml:space="preserve">of block based coding, to allow them to learn how to code microcontrollers and have a basic understanding of electronics. </w:t>
+        <w:t xml:space="preserve">of </w:t>
+      </w:r>
+      <w:proofErr w:type="gramStart"/>
+      <w:r>
+        <w:t>block based</w:t>
+      </w:r>
+      <w:proofErr w:type="gramEnd"/>
+      <w:r>
+        <w:t xml:space="preserve"> coding, to allow them to learn how to code microcontrollers and have a basic understanding of electronics. </w:t>
       </w:r>
       <w:r>
         <w:t xml:space="preserve">My main goal with this project is to be able to help other </w:t>
@@ -1071,7 +1577,11 @@
         <w:t xml:space="preserve">young when my dad bought me my first raspberry pi microcomputer. </w:t>
       </w:r>
       <w:r>
-        <w:t xml:space="preserve">This then got me hooked on working on these sorts of devices, as I found them challenging and </w:t>
+        <w:t xml:space="preserve">This then got me hooked on working on these sorts of devices, as I found them challenging </w:t>
+      </w:r>
+      <w:r>
+        <w:lastRenderedPageBreak/>
+        <w:t xml:space="preserve">and </w:t>
       </w:r>
       <w:r>
         <w:t>this love for them set me up for later in my school journey</w:t>
@@ -1113,7 +1623,15 @@
         <w:t xml:space="preserve">are key to any person who wants to go into any electronics or </w:t>
       </w:r>
       <w:r>
-        <w:t xml:space="preserve">computer science based </w:t>
+        <w:t xml:space="preserve">computer </w:t>
+      </w:r>
+      <w:proofErr w:type="gramStart"/>
+      <w:r>
+        <w:t>science based</w:t>
+      </w:r>
+      <w:proofErr w:type="gramEnd"/>
+      <w:r>
+        <w:t xml:space="preserve"> </w:t>
       </w:r>
       <w:r>
         <w:t xml:space="preserve">courses later in life. </w:t>
@@ -1124,15 +1642,16 @@
       <w:r>
         <w:t xml:space="preserve">, they will have the ability to have code transferred to them as the block will be able to </w:t>
       </w:r>
-      <w:r>
-        <w:t xml:space="preserve">compiled into code that </w:t>
-      </w:r>
-      <w:r>
-        <w:t xml:space="preserve">then will be able to run on the </w:t>
-      </w:r>
-      <w:r>
-        <w:lastRenderedPageBreak/>
-        <w:t>said microcontroller</w:t>
+      <w:proofErr w:type="gramStart"/>
+      <w:r>
+        <w:t>compiled</w:t>
+      </w:r>
+      <w:proofErr w:type="gramEnd"/>
+      <w:r>
+        <w:t xml:space="preserve"> into code that </w:t>
+      </w:r>
+      <w:r>
+        <w:t>then will be able to run on the said microcontroller</w:t>
       </w:r>
       <w:r>
         <w:t xml:space="preserve"> when compiled. </w:t>
@@ -1156,7 +1675,23 @@
         <w:t xml:space="preserve"> </w:t>
       </w:r>
       <w:r>
-        <w:t>through his expertise in this area. His skillset is similar to mine but he has more understanding on what students would want for coding with microcontrollers</w:t>
+        <w:t xml:space="preserve">through his expertise in this area. His skillset is </w:t>
+      </w:r>
+      <w:proofErr w:type="gramStart"/>
+      <w:r>
+        <w:t>similar to</w:t>
+      </w:r>
+      <w:proofErr w:type="gramEnd"/>
+      <w:r>
+        <w:t xml:space="preserve"> </w:t>
+      </w:r>
+      <w:proofErr w:type="gramStart"/>
+      <w:r>
+        <w:t>mine</w:t>
+      </w:r>
+      <w:proofErr w:type="gramEnd"/>
+      <w:r>
+        <w:t xml:space="preserve"> but he has more understanding on what students would want for coding with microcontrollers</w:t>
       </w:r>
       <w:r>
         <w:t>.</w:t>
@@ -1177,7 +1712,15 @@
         <w:t xml:space="preserve">I have had previous experiences </w:t>
       </w:r>
       <w:r>
-        <w:t xml:space="preserve">working with students and a block based coding editor, in the past I have used </w:t>
+        <w:t xml:space="preserve">working with students and a </w:t>
+      </w:r>
+      <w:proofErr w:type="gramStart"/>
+      <w:r>
+        <w:t>block based</w:t>
+      </w:r>
+      <w:proofErr w:type="gramEnd"/>
+      <w:r>
+        <w:t xml:space="preserve"> coding editor, in the past I have used </w:t>
       </w:r>
       <w:proofErr w:type="spellStart"/>
       <w:r>
@@ -1258,7 +1801,7 @@
       <w:pPr>
         <w:pStyle w:val="Heading1"/>
       </w:pPr>
-      <w:bookmarkStart w:id="1" w:name="_Toc213244600"/>
+      <w:bookmarkStart w:id="1" w:name="_Toc213846625"/>
       <w:r>
         <w:t>Research</w:t>
       </w:r>
@@ -1268,7 +1811,7 @@
       <w:pPr>
         <w:pStyle w:val="Heading2"/>
       </w:pPr>
-      <w:bookmarkStart w:id="2" w:name="_Toc213244601"/>
+      <w:bookmarkStart w:id="2" w:name="_Toc213846626"/>
       <w:r>
         <w:t>Pre-requisites</w:t>
       </w:r>
@@ -1366,6 +1909,7 @@
     <w:p/>
     <w:p>
       <w:r>
+        <w:lastRenderedPageBreak/>
         <w:t>For this project I was originally going to use Golang as it is a modern compiled language that I had seen used for other complex projects</w:t>
       </w:r>
       <w:r>
@@ -1404,6 +1948,7 @@
       <w:r>
         <w:t>it would get stuck compiling, then when I tested it without the framework it would compile with no problems</w:t>
       </w:r>
+      <w:proofErr w:type="gramStart"/>
       <w:r>
         <w:t>.</w:t>
       </w:r>
@@ -1411,7 +1956,19 @@
         <w:t xml:space="preserve"> </w:t>
       </w:r>
       <w:r>
-        <w:t xml:space="preserve">. So I have made the decision to change </w:t>
+        <w:t>.</w:t>
+      </w:r>
+      <w:proofErr w:type="gramEnd"/>
+      <w:r>
+        <w:t xml:space="preserve"> </w:t>
+      </w:r>
+      <w:proofErr w:type="gramStart"/>
+      <w:r>
+        <w:t>So</w:t>
+      </w:r>
+      <w:proofErr w:type="gramEnd"/>
+      <w:r>
+        <w:t xml:space="preserve"> I have made the decision to change </w:t>
       </w:r>
       <w:r>
         <w:t xml:space="preserve">my coding language to using </w:t>
@@ -1434,7 +1991,7 @@
       <w:pPr>
         <w:pStyle w:val="Heading2"/>
       </w:pPr>
-      <w:bookmarkStart w:id="3" w:name="_Toc213244602"/>
+      <w:bookmarkStart w:id="3" w:name="_Toc213846627"/>
       <w:r>
         <w:t>Partial solutions</w:t>
       </w:r>
@@ -1442,7 +1999,15 @@
     </w:p>
     <w:p>
       <w:r>
-        <w:t>There are a few solutions similar to what I am wanting to do:</w:t>
+        <w:t xml:space="preserve">There are a few solutions </w:t>
+      </w:r>
+      <w:proofErr w:type="gramStart"/>
+      <w:r>
+        <w:t>similar to</w:t>
+      </w:r>
+      <w:proofErr w:type="gramEnd"/>
+      <w:r>
+        <w:t xml:space="preserve"> what I am wanting to do:</w:t>
       </w:r>
     </w:p>
     <w:p>
@@ -1462,7 +2027,15 @@
         <w:t>,</w:t>
       </w:r>
       <w:r>
-        <w:t xml:space="preserve"> A block based coding editor that is the basis for multiple well know solutions e.g. </w:t>
+        <w:t xml:space="preserve"> A </w:t>
+      </w:r>
+      <w:proofErr w:type="gramStart"/>
+      <w:r>
+        <w:t>block based</w:t>
+      </w:r>
+      <w:proofErr w:type="gramEnd"/>
+      <w:r>
+        <w:t xml:space="preserve"> coding editor that is the basis for multiple well know solutions e.g. </w:t>
       </w:r>
       <w:r>
         <w:t xml:space="preserve">scratch </w:t>
@@ -1569,7 +2142,15 @@
         <w:t xml:space="preserve">, </w:t>
       </w:r>
       <w:r>
-        <w:t xml:space="preserve">A block based coding editor that has used the </w:t>
+        <w:t xml:space="preserve">A </w:t>
+      </w:r>
+      <w:proofErr w:type="gramStart"/>
+      <w:r>
+        <w:t>block based</w:t>
+      </w:r>
+      <w:proofErr w:type="gramEnd"/>
+      <w:r>
+        <w:t xml:space="preserve"> coding editor that has used the </w:t>
       </w:r>
       <w:proofErr w:type="spellStart"/>
       <w:r>
@@ -1611,6 +2192,7 @@
         <w:rPr>
           <w:noProof/>
         </w:rPr>
+        <w:lastRenderedPageBreak/>
         <w:drawing>
           <wp:inline distT="0" distB="0" distL="0" distR="0" wp14:anchorId="0636DEEA" wp14:editId="5EF13DB3">
             <wp:extent cx="3803650" cy="1606416"/>
@@ -1709,7 +2291,6 @@
         <w:rPr>
           <w:noProof/>
         </w:rPr>
-        <w:lastRenderedPageBreak/>
         <w:drawing>
           <wp:inline distT="0" distB="0" distL="0" distR="0" wp14:anchorId="096DF2F6" wp14:editId="14708199">
             <wp:extent cx="4629150" cy="1853506"/>
@@ -2052,10 +2633,12 @@
               <w:t xml:space="preserve">Requires that you use </w:t>
             </w:r>
             <w:proofErr w:type="spellStart"/>
+            <w:proofErr w:type="gramStart"/>
             <w:r>
               <w:t>there</w:t>
             </w:r>
             <w:proofErr w:type="spellEnd"/>
+            <w:proofErr w:type="gramEnd"/>
             <w:r>
               <w:t xml:space="preserve"> hardware only</w:t>
             </w:r>
@@ -2087,8 +2670,9 @@
       <w:pPr>
         <w:pStyle w:val="Heading2"/>
       </w:pPr>
-      <w:bookmarkStart w:id="4" w:name="_Toc213244603"/>
-      <w:r>
+      <w:bookmarkStart w:id="4" w:name="_Toc213846628"/>
+      <w:r>
+        <w:lastRenderedPageBreak/>
         <w:t>Key features</w:t>
       </w:r>
       <w:bookmarkEnd w:id="4"/>
@@ -2595,7 +3179,6 @@
           </w:tcPr>
           <w:p>
             <w:r>
-              <w:lastRenderedPageBreak/>
               <w:t>Framework</w:t>
             </w:r>
           </w:p>
@@ -2677,8 +3260,13 @@
               </w:numPr>
             </w:pPr>
             <w:r>
-              <w:t>It is a lightweight</w:t>
-            </w:r>
+              <w:t xml:space="preserve">It is a </w:t>
+            </w:r>
+            <w:proofErr w:type="gramStart"/>
+            <w:r>
+              <w:t>lightweight</w:t>
+            </w:r>
+            <w:proofErr w:type="gramEnd"/>
             <w:r>
               <w:t xml:space="preserve"> so it does not use much system memory</w:t>
             </w:r>
@@ -2916,8 +3504,13 @@
       <w:r>
         <w:t xml:space="preserve">to use the inbuilt </w:t>
       </w:r>
-      <w:r>
-        <w:t xml:space="preserve">std::io </w:t>
+      <w:proofErr w:type="gramStart"/>
+      <w:r>
+        <w:t>std::</w:t>
+      </w:r>
+      <w:proofErr w:type="gramEnd"/>
+      <w:r>
+        <w:t xml:space="preserve">io </w:t>
       </w:r>
       <w:r>
         <w:t xml:space="preserve">library that is inbuilt into </w:t>
@@ -2965,14 +3558,18 @@
         <w:t>code will be able to compiled and sent to the Arduino.</w:t>
       </w:r>
       <w:r>
-        <w:t xml:space="preserve"> This </w:t>
-      </w:r>
-      <w:r>
-        <w:lastRenderedPageBreak/>
-        <w:t>library will allow me to read each block from the Json file and allow me to have the show attributes. T</w:t>
-      </w:r>
-      <w:r>
-        <w:t xml:space="preserve">o use Json files I am going to </w:t>
+        <w:t xml:space="preserve"> This library will allow me to read each block from the Json file and allow me to have the show attributes. T</w:t>
+      </w:r>
+      <w:r>
+        <w:t xml:space="preserve">o use Json </w:t>
+      </w:r>
+      <w:proofErr w:type="gramStart"/>
+      <w:r>
+        <w:t>files</w:t>
+      </w:r>
+      <w:proofErr w:type="gramEnd"/>
+      <w:r>
+        <w:t xml:space="preserve"> I am going to </w:t>
       </w:r>
       <w:r>
         <w:t xml:space="preserve">use </w:t>
@@ -3100,7 +3697,7 @@
       <w:pPr>
         <w:pStyle w:val="Heading2"/>
       </w:pPr>
-      <w:bookmarkStart w:id="6" w:name="_Toc213244604"/>
+      <w:bookmarkStart w:id="6" w:name="_Toc213846629"/>
       <w:r>
         <w:t>Stake</w:t>
       </w:r>
@@ -3172,11 +3769,12 @@
       <w:pPr>
         <w:pStyle w:val="Heading1"/>
       </w:pPr>
-      <w:bookmarkStart w:id="7" w:name="_Toc213244605"/>
+      <w:bookmarkStart w:id="7" w:name="_Toc213846630"/>
       <w:r>
         <w:rPr>
           <w:noProof/>
         </w:rPr>
+        <w:lastRenderedPageBreak/>
         <w:drawing>
           <wp:anchor distT="0" distB="0" distL="114300" distR="114300" simplePos="0" relativeHeight="251658240" behindDoc="0" locked="0" layoutInCell="1" allowOverlap="1" wp14:anchorId="7AEF8537" wp14:editId="4377A07B">
             <wp:simplePos x="0" y="0"/>
@@ -3255,6 +3853,16 @@
     <w:p/>
     <w:p/>
     <w:p>
+      <w:pPr>
+        <w:pStyle w:val="Heading2"/>
+      </w:pPr>
+      <w:bookmarkStart w:id="8" w:name="_Toc213846631"/>
+      <w:r>
+        <w:t>Hardware specifications</w:t>
+      </w:r>
+      <w:bookmarkEnd w:id="8"/>
+    </w:p>
+    <w:p>
       <w:r>
         <w:t xml:space="preserve">For this program to be available to </w:t>
       </w:r>
@@ -3282,13 +3890,152 @@
       <w:r>
         <w:t xml:space="preserve">. </w:t>
       </w:r>
+      <w:r>
+        <w:t>This will allow any machine within the school to be able to run the program</w:t>
+      </w:r>
+      <w:r>
+        <w:t xml:space="preserve">. In addition to this </w:t>
+      </w:r>
+      <w:r>
+        <w:t xml:space="preserve">I need it to be able to run on my laptop, which is a Lenovo </w:t>
+      </w:r>
+      <w:r>
+        <w:t>ThinkPad</w:t>
+      </w:r>
+      <w:r>
+        <w:t xml:space="preserve"> </w:t>
+      </w:r>
+      <w:r>
+        <w:t>14s Gen 2 with a</w:t>
+      </w:r>
+      <w:r>
+        <w:t>n</w:t>
+      </w:r>
+      <w:r>
+        <w:t xml:space="preserve"> Intel i7 1165G7 and 8GB and </w:t>
+      </w:r>
+      <w:r>
+        <w:t>Intel iris Xe graphics which are integrated</w:t>
+      </w:r>
+      <w:r>
+        <w:t xml:space="preserve">. </w:t>
+      </w:r>
     </w:p>
     <w:p/>
     <w:p>
       <w:pPr>
+        <w:pStyle w:val="Heading2"/>
+      </w:pPr>
+      <w:bookmarkStart w:id="9" w:name="_Toc213846632"/>
+      <w:r>
+        <w:t>Software specifications</w:t>
+      </w:r>
+      <w:bookmarkEnd w:id="9"/>
+    </w:p>
+    <w:p>
+      <w:r>
+        <w:t xml:space="preserve">For this program </w:t>
+      </w:r>
+      <w:r>
+        <w:t xml:space="preserve">I am going to use </w:t>
+      </w:r>
+      <w:r>
+        <w:t xml:space="preserve">windows 11 </w:t>
+      </w:r>
+      <w:r>
+        <w:t xml:space="preserve">as this is the current </w:t>
+      </w:r>
+      <w:r>
+        <w:t xml:space="preserve">operating system that is used by both my laptop and the machines within school. Windows 11 also happens to be the most up to date version of windows that Microsoft offer so </w:t>
+      </w:r>
+      <w:r>
+        <w:t xml:space="preserve">it will have the best support. </w:t>
+      </w:r>
+    </w:p>
+    <w:p>
+      <w:pPr>
+        <w:rPr>
+          <w:i/>
+          <w:iCs/>
+        </w:rPr>
+      </w:pPr>
+      <w:r>
+        <w:t xml:space="preserve">For the programming language I am going to use </w:t>
+      </w:r>
+      <w:r>
+        <w:t xml:space="preserve">rust version 1.92.0 nightly with </w:t>
+      </w:r>
+      <w:proofErr w:type="spellStart"/>
+      <w:r>
+        <w:t>rustc</w:t>
+      </w:r>
+      <w:proofErr w:type="spellEnd"/>
+      <w:r>
+        <w:t xml:space="preserve"> 1.92.0 and cargo 1.92.0 as this is what I currently have installed on my </w:t>
+      </w:r>
+      <w:proofErr w:type="gramStart"/>
+      <w:r>
+        <w:t>machine</w:t>
+      </w:r>
+      <w:proofErr w:type="gramEnd"/>
+      <w:r>
+        <w:t xml:space="preserve"> and this will allow me to code in rust and compile my code into </w:t>
+      </w:r>
+      <w:proofErr w:type="gramStart"/>
+      <w:r>
+        <w:t>a</w:t>
+      </w:r>
+      <w:proofErr w:type="gramEnd"/>
+      <w:r>
+        <w:t xml:space="preserve"> </w:t>
+      </w:r>
+      <w:r>
+        <w:t xml:space="preserve">executable file. With this I am going to be using Egui 0.33 as the library I use for creating the window, and </w:t>
+      </w:r>
+      <w:proofErr w:type="spellStart"/>
+      <w:r>
+        <w:t>serde_json</w:t>
+      </w:r>
+      <w:proofErr w:type="spellEnd"/>
+      <w:r>
+        <w:t xml:space="preserve"> 1.0</w:t>
+      </w:r>
+      <w:r>
+        <w:t xml:space="preserve">.145 for access to the blocks </w:t>
+      </w:r>
+      <w:proofErr w:type="spellStart"/>
+      <w:r>
+        <w:t>json</w:t>
+      </w:r>
+      <w:proofErr w:type="spellEnd"/>
+      <w:r>
+        <w:t xml:space="preserve"> files </w:t>
+      </w:r>
+      <w:r>
+        <w:t xml:space="preserve">for compilation of the code ready for the </w:t>
+      </w:r>
+      <w:r>
+        <w:t xml:space="preserve">Arduino, for this </w:t>
+      </w:r>
+      <w:r>
+        <w:t xml:space="preserve">I am going to need </w:t>
+      </w:r>
+      <w:r>
+        <w:t xml:space="preserve">to use Arduino Cli </w:t>
+      </w:r>
+      <w:r>
+        <w:rPr>
+          <w:i/>
+          <w:iCs/>
+        </w:rPr>
+        <w:t>Insert version</w:t>
+      </w:r>
+    </w:p>
+    <w:p>
+      <w:pPr>
         <w:pStyle w:val="Heading1"/>
       </w:pPr>
-      <w:bookmarkStart w:id="8" w:name="_Toc213244606"/>
+      <w:bookmarkStart w:id="10" w:name="_Toc213846633"/>
       <w:r>
         <w:t>Sprint</w:t>
       </w:r>
@@ -3298,76 +4045,697 @@
       <w:r>
         <w:t>:</w:t>
       </w:r>
-      <w:bookmarkEnd w:id="8"/>
+      <w:bookmarkEnd w:id="10"/>
+    </w:p>
+    <w:p>
+      <w:r>
+        <w:t>S</w:t>
+      </w:r>
+      <w:r>
+        <w:t>X</w:t>
+      </w:r>
+      <w:r>
+        <w:t xml:space="preserve"> </w:t>
+      </w:r>
+      <w:r>
+        <w:t>SCX</w:t>
+      </w:r>
+      <w:r>
+        <w:t>/TX</w:t>
+      </w:r>
+      <w:r>
+        <w:t xml:space="preserve"> S=</w:t>
+      </w:r>
+      <w:proofErr w:type="gramStart"/>
+      <w:r>
+        <w:t>sprint</w:t>
+      </w:r>
+      <w:r>
+        <w:t xml:space="preserve">, </w:t>
+      </w:r>
+      <w:r>
+        <w:t xml:space="preserve"> X</w:t>
+      </w:r>
+      <w:proofErr w:type="gramEnd"/>
+      <w:r>
+        <w:t xml:space="preserve">=number of sprint or </w:t>
+      </w:r>
+      <w:r>
+        <w:t>success criteria or test, T = test</w:t>
+      </w:r>
     </w:p>
     <w:p>
       <w:pPr>
         <w:pStyle w:val="Heading2"/>
       </w:pPr>
-      <w:bookmarkStart w:id="9" w:name="_Toc213244607"/>
-      <w:r>
+      <w:bookmarkStart w:id="11" w:name="_Toc213846634"/>
+      <w:r>
+        <w:lastRenderedPageBreak/>
         <w:t>Sprint 1</w:t>
       </w:r>
-      <w:bookmarkEnd w:id="9"/>
+      <w:bookmarkEnd w:id="11"/>
       <w:r>
         <w:t xml:space="preserve"> </w:t>
       </w:r>
     </w:p>
     <w:p>
-      <w:r>
-        <w:t xml:space="preserve">For my first sprint </w:t>
-      </w:r>
-      <w:r>
-        <w:t>I</w:t>
-      </w:r>
-      <w:r>
-        <w:t xml:space="preserve"> am going to o</w:t>
-      </w:r>
-      <w:r>
-        <w:t>pen window</w:t>
-      </w:r>
-    </w:p>
+      <w:pPr>
+        <w:pStyle w:val="Heading3"/>
+      </w:pPr>
+      <w:bookmarkStart w:id="12" w:name="_Toc213846635"/>
+      <w:r>
+        <w:t>Intro</w:t>
+      </w:r>
+      <w:bookmarkEnd w:id="12"/>
+    </w:p>
+    <w:p>
+      <w:r>
+        <w:t xml:space="preserve">For this sprint I am going to begin by </w:t>
+      </w:r>
+      <w:r>
+        <w:t xml:space="preserve">having a simple window open using Egui that will act as the basis for the rest of my project to work on top of. I am doing this as this will act as the </w:t>
+      </w:r>
+      <w:r>
+        <w:t xml:space="preserve">basic structure for the entire project as this is where the editor is going to work within so if I cannot open the </w:t>
+      </w:r>
+      <w:proofErr w:type="gramStart"/>
+      <w:r>
+        <w:t>window</w:t>
+      </w:r>
+      <w:proofErr w:type="gramEnd"/>
+      <w:r>
+        <w:t xml:space="preserve"> I will not be able to complete this project. </w:t>
+      </w:r>
+    </w:p>
+    <w:p>
+      <w:pPr>
+        <w:pStyle w:val="Heading3"/>
+      </w:pPr>
+      <w:bookmarkStart w:id="13" w:name="_Toc213846636"/>
+      <w:r>
+        <w:t>Analysis</w:t>
+      </w:r>
+      <w:bookmarkEnd w:id="13"/>
+    </w:p>
+    <w:p>
+      <w:r>
+        <w:t>This sprint is going to be the beginning of the project as this is the ope</w:t>
+      </w:r>
+      <w:r>
+        <w:t xml:space="preserve">ning of the window that the rest of the project will work in. For this I </w:t>
+      </w:r>
+      <w:r>
+        <w:t xml:space="preserve">am going to use the Egui library that will </w:t>
+      </w:r>
+      <w:r>
+        <w:t xml:space="preserve">be the basis for the </w:t>
+      </w:r>
+      <w:r>
+        <w:t>project,</w:t>
+      </w:r>
+      <w:r>
+        <w:t xml:space="preserve"> and I will build upon in later sprints</w:t>
+      </w:r>
+      <w:r>
+        <w:t xml:space="preserve">. </w:t>
+      </w:r>
+      <w:r>
+        <w:t xml:space="preserve">For this </w:t>
+      </w:r>
+      <w:r>
+        <w:t xml:space="preserve">sprint the window needs to be able to open and </w:t>
+      </w:r>
+      <w:proofErr w:type="gramStart"/>
+      <w:r>
+        <w:t>have the ability to</w:t>
+      </w:r>
+      <w:proofErr w:type="gramEnd"/>
+      <w:r>
+        <w:t xml:space="preserve"> be resizable. </w:t>
+      </w:r>
+      <w:r>
+        <w:t xml:space="preserve">For this sprint I have done research into </w:t>
+      </w:r>
+      <w:r>
+        <w:t xml:space="preserve">different window </w:t>
+      </w:r>
+      <w:proofErr w:type="gramStart"/>
+      <w:r>
+        <w:t>frameworks</w:t>
+      </w:r>
+      <w:proofErr w:type="gramEnd"/>
+      <w:r>
+        <w:t xml:space="preserve"> and it seems that </w:t>
+      </w:r>
+      <w:r>
+        <w:t>Egui is the choice for many people as it has the easiest learning curve in terms of going from not knowing anything to having a full working window</w:t>
+      </w:r>
+      <w:r>
+        <w:t xml:space="preserve">. </w:t>
+      </w:r>
+    </w:p>
+    <w:p/>
+    <w:p>
+      <w:pPr>
+        <w:pStyle w:val="Heading3"/>
+      </w:pPr>
+      <w:bookmarkStart w:id="14" w:name="_Toc213846637"/>
+      <w:r>
+        <w:t>Success Criteria</w:t>
+      </w:r>
+      <w:bookmarkEnd w:id="14"/>
+    </w:p>
+    <w:tbl>
+      <w:tblPr>
+        <w:tblStyle w:val="TableGrid"/>
+        <w:tblW w:w="11711" w:type="dxa"/>
+        <w:tblInd w:w="-1370" w:type="dxa"/>
+        <w:tblLook w:val="04A0" w:firstRow="1" w:lastRow="0" w:firstColumn="1" w:lastColumn="0" w:noHBand="0" w:noVBand="1"/>
+      </w:tblPr>
+      <w:tblGrid>
+        <w:gridCol w:w="965"/>
+        <w:gridCol w:w="1960"/>
+        <w:gridCol w:w="4252"/>
+        <w:gridCol w:w="2193"/>
+        <w:gridCol w:w="2341"/>
+      </w:tblGrid>
+      <w:tr>
+        <w:trPr>
+          <w:trHeight w:val="306"/>
+        </w:trPr>
+        <w:tc>
+          <w:tcPr>
+            <w:tcW w:w="965" w:type="dxa"/>
+          </w:tcPr>
+          <w:p>
+            <w:r>
+              <w:t>Unique ID</w:t>
+            </w:r>
+          </w:p>
+        </w:tc>
+        <w:tc>
+          <w:tcPr>
+            <w:tcW w:w="1960" w:type="dxa"/>
+          </w:tcPr>
+          <w:p>
+            <w:r>
+              <w:t>Success criteria</w:t>
+            </w:r>
+          </w:p>
+        </w:tc>
+        <w:tc>
+          <w:tcPr>
+            <w:tcW w:w="4252" w:type="dxa"/>
+          </w:tcPr>
+          <w:p>
+            <w:r>
+              <w:t>Explanation</w:t>
+            </w:r>
+          </w:p>
+        </w:tc>
+        <w:tc>
+          <w:tcPr>
+            <w:tcW w:w="2193" w:type="dxa"/>
+          </w:tcPr>
+          <w:p>
+            <w:r>
+              <w:t>Justification</w:t>
+            </w:r>
+          </w:p>
+        </w:tc>
+        <w:tc>
+          <w:tcPr>
+            <w:tcW w:w="2341" w:type="dxa"/>
+          </w:tcPr>
+          <w:p>
+            <w:r>
+              <w:t>Limitations</w:t>
+            </w:r>
+          </w:p>
+        </w:tc>
+      </w:tr>
+      <w:tr>
+        <w:trPr>
+          <w:trHeight w:val="1643"/>
+        </w:trPr>
+        <w:tc>
+          <w:tcPr>
+            <w:tcW w:w="965" w:type="dxa"/>
+          </w:tcPr>
+          <w:p>
+            <w:r>
+              <w:t>S1SC1</w:t>
+            </w:r>
+          </w:p>
+        </w:tc>
+        <w:tc>
+          <w:tcPr>
+            <w:tcW w:w="1960" w:type="dxa"/>
+          </w:tcPr>
+          <w:p>
+            <w:r>
+              <w:t>The window must open</w:t>
+            </w:r>
+          </w:p>
+        </w:tc>
+        <w:tc>
+          <w:tcPr>
+            <w:tcW w:w="4252" w:type="dxa"/>
+          </w:tcPr>
+          <w:p>
+            <w:r>
+              <w:t>Th</w:t>
+            </w:r>
+            <w:r>
+              <w:t xml:space="preserve">e window must </w:t>
+            </w:r>
+            <w:r>
+              <w:t>open with a known</w:t>
+            </w:r>
+            <w:r>
+              <w:t xml:space="preserve"> size for future reference</w:t>
+            </w:r>
+          </w:p>
+        </w:tc>
+        <w:tc>
+          <w:tcPr>
+            <w:tcW w:w="2193" w:type="dxa"/>
+          </w:tcPr>
+          <w:p>
+            <w:r>
+              <w:t xml:space="preserve">This will allow me to begin </w:t>
+            </w:r>
+            <w:r>
+              <w:t>building the project into the window</w:t>
+            </w:r>
+          </w:p>
+        </w:tc>
+        <w:tc>
+          <w:tcPr>
+            <w:tcW w:w="2341" w:type="dxa"/>
+          </w:tcPr>
+          <w:p>
+            <w:r>
+              <w:t xml:space="preserve">The framework </w:t>
+            </w:r>
+            <w:r>
+              <w:t>does not have certain necessities inbuilt so more libraires are needed</w:t>
+            </w:r>
+            <w:r>
+              <w:t>.</w:t>
+            </w:r>
+          </w:p>
+        </w:tc>
+      </w:tr>
+      <w:tr>
+        <w:trPr>
+          <w:trHeight w:val="1695"/>
+        </w:trPr>
+        <w:tc>
+          <w:tcPr>
+            <w:tcW w:w="965" w:type="dxa"/>
+          </w:tcPr>
+          <w:p>
+            <w:r>
+              <w:t>S1SC2</w:t>
+            </w:r>
+          </w:p>
+        </w:tc>
+        <w:tc>
+          <w:tcPr>
+            <w:tcW w:w="1960" w:type="dxa"/>
+          </w:tcPr>
+          <w:p>
+            <w:r>
+              <w:t xml:space="preserve">The window </w:t>
+            </w:r>
+            <w:proofErr w:type="gramStart"/>
+            <w:r>
+              <w:t>must  be</w:t>
+            </w:r>
+            <w:proofErr w:type="gramEnd"/>
+            <w:r>
+              <w:t xml:space="preserve"> 800x600 pixels in size</w:t>
+            </w:r>
+          </w:p>
+        </w:tc>
+        <w:tc>
+          <w:tcPr>
+            <w:tcW w:w="4252" w:type="dxa"/>
+          </w:tcPr>
+          <w:p>
+            <w:r>
+              <w:t xml:space="preserve">I feel that this size window would be big enough to allow a good space to work in and still have some room for the </w:t>
+            </w:r>
+            <w:r>
+              <w:t>block section on one side</w:t>
+            </w:r>
+          </w:p>
+        </w:tc>
+        <w:tc>
+          <w:tcPr>
+            <w:tcW w:w="2193" w:type="dxa"/>
+          </w:tcPr>
+          <w:p>
+            <w:r>
+              <w:t>This allows for good working space to block space</w:t>
+            </w:r>
+          </w:p>
+        </w:tc>
+        <w:tc>
+          <w:tcPr>
+            <w:tcW w:w="2341" w:type="dxa"/>
+          </w:tcPr>
+          <w:p>
+            <w:r>
+              <w:t xml:space="preserve">The window will not be fixed to that size as the framework has the </w:t>
+            </w:r>
+            <w:r>
+              <w:t>resizable option on by default</w:t>
+            </w:r>
+          </w:p>
+        </w:tc>
+      </w:tr>
+      <w:tr>
+        <w:trPr>
+          <w:trHeight w:val="1974"/>
+        </w:trPr>
+        <w:tc>
+          <w:tcPr>
+            <w:tcW w:w="965" w:type="dxa"/>
+          </w:tcPr>
+          <w:p>
+            <w:r>
+              <w:t>S1SC3</w:t>
+            </w:r>
+          </w:p>
+        </w:tc>
+        <w:tc>
+          <w:tcPr>
+            <w:tcW w:w="1960" w:type="dxa"/>
+          </w:tcPr>
+          <w:p>
+            <w:r>
+              <w:t xml:space="preserve">The window must have the title of </w:t>
+            </w:r>
+            <w:r>
+              <w:t>“</w:t>
+            </w:r>
+            <w:r>
+              <w:t>Blocks for Arduino</w:t>
+            </w:r>
+            <w:r>
+              <w:t>”</w:t>
+            </w:r>
+          </w:p>
+        </w:tc>
+        <w:tc>
+          <w:tcPr>
+            <w:tcW w:w="4252" w:type="dxa"/>
+          </w:tcPr>
+          <w:p>
+            <w:r>
+              <w:t xml:space="preserve">This will be the title of the project allowing for easier reference when opening the window </w:t>
+            </w:r>
+          </w:p>
+        </w:tc>
+        <w:tc>
+          <w:tcPr>
+            <w:tcW w:w="2193" w:type="dxa"/>
+          </w:tcPr>
+          <w:p>
+            <w:r>
+              <w:t>This is a simple enough name that is not confusing but also not too simple</w:t>
+            </w:r>
+          </w:p>
+        </w:tc>
+        <w:tc>
+          <w:tcPr>
+            <w:tcW w:w="2341" w:type="dxa"/>
+          </w:tcPr>
+          <w:p>
+            <w:r>
+              <w:t>The name is only seen at the top of the window and nowhere else</w:t>
+            </w:r>
+          </w:p>
+        </w:tc>
+      </w:tr>
+    </w:tbl>
+    <w:p/>
+    <w:p>
+      <w:pPr>
+        <w:pStyle w:val="Heading3"/>
+      </w:pPr>
+      <w:bookmarkStart w:id="15" w:name="_Toc213846638"/>
+      <w:proofErr w:type="gramStart"/>
+      <w:r>
+        <w:lastRenderedPageBreak/>
+        <w:t>Pre development</w:t>
+      </w:r>
+      <w:proofErr w:type="gramEnd"/>
+      <w:r>
+        <w:t xml:space="preserve"> t</w:t>
+      </w:r>
+      <w:r>
+        <w:t>ests</w:t>
+      </w:r>
+      <w:bookmarkEnd w:id="15"/>
+    </w:p>
+    <w:tbl>
+      <w:tblPr>
+        <w:tblStyle w:val="TableGrid"/>
+        <w:tblW w:w="0" w:type="auto"/>
+        <w:tblLook w:val="04A0" w:firstRow="1" w:lastRow="0" w:firstColumn="1" w:lastColumn="0" w:noHBand="0" w:noVBand="1"/>
+      </w:tblPr>
+      <w:tblGrid>
+        <w:gridCol w:w="2254"/>
+        <w:gridCol w:w="2254"/>
+        <w:gridCol w:w="2254"/>
+        <w:gridCol w:w="2254"/>
+      </w:tblGrid>
+      <w:tr>
+        <w:tc>
+          <w:tcPr>
+            <w:tcW w:w="2254" w:type="dxa"/>
+          </w:tcPr>
+          <w:p>
+            <w:r>
+              <w:t>Unique ID</w:t>
+            </w:r>
+          </w:p>
+        </w:tc>
+        <w:tc>
+          <w:tcPr>
+            <w:tcW w:w="2254" w:type="dxa"/>
+          </w:tcPr>
+          <w:p>
+            <w:r>
+              <w:t>Test ID</w:t>
+            </w:r>
+          </w:p>
+        </w:tc>
+        <w:tc>
+          <w:tcPr>
+            <w:tcW w:w="2254" w:type="dxa"/>
+          </w:tcPr>
+          <w:p>
+            <w:r>
+              <w:t>What is being tested</w:t>
+            </w:r>
+            <w:r>
+              <w:t>?</w:t>
+            </w:r>
+          </w:p>
+        </w:tc>
+        <w:tc>
+          <w:tcPr>
+            <w:tcW w:w="2254" w:type="dxa"/>
+          </w:tcPr>
+          <w:p>
+            <w:r>
+              <w:t>Positive result</w:t>
+            </w:r>
+          </w:p>
+        </w:tc>
+      </w:tr>
+      <w:tr>
+        <w:tc>
+          <w:tcPr>
+            <w:tcW w:w="2254" w:type="dxa"/>
+          </w:tcPr>
+          <w:p>
+            <w:r>
+              <w:t xml:space="preserve"> </w:t>
+            </w:r>
+            <w:r>
+              <w:t>S1SC1</w:t>
+            </w:r>
+          </w:p>
+        </w:tc>
+        <w:tc>
+          <w:tcPr>
+            <w:tcW w:w="2254" w:type="dxa"/>
+          </w:tcPr>
+          <w:p>
+            <w:r>
+              <w:t>S1T1</w:t>
+            </w:r>
+          </w:p>
+        </w:tc>
+        <w:tc>
+          <w:tcPr>
+            <w:tcW w:w="2254" w:type="dxa"/>
+          </w:tcPr>
+          <w:p>
+            <w:r>
+              <w:t>Does the window open</w:t>
+            </w:r>
+          </w:p>
+        </w:tc>
+        <w:tc>
+          <w:tcPr>
+            <w:tcW w:w="2254" w:type="dxa"/>
+          </w:tcPr>
+          <w:p>
+            <w:r>
+              <w:t>The window opens</w:t>
+            </w:r>
+          </w:p>
+        </w:tc>
+      </w:tr>
+      <w:tr>
+        <w:tc>
+          <w:tcPr>
+            <w:tcW w:w="2254" w:type="dxa"/>
+          </w:tcPr>
+          <w:p>
+            <w:r>
+              <w:t>S1SC2</w:t>
+            </w:r>
+          </w:p>
+        </w:tc>
+        <w:tc>
+          <w:tcPr>
+            <w:tcW w:w="2254" w:type="dxa"/>
+          </w:tcPr>
+          <w:p>
+            <w:r>
+              <w:t>S1T2</w:t>
+            </w:r>
+          </w:p>
+        </w:tc>
+        <w:tc>
+          <w:tcPr>
+            <w:tcW w:w="2254" w:type="dxa"/>
+          </w:tcPr>
+          <w:p>
+            <w:r>
+              <w:t>Does the window have the correct size</w:t>
+            </w:r>
+          </w:p>
+        </w:tc>
+        <w:tc>
+          <w:tcPr>
+            <w:tcW w:w="2254" w:type="dxa"/>
+          </w:tcPr>
+          <w:p>
+            <w:r>
+              <w:t>The window is 800x600 pixels</w:t>
+            </w:r>
+          </w:p>
+        </w:tc>
+      </w:tr>
+      <w:tr>
+        <w:tc>
+          <w:tcPr>
+            <w:tcW w:w="2254" w:type="dxa"/>
+          </w:tcPr>
+          <w:p>
+            <w:r>
+              <w:t>S1SC3</w:t>
+            </w:r>
+          </w:p>
+        </w:tc>
+        <w:tc>
+          <w:tcPr>
+            <w:tcW w:w="2254" w:type="dxa"/>
+          </w:tcPr>
+          <w:p>
+            <w:r>
+              <w:t>S1T3</w:t>
+            </w:r>
+          </w:p>
+        </w:tc>
+        <w:tc>
+          <w:tcPr>
+            <w:tcW w:w="2254" w:type="dxa"/>
+          </w:tcPr>
+          <w:p>
+            <w:r>
+              <w:t>Does the title match that of the title of the project</w:t>
+            </w:r>
+          </w:p>
+        </w:tc>
+        <w:tc>
+          <w:tcPr>
+            <w:tcW w:w="2254" w:type="dxa"/>
+          </w:tcPr>
+          <w:p>
+            <w:r>
+              <w:t xml:space="preserve">The title is the same </w:t>
+            </w:r>
+            <w:r>
+              <w:t>name of the project</w:t>
+            </w:r>
+          </w:p>
+        </w:tc>
+      </w:tr>
+    </w:tbl>
+    <w:p/>
+    <w:p>
+      <w:pPr>
+        <w:pStyle w:val="Heading3"/>
+      </w:pPr>
+      <w:bookmarkStart w:id="16" w:name="_Toc213846639"/>
+      <w:r>
+        <w:t>Design</w:t>
+      </w:r>
+      <w:bookmarkEnd w:id="16"/>
+    </w:p>
+    <w:p>
+      <w:r>
+        <w:t xml:space="preserve">To help me to undergo the development </w:t>
+      </w:r>
+      <w:r>
+        <w:t>of the first sprint</w:t>
+      </w:r>
+      <w:r>
+        <w:t xml:space="preserve">, I am going to use pseudocode </w:t>
+      </w:r>
+      <w:r>
+        <w:t xml:space="preserve">to help me to understand </w:t>
+      </w:r>
+      <w:r>
+        <w:t>how the code is going to work</w:t>
+      </w:r>
+      <w:r>
+        <w:t xml:space="preserve">. </w:t>
+      </w:r>
+    </w:p>
+    <w:p/>
+    <w:p/>
     <w:p>
       <w:pPr>
         <w:pStyle w:val="Heading1"/>
       </w:pPr>
-      <w:bookmarkStart w:id="10" w:name="_Toc213244608"/>
-      <w:r>
-        <w:t>To Do:</w:t>
-      </w:r>
-      <w:bookmarkEnd w:id="10"/>
-    </w:p>
-    <w:p>
-      <w:r>
-        <w:t>Begin sprint 1: opening a window</w:t>
-      </w:r>
-      <w:r>
-        <w:t xml:space="preserve"> -&gt; analysis -&gt; design + success criteria -&gt; develop -&gt; test -&gt; evaluate</w:t>
-      </w:r>
-    </w:p>
-    <w:p/>
-    <w:p>
-      <w:r>
-        <w:t>Analysis</w:t>
-      </w:r>
-      <w:r>
-        <w:t>+</w:t>
-      </w:r>
-      <w:r>
-        <w:t xml:space="preserve">intro+justification, </w:t>
-      </w:r>
-      <w:r>
-        <w:t xml:space="preserve">success criteria, tests, </w:t>
-      </w:r>
-      <w:r>
-        <w:t xml:space="preserve">design, development, test results, </w:t>
-      </w:r>
-      <w:r>
-        <w:t>evaluation</w:t>
-      </w:r>
-      <w:r>
-        <w:t xml:space="preserve">  </w:t>
-      </w:r>
+      <w:bookmarkStart w:id="17" w:name="_Toc213846640"/>
+      <w:r>
+        <w:t>To Do</w:t>
+      </w:r>
+      <w:r>
+        <w:t>:</w:t>
+      </w:r>
+      <w:bookmarkEnd w:id="17"/>
     </w:p>
     <w:sectPr>
       <w:headerReference w:type="default" r:id="rId13"/>
@@ -4159,7 +5527,6 @@
     <w:next w:val="Normal"/>
     <w:link w:val="Heading3Char"/>
     <w:uiPriority w:val="9"/>
-    <w:semiHidden/>
     <w:unhideWhenUsed/>
     <w:qFormat/>
     <w:rsid w:val="00A8305E"/>
@@ -4366,7 +5733,6 @@
     <w:basedOn w:val="DefaultParagraphFont"/>
     <w:link w:val="Heading3"/>
     <w:uiPriority w:val="9"/>
-    <w:semiHidden/>
     <w:rsid w:val="00A8305E"/>
     <w:rPr>
       <w:rFonts w:eastAsiaTheme="majorEastAsia" w:cstheme="majorBidi"/>
@@ -4885,6 +6251,19 @@
     <w:uiPriority w:val="99"/>
     <w:rsid w:val="00714F2E"/>
   </w:style>
+  <w:style w:type="paragraph" w:styleId="TOC3">
+    <w:name w:val="toc 3"/>
+    <w:basedOn w:val="Normal"/>
+    <w:next w:val="Normal"/>
+    <w:autoRedefine/>
+    <w:uiPriority w:val="39"/>
+    <w:unhideWhenUsed/>
+    <w:rsid w:val="00D92E0C"/>
+    <w:pPr>
+      <w:spacing w:after="100"/>
+      <w:ind w:left="480"/>
+    </w:pPr>
+  </w:style>
 </w:styles>
 </file>
 

</xml_diff>